<commit_message>
overall summary of the doc added
</commit_message>
<xml_diff>
--- a/New folder/Upload data on S3 & Creating Glue tables.docx
+++ b/New folder/Upload data on S3 & Creating Glue tables.docx
@@ -119,25 +119,62 @@
                 <w:sz w:val="24"/>
                 <w:szCs w:val="24"/>
               </w:rPr>
-              <w:t># Read from the customers table in the glue data catalog using a dynamic frame</w:t>
-            </w:r>
-          </w:p>
-          <w:p>
-            <w:pPr>
-              <w:jc w:val="both"/>
-              <w:rPr>
-                <w:color w:val="85200C"/>
-                <w:sz w:val="24"/>
-                <w:szCs w:val="24"/>
-              </w:rPr>
-            </w:pPr>
-            <w:r>
-              <w:rPr>
-                <w:color w:val="85200C"/>
-                <w:sz w:val="24"/>
-                <w:szCs w:val="24"/>
-              </w:rPr>
-              <w:t>dynamicFrameCustomers = glueContext.create_dynamic_</w:t>
+              <w:t xml:space="preserve"># Read from the customers table in the glue data </w:t>
+            </w:r>
+            <w:proofErr w:type="spellStart"/>
+            <w:r>
+              <w:rPr>
+                <w:color w:val="85200C"/>
+                <w:sz w:val="24"/>
+                <w:szCs w:val="24"/>
+              </w:rPr>
+              <w:t>catalog</w:t>
+            </w:r>
+            <w:proofErr w:type="spellEnd"/>
+            <w:r>
+              <w:rPr>
+                <w:color w:val="85200C"/>
+                <w:sz w:val="24"/>
+                <w:szCs w:val="24"/>
+              </w:rPr>
+              <w:t xml:space="preserve"> using a dynamic frame</w:t>
+            </w:r>
+          </w:p>
+          <w:p>
+            <w:pPr>
+              <w:jc w:val="both"/>
+              <w:rPr>
+                <w:color w:val="85200C"/>
+                <w:sz w:val="24"/>
+                <w:szCs w:val="24"/>
+              </w:rPr>
+            </w:pPr>
+            <w:proofErr w:type="spellStart"/>
+            <w:r>
+              <w:rPr>
+                <w:color w:val="85200C"/>
+                <w:sz w:val="24"/>
+                <w:szCs w:val="24"/>
+              </w:rPr>
+              <w:t>dynamicFrameCustomers</w:t>
+            </w:r>
+            <w:proofErr w:type="spellEnd"/>
+            <w:r>
+              <w:rPr>
+                <w:color w:val="85200C"/>
+                <w:sz w:val="24"/>
+                <w:szCs w:val="24"/>
+              </w:rPr>
+              <w:t xml:space="preserve"> = </w:t>
+            </w:r>
+            <w:proofErr w:type="spellStart"/>
+            <w:r>
+              <w:rPr>
+                <w:color w:val="85200C"/>
+                <w:sz w:val="24"/>
+                <w:szCs w:val="24"/>
+              </w:rPr>
+              <w:t>glueContext.create_dynamic_</w:t>
             </w:r>
             <w:proofErr w:type="gramStart"/>
             <w:r>
@@ -164,7 +201,16 @@
                 <w:sz w:val="24"/>
                 <w:szCs w:val="24"/>
               </w:rPr>
-              <w:t>catalog(</w:t>
+              <w:t>catalog</w:t>
+            </w:r>
+            <w:proofErr w:type="spellEnd"/>
+            <w:r>
+              <w:rPr>
+                <w:color w:val="85200C"/>
+                <w:sz w:val="24"/>
+                <w:szCs w:val="24"/>
+              </w:rPr>
+              <w:t>(</w:t>
             </w:r>
             <w:proofErr w:type="gramEnd"/>
           </w:p>
@@ -195,13 +241,23 @@
                 <w:szCs w:val="24"/>
               </w:rPr>
             </w:pPr>
-            <w:r>
-              <w:rPr>
-                <w:color w:val="85200C"/>
-                <w:sz w:val="24"/>
-                <w:szCs w:val="24"/>
-              </w:rPr>
-              <w:t>table_name = "customers"</w:t>
+            <w:proofErr w:type="spellStart"/>
+            <w:r>
+              <w:rPr>
+                <w:color w:val="85200C"/>
+                <w:sz w:val="24"/>
+                <w:szCs w:val="24"/>
+              </w:rPr>
+              <w:t>table_name</w:t>
+            </w:r>
+            <w:proofErr w:type="spellEnd"/>
+            <w:r>
+              <w:rPr>
+                <w:color w:val="85200C"/>
+                <w:sz w:val="24"/>
+                <w:szCs w:val="24"/>
+              </w:rPr>
+              <w:t xml:space="preserve"> = "customers"</w:t>
             </w:r>
           </w:p>
           <w:p>
@@ -247,25 +303,45 @@
                 <w:sz w:val="24"/>
                 <w:szCs w:val="24"/>
               </w:rPr>
-              <w:t># Show the top 10 rows from the dynamic dataframe</w:t>
-            </w:r>
-          </w:p>
-          <w:p>
-            <w:pPr>
-              <w:jc w:val="both"/>
-              <w:rPr>
-                <w:color w:val="85200C"/>
-                <w:sz w:val="24"/>
-                <w:szCs w:val="24"/>
-              </w:rPr>
-            </w:pPr>
-            <w:r>
-              <w:rPr>
-                <w:color w:val="85200C"/>
-                <w:sz w:val="24"/>
-                <w:szCs w:val="24"/>
-              </w:rPr>
-              <w:t>dynamicFrameCustomers.show(10)</w:t>
+              <w:t xml:space="preserve"># Show the top 10 rows from the dynamic </w:t>
+            </w:r>
+            <w:proofErr w:type="spellStart"/>
+            <w:r>
+              <w:rPr>
+                <w:color w:val="85200C"/>
+                <w:sz w:val="24"/>
+                <w:szCs w:val="24"/>
+              </w:rPr>
+              <w:t>dataframe</w:t>
+            </w:r>
+            <w:proofErr w:type="spellEnd"/>
+          </w:p>
+          <w:p>
+            <w:pPr>
+              <w:jc w:val="both"/>
+              <w:rPr>
+                <w:color w:val="85200C"/>
+                <w:sz w:val="24"/>
+                <w:szCs w:val="24"/>
+              </w:rPr>
+            </w:pPr>
+            <w:proofErr w:type="spellStart"/>
+            <w:r>
+              <w:rPr>
+                <w:color w:val="85200C"/>
+                <w:sz w:val="24"/>
+                <w:szCs w:val="24"/>
+              </w:rPr>
+              <w:t>dynamicFrameCustomers.show</w:t>
+            </w:r>
+            <w:proofErr w:type="spellEnd"/>
+            <w:r>
+              <w:rPr>
+                <w:color w:val="85200C"/>
+                <w:sz w:val="24"/>
+                <w:szCs w:val="24"/>
+              </w:rPr>
+              <w:t>(10)</w:t>
             </w:r>
           </w:p>
           <w:p>
@@ -386,13 +462,23 @@
                 <w:szCs w:val="24"/>
               </w:rPr>
             </w:pPr>
-            <w:r>
-              <w:rPr>
-                <w:color w:val="85200C"/>
-                <w:sz w:val="24"/>
-                <w:szCs w:val="24"/>
-              </w:rPr>
-              <w:t>dynamicFrameCustomers.printSchema()</w:t>
+            <w:proofErr w:type="spellStart"/>
+            <w:r>
+              <w:rPr>
+                <w:color w:val="85200C"/>
+                <w:sz w:val="24"/>
+                <w:szCs w:val="24"/>
+              </w:rPr>
+              <w:t>dynamicFrameCustomers.printSchema</w:t>
+            </w:r>
+            <w:proofErr w:type="spellEnd"/>
+            <w:r>
+              <w:rPr>
+                <w:color w:val="85200C"/>
+                <w:sz w:val="24"/>
+                <w:szCs w:val="24"/>
+              </w:rPr>
+              <w:t>()</w:t>
             </w:r>
           </w:p>
         </w:tc>
@@ -426,8 +512,19 @@
           <w:sz w:val="24"/>
           <w:szCs w:val="24"/>
         </w:rPr>
-        <w:t>Count The Number of Rows in a Dynamic DataFrame</w:t>
-      </w:r>
+        <w:t xml:space="preserve">Count The Number of Rows in a Dynamic </w:t>
+      </w:r>
+      <w:proofErr w:type="spellStart"/>
+      <w:r>
+        <w:rPr>
+          <w:b/>
+          <w:color w:val="1F2328"/>
+          <w:sz w:val="24"/>
+          <w:szCs w:val="24"/>
+        </w:rPr>
+        <w:t>DataFrame</w:t>
+      </w:r>
+      <w:proofErr w:type="spellEnd"/>
       <w:r>
         <w:rPr>
           <w:color w:val="1F2328"/>
@@ -481,25 +578,53 @@
                 <w:sz w:val="24"/>
                 <w:szCs w:val="24"/>
               </w:rPr>
-              <w:t xml:space="preserve"># Count The Number of Rows in a Dynamic Dataframe </w:t>
-            </w:r>
-          </w:p>
-          <w:p>
-            <w:pPr>
-              <w:jc w:val="both"/>
-              <w:rPr>
-                <w:color w:val="85200C"/>
-                <w:sz w:val="24"/>
-                <w:szCs w:val="24"/>
-              </w:rPr>
-            </w:pPr>
-            <w:r>
-              <w:rPr>
-                <w:color w:val="85200C"/>
-                <w:sz w:val="24"/>
-                <w:szCs w:val="24"/>
-              </w:rPr>
-              <w:t>dynamicFrameCustomers.count()</w:t>
+              <w:t xml:space="preserve"># Count The Number of Rows in a Dynamic </w:t>
+            </w:r>
+            <w:proofErr w:type="spellStart"/>
+            <w:r>
+              <w:rPr>
+                <w:color w:val="85200C"/>
+                <w:sz w:val="24"/>
+                <w:szCs w:val="24"/>
+              </w:rPr>
+              <w:t>Dataframe</w:t>
+            </w:r>
+            <w:proofErr w:type="spellEnd"/>
+            <w:r>
+              <w:rPr>
+                <w:color w:val="85200C"/>
+                <w:sz w:val="24"/>
+                <w:szCs w:val="24"/>
+              </w:rPr>
+              <w:t xml:space="preserve"> </w:t>
+            </w:r>
+          </w:p>
+          <w:p>
+            <w:pPr>
+              <w:jc w:val="both"/>
+              <w:rPr>
+                <w:color w:val="85200C"/>
+                <w:sz w:val="24"/>
+                <w:szCs w:val="24"/>
+              </w:rPr>
+            </w:pPr>
+            <w:proofErr w:type="spellStart"/>
+            <w:r>
+              <w:rPr>
+                <w:color w:val="85200C"/>
+                <w:sz w:val="24"/>
+                <w:szCs w:val="24"/>
+              </w:rPr>
+              <w:t>dynamicFrameCustomers.count</w:t>
+            </w:r>
+            <w:proofErr w:type="spellEnd"/>
+            <w:r>
+              <w:rPr>
+                <w:color w:val="85200C"/>
+                <w:sz w:val="24"/>
+                <w:szCs w:val="24"/>
+              </w:rPr>
+              <w:t>()</w:t>
             </w:r>
           </w:p>
           <w:p>
@@ -645,25 +770,54 @@
                 <w:sz w:val="24"/>
                 <w:szCs w:val="24"/>
               </w:rPr>
-              <w:t># Selecting certain fields from a Dynamic DataFrame</w:t>
-            </w:r>
-          </w:p>
-          <w:p>
-            <w:pPr>
-              <w:jc w:val="both"/>
-              <w:rPr>
-                <w:color w:val="85200C"/>
-                <w:sz w:val="24"/>
-                <w:szCs w:val="24"/>
-              </w:rPr>
-            </w:pPr>
-            <w:r>
-              <w:rPr>
-                <w:color w:val="85200C"/>
-                <w:sz w:val="24"/>
-                <w:szCs w:val="24"/>
-              </w:rPr>
-              <w:t>dyfCustomerSelectFields = dynamicFrameCustomers.select_</w:t>
+              <w:t xml:space="preserve"># Selecting certain fields from a Dynamic </w:t>
+            </w:r>
+            <w:proofErr w:type="spellStart"/>
+            <w:r>
+              <w:rPr>
+                <w:color w:val="85200C"/>
+                <w:sz w:val="24"/>
+                <w:szCs w:val="24"/>
+              </w:rPr>
+              <w:t>DataFrame</w:t>
+            </w:r>
+            <w:proofErr w:type="spellEnd"/>
+          </w:p>
+          <w:p>
+            <w:pPr>
+              <w:jc w:val="both"/>
+              <w:rPr>
+                <w:color w:val="85200C"/>
+                <w:sz w:val="24"/>
+                <w:szCs w:val="24"/>
+              </w:rPr>
+            </w:pPr>
+            <w:proofErr w:type="spellStart"/>
+            <w:r>
+              <w:rPr>
+                <w:color w:val="85200C"/>
+                <w:sz w:val="24"/>
+                <w:szCs w:val="24"/>
+              </w:rPr>
+              <w:t>dyfCustomerSelectFields</w:t>
+            </w:r>
+            <w:proofErr w:type="spellEnd"/>
+            <w:r>
+              <w:rPr>
+                <w:color w:val="85200C"/>
+                <w:sz w:val="24"/>
+                <w:szCs w:val="24"/>
+              </w:rPr>
+              <w:t xml:space="preserve"> = </w:t>
+            </w:r>
+            <w:proofErr w:type="spellStart"/>
+            <w:r>
+              <w:rPr>
+                <w:color w:val="85200C"/>
+                <w:sz w:val="24"/>
+                <w:szCs w:val="24"/>
+              </w:rPr>
+              <w:t>dynamicFrameCustomers.select_</w:t>
             </w:r>
             <w:proofErr w:type="gramStart"/>
             <w:r>
@@ -672,7 +826,16 @@
                 <w:sz w:val="24"/>
                 <w:szCs w:val="24"/>
               </w:rPr>
-              <w:t>fields(</w:t>
+              <w:t>fields</w:t>
+            </w:r>
+            <w:proofErr w:type="spellEnd"/>
+            <w:r>
+              <w:rPr>
+                <w:color w:val="85200C"/>
+                <w:sz w:val="24"/>
+                <w:szCs w:val="24"/>
+              </w:rPr>
+              <w:t>(</w:t>
             </w:r>
             <w:proofErr w:type="gramEnd"/>
             <w:r>
@@ -681,7 +844,43 @@
                 <w:sz w:val="24"/>
                 <w:szCs w:val="24"/>
               </w:rPr>
-              <w:t>["customerid", "fullname"])</w:t>
+              <w:t>["</w:t>
+            </w:r>
+            <w:proofErr w:type="spellStart"/>
+            <w:r>
+              <w:rPr>
+                <w:color w:val="85200C"/>
+                <w:sz w:val="24"/>
+                <w:szCs w:val="24"/>
+              </w:rPr>
+              <w:t>customerid</w:t>
+            </w:r>
+            <w:proofErr w:type="spellEnd"/>
+            <w:r>
+              <w:rPr>
+                <w:color w:val="85200C"/>
+                <w:sz w:val="24"/>
+                <w:szCs w:val="24"/>
+              </w:rPr>
+              <w:t>", "</w:t>
+            </w:r>
+            <w:proofErr w:type="spellStart"/>
+            <w:r>
+              <w:rPr>
+                <w:color w:val="85200C"/>
+                <w:sz w:val="24"/>
+                <w:szCs w:val="24"/>
+              </w:rPr>
+              <w:t>fullname</w:t>
+            </w:r>
+            <w:proofErr w:type="spellEnd"/>
+            <w:r>
+              <w:rPr>
+                <w:color w:val="85200C"/>
+                <w:sz w:val="24"/>
+                <w:szCs w:val="24"/>
+              </w:rPr>
+              <w:t>"])</w:t>
             </w:r>
           </w:p>
           <w:p>
@@ -721,13 +920,23 @@
                 <w:szCs w:val="24"/>
               </w:rPr>
             </w:pPr>
-            <w:r>
-              <w:rPr>
-                <w:color w:val="85200C"/>
-                <w:sz w:val="24"/>
-                <w:szCs w:val="24"/>
-              </w:rPr>
-              <w:t>dyfCustomerSelectFields.show(10)</w:t>
+            <w:proofErr w:type="spellStart"/>
+            <w:r>
+              <w:rPr>
+                <w:color w:val="85200C"/>
+                <w:sz w:val="24"/>
+                <w:szCs w:val="24"/>
+              </w:rPr>
+              <w:t>dyfCustomerSelectFields.show</w:t>
+            </w:r>
+            <w:proofErr w:type="spellEnd"/>
+            <w:r>
+              <w:rPr>
+                <w:color w:val="85200C"/>
+                <w:sz w:val="24"/>
+                <w:szCs w:val="24"/>
+              </w:rPr>
+              <w:t>(10)</w:t>
             </w:r>
           </w:p>
           <w:p>
@@ -846,59 +1055,151 @@
                 <w:szCs w:val="24"/>
               </w:rPr>
             </w:pPr>
-            <w:r>
-              <w:rPr>
-                <w:color w:val="85200C"/>
-                <w:sz w:val="24"/>
-                <w:szCs w:val="24"/>
-              </w:rPr>
-              <w:t>dyfCustomerDropFields = dynamicFrameCustomers.drop_fields(["firstname","lastname"])</w:t>
-            </w:r>
-          </w:p>
-          <w:p>
-            <w:pPr>
-              <w:jc w:val="both"/>
-              <w:rPr>
-                <w:color w:val="85200C"/>
-                <w:sz w:val="24"/>
-                <w:szCs w:val="24"/>
-              </w:rPr>
-            </w:pPr>
-          </w:p>
-          <w:p>
-            <w:pPr>
-              <w:jc w:val="both"/>
-              <w:rPr>
-                <w:color w:val="85200C"/>
-                <w:sz w:val="24"/>
-                <w:szCs w:val="24"/>
-              </w:rPr>
-            </w:pPr>
-            <w:r>
-              <w:rPr>
-                <w:color w:val="85200C"/>
-                <w:sz w:val="24"/>
-                <w:szCs w:val="24"/>
-              </w:rPr>
-              <w:t># Show Top 10 rows of dyfCustomerDropFields Dynamic Frame</w:t>
-            </w:r>
-          </w:p>
-          <w:p>
-            <w:pPr>
-              <w:jc w:val="both"/>
-              <w:rPr>
-                <w:color w:val="85200C"/>
-                <w:sz w:val="24"/>
-                <w:szCs w:val="24"/>
-              </w:rPr>
-            </w:pPr>
-            <w:r>
-              <w:rPr>
-                <w:color w:val="85200C"/>
-                <w:sz w:val="24"/>
-                <w:szCs w:val="24"/>
-              </w:rPr>
-              <w:t>dyfCustomerDropFields.show(10)</w:t>
+            <w:proofErr w:type="spellStart"/>
+            <w:r>
+              <w:rPr>
+                <w:color w:val="85200C"/>
+                <w:sz w:val="24"/>
+                <w:szCs w:val="24"/>
+              </w:rPr>
+              <w:t>dyfCustomerDropFields</w:t>
+            </w:r>
+            <w:proofErr w:type="spellEnd"/>
+            <w:r>
+              <w:rPr>
+                <w:color w:val="85200C"/>
+                <w:sz w:val="24"/>
+                <w:szCs w:val="24"/>
+              </w:rPr>
+              <w:t xml:space="preserve"> = </w:t>
+            </w:r>
+            <w:proofErr w:type="spellStart"/>
+            <w:r>
+              <w:rPr>
+                <w:color w:val="85200C"/>
+                <w:sz w:val="24"/>
+                <w:szCs w:val="24"/>
+              </w:rPr>
+              <w:t>dynamicFrameCustomers.drop_fields</w:t>
+            </w:r>
+            <w:proofErr w:type="spellEnd"/>
+            <w:r>
+              <w:rPr>
+                <w:color w:val="85200C"/>
+                <w:sz w:val="24"/>
+                <w:szCs w:val="24"/>
+              </w:rPr>
+              <w:t>(["</w:t>
+            </w:r>
+            <w:proofErr w:type="spellStart"/>
+            <w:r>
+              <w:rPr>
+                <w:color w:val="85200C"/>
+                <w:sz w:val="24"/>
+                <w:szCs w:val="24"/>
+              </w:rPr>
+              <w:t>firstname</w:t>
+            </w:r>
+            <w:proofErr w:type="spellEnd"/>
+            <w:r>
+              <w:rPr>
+                <w:color w:val="85200C"/>
+                <w:sz w:val="24"/>
+                <w:szCs w:val="24"/>
+              </w:rPr>
+              <w:t>","</w:t>
+            </w:r>
+            <w:proofErr w:type="spellStart"/>
+            <w:r>
+              <w:rPr>
+                <w:color w:val="85200C"/>
+                <w:sz w:val="24"/>
+                <w:szCs w:val="24"/>
+              </w:rPr>
+              <w:t>lastname</w:t>
+            </w:r>
+            <w:proofErr w:type="spellEnd"/>
+            <w:r>
+              <w:rPr>
+                <w:color w:val="85200C"/>
+                <w:sz w:val="24"/>
+                <w:szCs w:val="24"/>
+              </w:rPr>
+              <w:t>"])</w:t>
+            </w:r>
+          </w:p>
+          <w:p>
+            <w:pPr>
+              <w:jc w:val="both"/>
+              <w:rPr>
+                <w:color w:val="85200C"/>
+                <w:sz w:val="24"/>
+                <w:szCs w:val="24"/>
+              </w:rPr>
+            </w:pPr>
+          </w:p>
+          <w:p>
+            <w:pPr>
+              <w:jc w:val="both"/>
+              <w:rPr>
+                <w:color w:val="85200C"/>
+                <w:sz w:val="24"/>
+                <w:szCs w:val="24"/>
+              </w:rPr>
+            </w:pPr>
+            <w:r>
+              <w:rPr>
+                <w:color w:val="85200C"/>
+                <w:sz w:val="24"/>
+                <w:szCs w:val="24"/>
+              </w:rPr>
+              <w:t xml:space="preserve"># Show Top 10 rows of </w:t>
+            </w:r>
+            <w:proofErr w:type="spellStart"/>
+            <w:r>
+              <w:rPr>
+                <w:color w:val="85200C"/>
+                <w:sz w:val="24"/>
+                <w:szCs w:val="24"/>
+              </w:rPr>
+              <w:t>dyfCustomerDropFields</w:t>
+            </w:r>
+            <w:proofErr w:type="spellEnd"/>
+            <w:r>
+              <w:rPr>
+                <w:color w:val="85200C"/>
+                <w:sz w:val="24"/>
+                <w:szCs w:val="24"/>
+              </w:rPr>
+              <w:t xml:space="preserve"> Dynamic Frame</w:t>
+            </w:r>
+          </w:p>
+          <w:p>
+            <w:pPr>
+              <w:jc w:val="both"/>
+              <w:rPr>
+                <w:color w:val="85200C"/>
+                <w:sz w:val="24"/>
+                <w:szCs w:val="24"/>
+              </w:rPr>
+            </w:pPr>
+            <w:proofErr w:type="spellStart"/>
+            <w:r>
+              <w:rPr>
+                <w:color w:val="85200C"/>
+                <w:sz w:val="24"/>
+                <w:szCs w:val="24"/>
+              </w:rPr>
+              <w:t>dyfCustomerDropFields.show</w:t>
+            </w:r>
+            <w:proofErr w:type="spellEnd"/>
+            <w:r>
+              <w:rPr>
+                <w:color w:val="85200C"/>
+                <w:sz w:val="24"/>
+                <w:szCs w:val="24"/>
+              </w:rPr>
+              <w:t>(10)</w:t>
             </w:r>
           </w:p>
         </w:tc>
@@ -1003,7 +1304,25 @@
                 <w:sz w:val="24"/>
                 <w:szCs w:val="24"/>
               </w:rPr>
-              <w:t xml:space="preserve"> fullname -&gt; name</w:t>
+              <w:t xml:space="preserve"> </w:t>
+            </w:r>
+            <w:proofErr w:type="spellStart"/>
+            <w:r>
+              <w:rPr>
+                <w:color w:val="85200C"/>
+                <w:sz w:val="24"/>
+                <w:szCs w:val="24"/>
+              </w:rPr>
+              <w:t>fullname</w:t>
+            </w:r>
+            <w:proofErr w:type="spellEnd"/>
+            <w:r>
+              <w:rPr>
+                <w:color w:val="85200C"/>
+                <w:sz w:val="24"/>
+                <w:szCs w:val="24"/>
+              </w:rPr>
+              <w:t xml:space="preserve"> -&gt; name</w:t>
             </w:r>
           </w:p>
           <w:p>
@@ -1039,7 +1358,43 @@
                 <w:sz w:val="24"/>
                 <w:szCs w:val="24"/>
               </w:rPr>
-              <w:t>("customerid", "string", "customerid","string"</w:t>
+              <w:t>("</w:t>
+            </w:r>
+            <w:proofErr w:type="spellStart"/>
+            <w:r>
+              <w:rPr>
+                <w:color w:val="85200C"/>
+                <w:sz w:val="24"/>
+                <w:szCs w:val="24"/>
+              </w:rPr>
+              <w:t>customerid</w:t>
+            </w:r>
+            <w:proofErr w:type="spellEnd"/>
+            <w:r>
+              <w:rPr>
+                <w:color w:val="85200C"/>
+                <w:sz w:val="24"/>
+                <w:szCs w:val="24"/>
+              </w:rPr>
+              <w:t>", "string", "</w:t>
+            </w:r>
+            <w:proofErr w:type="spellStart"/>
+            <w:r>
+              <w:rPr>
+                <w:color w:val="85200C"/>
+                <w:sz w:val="24"/>
+                <w:szCs w:val="24"/>
+              </w:rPr>
+              <w:t>customerid</w:t>
+            </w:r>
+            <w:proofErr w:type="spellEnd"/>
+            <w:r>
+              <w:rPr>
+                <w:color w:val="85200C"/>
+                <w:sz w:val="24"/>
+                <w:szCs w:val="24"/>
+              </w:rPr>
+              <w:t>","string"</w:t>
             </w:r>
             <w:proofErr w:type="gramStart"/>
             <w:r>
@@ -1057,71 +1412,153 @@
                 <w:sz w:val="24"/>
                 <w:szCs w:val="24"/>
               </w:rPr>
-              <w:t>"fullname", "string", "name", "string")]</w:t>
-            </w:r>
-          </w:p>
-          <w:p>
-            <w:pPr>
-              <w:jc w:val="both"/>
-              <w:rPr>
-                <w:color w:val="85200C"/>
-                <w:sz w:val="24"/>
-                <w:szCs w:val="24"/>
-              </w:rPr>
-            </w:pPr>
-          </w:p>
-          <w:p>
-            <w:pPr>
-              <w:jc w:val="both"/>
-              <w:rPr>
-                <w:color w:val="85200C"/>
-                <w:sz w:val="24"/>
-                <w:szCs w:val="24"/>
-              </w:rPr>
-            </w:pPr>
-            <w:r>
-              <w:rPr>
-                <w:color w:val="85200C"/>
-                <w:sz w:val="24"/>
-                <w:szCs w:val="24"/>
-              </w:rPr>
-              <w:t># Apply the mapping to rename fullname -&gt; name</w:t>
-            </w:r>
-          </w:p>
-          <w:p>
-            <w:pPr>
-              <w:jc w:val="both"/>
-              <w:rPr>
-                <w:color w:val="85200C"/>
-                <w:sz w:val="24"/>
-                <w:szCs w:val="24"/>
-              </w:rPr>
-            </w:pPr>
-            <w:r>
-              <w:rPr>
-                <w:color w:val="85200C"/>
-                <w:sz w:val="24"/>
-                <w:szCs w:val="24"/>
-              </w:rPr>
-              <w:t>dfyMapping = ApplyMapping.apply(</w:t>
-            </w:r>
-          </w:p>
-          <w:p>
-            <w:pPr>
-              <w:jc w:val="both"/>
-              <w:rPr>
-                <w:color w:val="85200C"/>
-                <w:sz w:val="24"/>
-                <w:szCs w:val="24"/>
-              </w:rPr>
-            </w:pPr>
-            <w:r>
-              <w:rPr>
-                <w:color w:val="85200C"/>
-                <w:sz w:val="24"/>
-                <w:szCs w:val="24"/>
-              </w:rPr>
-              <w:t xml:space="preserve">                                frame = dyfCustomerDropFields, </w:t>
+              <w:t>"</w:t>
+            </w:r>
+            <w:proofErr w:type="spellStart"/>
+            <w:r>
+              <w:rPr>
+                <w:color w:val="85200C"/>
+                <w:sz w:val="24"/>
+                <w:szCs w:val="24"/>
+              </w:rPr>
+              <w:t>fullname</w:t>
+            </w:r>
+            <w:proofErr w:type="spellEnd"/>
+            <w:r>
+              <w:rPr>
+                <w:color w:val="85200C"/>
+                <w:sz w:val="24"/>
+                <w:szCs w:val="24"/>
+              </w:rPr>
+              <w:t>", "string", "name", "string")]</w:t>
+            </w:r>
+          </w:p>
+          <w:p>
+            <w:pPr>
+              <w:jc w:val="both"/>
+              <w:rPr>
+                <w:color w:val="85200C"/>
+                <w:sz w:val="24"/>
+                <w:szCs w:val="24"/>
+              </w:rPr>
+            </w:pPr>
+          </w:p>
+          <w:p>
+            <w:pPr>
+              <w:jc w:val="both"/>
+              <w:rPr>
+                <w:color w:val="85200C"/>
+                <w:sz w:val="24"/>
+                <w:szCs w:val="24"/>
+              </w:rPr>
+            </w:pPr>
+            <w:r>
+              <w:rPr>
+                <w:color w:val="85200C"/>
+                <w:sz w:val="24"/>
+                <w:szCs w:val="24"/>
+              </w:rPr>
+              <w:t xml:space="preserve"># Apply the mapping to rename </w:t>
+            </w:r>
+            <w:proofErr w:type="spellStart"/>
+            <w:r>
+              <w:rPr>
+                <w:color w:val="85200C"/>
+                <w:sz w:val="24"/>
+                <w:szCs w:val="24"/>
+              </w:rPr>
+              <w:t>fullname</w:t>
+            </w:r>
+            <w:proofErr w:type="spellEnd"/>
+            <w:r>
+              <w:rPr>
+                <w:color w:val="85200C"/>
+                <w:sz w:val="24"/>
+                <w:szCs w:val="24"/>
+              </w:rPr>
+              <w:t xml:space="preserve"> -&gt; name</w:t>
+            </w:r>
+          </w:p>
+          <w:p>
+            <w:pPr>
+              <w:jc w:val="both"/>
+              <w:rPr>
+                <w:color w:val="85200C"/>
+                <w:sz w:val="24"/>
+                <w:szCs w:val="24"/>
+              </w:rPr>
+            </w:pPr>
+            <w:proofErr w:type="spellStart"/>
+            <w:r>
+              <w:rPr>
+                <w:color w:val="85200C"/>
+                <w:sz w:val="24"/>
+                <w:szCs w:val="24"/>
+              </w:rPr>
+              <w:t>dfyMapping</w:t>
+            </w:r>
+            <w:proofErr w:type="spellEnd"/>
+            <w:r>
+              <w:rPr>
+                <w:color w:val="85200C"/>
+                <w:sz w:val="24"/>
+                <w:szCs w:val="24"/>
+              </w:rPr>
+              <w:t xml:space="preserve"> = </w:t>
+            </w:r>
+            <w:proofErr w:type="spellStart"/>
+            <w:r>
+              <w:rPr>
+                <w:color w:val="85200C"/>
+                <w:sz w:val="24"/>
+                <w:szCs w:val="24"/>
+              </w:rPr>
+              <w:t>ApplyMapping.apply</w:t>
+            </w:r>
+            <w:proofErr w:type="spellEnd"/>
+            <w:r>
+              <w:rPr>
+                <w:color w:val="85200C"/>
+                <w:sz w:val="24"/>
+                <w:szCs w:val="24"/>
+              </w:rPr>
+              <w:t>(</w:t>
+            </w:r>
+          </w:p>
+          <w:p>
+            <w:pPr>
+              <w:jc w:val="both"/>
+              <w:rPr>
+                <w:color w:val="85200C"/>
+                <w:sz w:val="24"/>
+                <w:szCs w:val="24"/>
+              </w:rPr>
+            </w:pPr>
+            <w:r>
+              <w:rPr>
+                <w:color w:val="85200C"/>
+                <w:sz w:val="24"/>
+                <w:szCs w:val="24"/>
+              </w:rPr>
+              <w:t xml:space="preserve">                                frame = </w:t>
+            </w:r>
+            <w:proofErr w:type="spellStart"/>
+            <w:r>
+              <w:rPr>
+                <w:color w:val="85200C"/>
+                <w:sz w:val="24"/>
+                <w:szCs w:val="24"/>
+              </w:rPr>
+              <w:t>dyfCustomerDropFields</w:t>
+            </w:r>
+            <w:proofErr w:type="spellEnd"/>
+            <w:r>
+              <w:rPr>
+                <w:color w:val="85200C"/>
+                <w:sz w:val="24"/>
+                <w:szCs w:val="24"/>
+              </w:rPr>
+              <w:t xml:space="preserve">, </w:t>
             </w:r>
           </w:p>
           <w:p>
@@ -1157,7 +1594,25 @@
                 <w:sz w:val="24"/>
                 <w:szCs w:val="24"/>
               </w:rPr>
-              <w:t xml:space="preserve">                                transformation_ctx = "applymapping1"</w:t>
+              <w:t xml:space="preserve">                                </w:t>
+            </w:r>
+            <w:proofErr w:type="spellStart"/>
+            <w:r>
+              <w:rPr>
+                <w:color w:val="85200C"/>
+                <w:sz w:val="24"/>
+                <w:szCs w:val="24"/>
+              </w:rPr>
+              <w:t>transformation_ctx</w:t>
+            </w:r>
+            <w:proofErr w:type="spellEnd"/>
+            <w:r>
+              <w:rPr>
+                <w:color w:val="85200C"/>
+                <w:sz w:val="24"/>
+                <w:szCs w:val="24"/>
+              </w:rPr>
+              <w:t xml:space="preserve"> = "applymapping1"</w:t>
             </w:r>
           </w:p>
           <w:p>
@@ -1233,13 +1688,23 @@
                 <w:szCs w:val="24"/>
               </w:rPr>
             </w:pPr>
-            <w:r>
-              <w:rPr>
-                <w:color w:val="85200C"/>
-                <w:sz w:val="24"/>
-                <w:szCs w:val="24"/>
-              </w:rPr>
-              <w:t>dfyMapping.show(10)</w:t>
+            <w:proofErr w:type="spellStart"/>
+            <w:r>
+              <w:rPr>
+                <w:color w:val="85200C"/>
+                <w:sz w:val="24"/>
+                <w:szCs w:val="24"/>
+              </w:rPr>
+              <w:t>dfyMapping.show</w:t>
+            </w:r>
+            <w:proofErr w:type="spellEnd"/>
+            <w:r>
+              <w:rPr>
+                <w:color w:val="85200C"/>
+                <w:sz w:val="24"/>
+                <w:szCs w:val="24"/>
+              </w:rPr>
+              <w:t>(10)</w:t>
             </w:r>
           </w:p>
         </w:tc>
@@ -1339,18 +1804,37 @@
                 <w:sz w:val="24"/>
                 <w:szCs w:val="24"/>
               </w:rPr>
-              <w:t># Filter dynamicFrameCustomers for customers who have the last name Adams</w:t>
-            </w:r>
-          </w:p>
-          <w:p>
-            <w:pPr>
-              <w:jc w:val="both"/>
-              <w:rPr>
-                <w:color w:val="85200C"/>
-                <w:sz w:val="24"/>
-                <w:szCs w:val="24"/>
-              </w:rPr>
-            </w:pPr>
+              <w:t xml:space="preserve"># Filter </w:t>
+            </w:r>
+            <w:proofErr w:type="spellStart"/>
+            <w:r>
+              <w:rPr>
+                <w:color w:val="85200C"/>
+                <w:sz w:val="24"/>
+                <w:szCs w:val="24"/>
+              </w:rPr>
+              <w:t>dynamicFrameCustomers</w:t>
+            </w:r>
+            <w:proofErr w:type="spellEnd"/>
+            <w:r>
+              <w:rPr>
+                <w:color w:val="85200C"/>
+                <w:sz w:val="24"/>
+                <w:szCs w:val="24"/>
+              </w:rPr>
+              <w:t xml:space="preserve"> for customers who have the last name Adams</w:t>
+            </w:r>
+          </w:p>
+          <w:p>
+            <w:pPr>
+              <w:jc w:val="both"/>
+              <w:rPr>
+                <w:color w:val="85200C"/>
+                <w:sz w:val="24"/>
+                <w:szCs w:val="24"/>
+              </w:rPr>
+            </w:pPr>
+            <w:proofErr w:type="spellStart"/>
             <w:r>
               <w:rPr>
                 <w:color w:val="85200C"/>
@@ -1359,6 +1843,7 @@
               </w:rPr>
               <w:t>dyfFilter</w:t>
             </w:r>
+            <w:proofErr w:type="spellEnd"/>
             <w:proofErr w:type="gramStart"/>
             <w:r>
               <w:rPr>
@@ -1366,8 +1851,18 @@
                 <w:sz w:val="24"/>
                 <w:szCs w:val="24"/>
               </w:rPr>
-              <w:t>=  Filter.apply</w:t>
-            </w:r>
+              <w:t xml:space="preserve">=  </w:t>
+            </w:r>
+            <w:proofErr w:type="spellStart"/>
+            <w:r>
+              <w:rPr>
+                <w:color w:val="85200C"/>
+                <w:sz w:val="24"/>
+                <w:szCs w:val="24"/>
+              </w:rPr>
+              <w:t>Filter.apply</w:t>
+            </w:r>
+            <w:proofErr w:type="spellEnd"/>
             <w:proofErr w:type="gramEnd"/>
             <w:r>
               <w:rPr>
@@ -1375,25 +1870,61 @@
                 <w:sz w:val="24"/>
                 <w:szCs w:val="24"/>
               </w:rPr>
-              <w:t xml:space="preserve">(frame = dynamicFrameCustomers, </w:t>
-            </w:r>
-          </w:p>
-          <w:p>
-            <w:pPr>
-              <w:jc w:val="both"/>
-              <w:rPr>
-                <w:color w:val="85200C"/>
-                <w:sz w:val="24"/>
-                <w:szCs w:val="24"/>
-              </w:rPr>
-            </w:pPr>
-            <w:r>
-              <w:rPr>
-                <w:color w:val="85200C"/>
-                <w:sz w:val="24"/>
-                <w:szCs w:val="24"/>
-              </w:rPr>
-              <w:t xml:space="preserve">                                        f = lambda x: x["lastname"] in "Adams"</w:t>
+              <w:t xml:space="preserve">(frame = </w:t>
+            </w:r>
+            <w:proofErr w:type="spellStart"/>
+            <w:r>
+              <w:rPr>
+                <w:color w:val="85200C"/>
+                <w:sz w:val="24"/>
+                <w:szCs w:val="24"/>
+              </w:rPr>
+              <w:t>dynamicFrameCustomers</w:t>
+            </w:r>
+            <w:proofErr w:type="spellEnd"/>
+            <w:r>
+              <w:rPr>
+                <w:color w:val="85200C"/>
+                <w:sz w:val="24"/>
+                <w:szCs w:val="24"/>
+              </w:rPr>
+              <w:t xml:space="preserve">, </w:t>
+            </w:r>
+          </w:p>
+          <w:p>
+            <w:pPr>
+              <w:jc w:val="both"/>
+              <w:rPr>
+                <w:color w:val="85200C"/>
+                <w:sz w:val="24"/>
+                <w:szCs w:val="24"/>
+              </w:rPr>
+            </w:pPr>
+            <w:r>
+              <w:rPr>
+                <w:color w:val="85200C"/>
+                <w:sz w:val="24"/>
+                <w:szCs w:val="24"/>
+              </w:rPr>
+              <w:t xml:space="preserve">                                        f = lambda x: x["</w:t>
+            </w:r>
+            <w:proofErr w:type="spellStart"/>
+            <w:r>
+              <w:rPr>
+                <w:color w:val="85200C"/>
+                <w:sz w:val="24"/>
+                <w:szCs w:val="24"/>
+              </w:rPr>
+              <w:t>lastname</w:t>
+            </w:r>
+            <w:proofErr w:type="spellEnd"/>
+            <w:r>
+              <w:rPr>
+                <w:color w:val="85200C"/>
+                <w:sz w:val="24"/>
+                <w:szCs w:val="24"/>
+              </w:rPr>
+              <w:t>"] in "Adams"</w:t>
             </w:r>
           </w:p>
           <w:p>
@@ -1469,13 +2000,23 @@
                 <w:szCs w:val="24"/>
               </w:rPr>
             </w:pPr>
-            <w:r>
-              <w:rPr>
-                <w:color w:val="85200C"/>
-                <w:sz w:val="24"/>
-                <w:szCs w:val="24"/>
-              </w:rPr>
-              <w:t>dyfFilter.show(10)</w:t>
+            <w:proofErr w:type="spellStart"/>
+            <w:r>
+              <w:rPr>
+                <w:color w:val="85200C"/>
+                <w:sz w:val="24"/>
+                <w:szCs w:val="24"/>
+              </w:rPr>
+              <w:t>dyfFilter.show</w:t>
+            </w:r>
+            <w:proofErr w:type="spellEnd"/>
+            <w:r>
+              <w:rPr>
+                <w:color w:val="85200C"/>
+                <w:sz w:val="24"/>
+                <w:szCs w:val="24"/>
+              </w:rPr>
+              <w:t>(10)</w:t>
             </w:r>
           </w:p>
           <w:p>
@@ -1623,25 +2164,62 @@
                 <w:szCs w:val="24"/>
               </w:rPr>
               <w:lastRenderedPageBreak/>
-              <w:t># Read from the customers table in the glue data catalog using a dynamic frame</w:t>
-            </w:r>
-          </w:p>
-          <w:p>
-            <w:pPr>
-              <w:jc w:val="both"/>
-              <w:rPr>
-                <w:color w:val="85200C"/>
-                <w:sz w:val="24"/>
-                <w:szCs w:val="24"/>
-              </w:rPr>
-            </w:pPr>
-            <w:r>
-              <w:rPr>
-                <w:color w:val="85200C"/>
-                <w:sz w:val="24"/>
-                <w:szCs w:val="24"/>
-              </w:rPr>
-              <w:t>dynamicFrameOrders = glueContext.create_dynamic_</w:t>
+              <w:t xml:space="preserve"># Read from the customers table in the glue data </w:t>
+            </w:r>
+            <w:proofErr w:type="spellStart"/>
+            <w:r>
+              <w:rPr>
+                <w:color w:val="85200C"/>
+                <w:sz w:val="24"/>
+                <w:szCs w:val="24"/>
+              </w:rPr>
+              <w:t>catalog</w:t>
+            </w:r>
+            <w:proofErr w:type="spellEnd"/>
+            <w:r>
+              <w:rPr>
+                <w:color w:val="85200C"/>
+                <w:sz w:val="24"/>
+                <w:szCs w:val="24"/>
+              </w:rPr>
+              <w:t xml:space="preserve"> using a dynamic frame</w:t>
+            </w:r>
+          </w:p>
+          <w:p>
+            <w:pPr>
+              <w:jc w:val="both"/>
+              <w:rPr>
+                <w:color w:val="85200C"/>
+                <w:sz w:val="24"/>
+                <w:szCs w:val="24"/>
+              </w:rPr>
+            </w:pPr>
+            <w:proofErr w:type="spellStart"/>
+            <w:r>
+              <w:rPr>
+                <w:color w:val="85200C"/>
+                <w:sz w:val="24"/>
+                <w:szCs w:val="24"/>
+              </w:rPr>
+              <w:t>dynamicFrameOrders</w:t>
+            </w:r>
+            <w:proofErr w:type="spellEnd"/>
+            <w:r>
+              <w:rPr>
+                <w:color w:val="85200C"/>
+                <w:sz w:val="24"/>
+                <w:szCs w:val="24"/>
+              </w:rPr>
+              <w:t xml:space="preserve"> = </w:t>
+            </w:r>
+            <w:proofErr w:type="spellStart"/>
+            <w:r>
+              <w:rPr>
+                <w:color w:val="85200C"/>
+                <w:sz w:val="24"/>
+                <w:szCs w:val="24"/>
+              </w:rPr>
+              <w:t>glueContext.create_dynamic_</w:t>
             </w:r>
             <w:proofErr w:type="gramStart"/>
             <w:r>
@@ -1668,7 +2246,16 @@
                 <w:sz w:val="24"/>
                 <w:szCs w:val="24"/>
               </w:rPr>
-              <w:t>catalog(</w:t>
+              <w:t>catalog</w:t>
+            </w:r>
+            <w:proofErr w:type="spellEnd"/>
+            <w:r>
+              <w:rPr>
+                <w:color w:val="85200C"/>
+                <w:sz w:val="24"/>
+                <w:szCs w:val="24"/>
+              </w:rPr>
+              <w:t>(</w:t>
             </w:r>
             <w:proofErr w:type="gramEnd"/>
           </w:p>
@@ -1699,13 +2286,23 @@
                 <w:szCs w:val="24"/>
               </w:rPr>
             </w:pPr>
-            <w:r>
-              <w:rPr>
-                <w:color w:val="85200C"/>
-                <w:sz w:val="24"/>
-                <w:szCs w:val="24"/>
-              </w:rPr>
-              <w:t>table_name = "orders"</w:t>
+            <w:proofErr w:type="spellStart"/>
+            <w:r>
+              <w:rPr>
+                <w:color w:val="85200C"/>
+                <w:sz w:val="24"/>
+                <w:szCs w:val="24"/>
+              </w:rPr>
+              <w:t>table_name</w:t>
+            </w:r>
+            <w:proofErr w:type="spellEnd"/>
+            <w:r>
+              <w:rPr>
+                <w:color w:val="85200C"/>
+                <w:sz w:val="24"/>
+                <w:szCs w:val="24"/>
+              </w:rPr>
+              <w:t xml:space="preserve"> = "orders"</w:t>
             </w:r>
           </w:p>
           <w:p>
@@ -1781,13 +2378,23 @@
                 <w:szCs w:val="24"/>
               </w:rPr>
             </w:pPr>
-            <w:r>
-              <w:rPr>
-                <w:color w:val="85200C"/>
-                <w:sz w:val="24"/>
-                <w:szCs w:val="24"/>
-              </w:rPr>
-              <w:t>dynamicFrameOrders.show(10)</w:t>
+            <w:proofErr w:type="spellStart"/>
+            <w:r>
+              <w:rPr>
+                <w:color w:val="85200C"/>
+                <w:sz w:val="24"/>
+                <w:szCs w:val="24"/>
+              </w:rPr>
+              <w:t>dynamicFrameOrders.show</w:t>
+            </w:r>
+            <w:proofErr w:type="spellEnd"/>
+            <w:r>
+              <w:rPr>
+                <w:color w:val="85200C"/>
+                <w:sz w:val="24"/>
+                <w:szCs w:val="24"/>
+              </w:rPr>
+              <w:t>(10)</w:t>
             </w:r>
           </w:p>
           <w:p>
@@ -1905,13 +2512,23 @@
                 <w:szCs w:val="24"/>
               </w:rPr>
             </w:pPr>
+            <w:proofErr w:type="spellStart"/>
             <w:r>
               <w:rPr>
                 <w:color w:val="A61C00"/>
                 <w:sz w:val="24"/>
                 <w:szCs w:val="24"/>
               </w:rPr>
-              <w:t>dyfjoin = dynamicFrameCustomers.join(["customerid"</w:t>
+              <w:t>dyfjoin</w:t>
+            </w:r>
+            <w:proofErr w:type="spellEnd"/>
+            <w:r>
+              <w:rPr>
+                <w:color w:val="A61C00"/>
+                <w:sz w:val="24"/>
+                <w:szCs w:val="24"/>
+              </w:rPr>
+              <w:t xml:space="preserve"> = dynamicFrameCustomers.join(["customerid"</w:t>
             </w:r>
             <w:proofErr w:type="gramStart"/>
             <w:r>
@@ -2005,6 +2622,7 @@
                 <w:szCs w:val="24"/>
               </w:rPr>
             </w:pPr>
+            <w:proofErr w:type="spellStart"/>
             <w:proofErr w:type="gramStart"/>
             <w:r>
               <w:rPr>
@@ -2014,6 +2632,7 @@
               </w:rPr>
               <w:t>dyfjoin.show</w:t>
             </w:r>
+            <w:proofErr w:type="spellEnd"/>
             <w:proofErr w:type="gramEnd"/>
             <w:r>
               <w:rPr>
@@ -2104,7 +2723,25 @@
           <w:sz w:val="24"/>
           <w:szCs w:val="24"/>
         </w:rPr>
-        <w:t xml:space="preserve">Create a folder in the S3 bucket created by Cloudformation to use as a location to write the data down to </w:t>
+        <w:t xml:space="preserve">Create a folder in the S3 bucket created by </w:t>
+      </w:r>
+      <w:proofErr w:type="spellStart"/>
+      <w:r>
+        <w:rPr>
+          <w:color w:val="1F2328"/>
+          <w:sz w:val="24"/>
+          <w:szCs w:val="24"/>
+        </w:rPr>
+        <w:t>Cloudformation</w:t>
+      </w:r>
+      <w:proofErr w:type="spellEnd"/>
+      <w:r>
+        <w:rPr>
+          <w:color w:val="1F2328"/>
+          <w:sz w:val="24"/>
+          <w:szCs w:val="24"/>
+        </w:rPr>
+        <w:t xml:space="preserve"> to use as a location to write the data down to </w:t>
       </w:r>
       <w:r>
         <w:rPr>
@@ -2130,7 +2767,25 @@
           <w:sz w:val="24"/>
           <w:szCs w:val="24"/>
         </w:rPr>
-        <w:t>Write down data to S3 using the dynamic DataFrame writer class for an S3 path.</w:t>
+        <w:t xml:space="preserve">Write down data to S3 using the dynamic </w:t>
+      </w:r>
+      <w:proofErr w:type="spellStart"/>
+      <w:r>
+        <w:rPr>
+          <w:color w:val="1F2328"/>
+          <w:sz w:val="24"/>
+          <w:szCs w:val="24"/>
+        </w:rPr>
+        <w:t>DataFrame</w:t>
+      </w:r>
+      <w:proofErr w:type="spellEnd"/>
+      <w:r>
+        <w:rPr>
+          <w:color w:val="1F2328"/>
+          <w:sz w:val="24"/>
+          <w:szCs w:val="24"/>
+        </w:rPr>
+        <w:t xml:space="preserve"> writer class for an S3 path.</w:t>
       </w:r>
       <w:r>
         <w:rPr>
@@ -2215,6 +2870,7 @@
                 <w:szCs w:val="24"/>
               </w:rPr>
             </w:pPr>
+            <w:proofErr w:type="spellStart"/>
             <w:r>
               <w:rPr>
                 <w:color w:val="A61C00"/>
@@ -2248,7 +2904,16 @@
                 <w:sz w:val="24"/>
                 <w:szCs w:val="24"/>
               </w:rPr>
-              <w:t>options(</w:t>
+              <w:t>options</w:t>
+            </w:r>
+            <w:proofErr w:type="spellEnd"/>
+            <w:r>
+              <w:rPr>
+                <w:color w:val="A61C00"/>
+                <w:sz w:val="24"/>
+                <w:szCs w:val="24"/>
+              </w:rPr>
+              <w:t>(</w:t>
             </w:r>
             <w:proofErr w:type="gramEnd"/>
           </w:p>
@@ -2267,25 +2932,25 @@
                 <w:sz w:val="24"/>
                 <w:szCs w:val="24"/>
               </w:rPr>
-              <w:t xml:space="preserve">                        frame = dynamicFrameCustomers,</w:t>
-            </w:r>
-          </w:p>
-          <w:p>
-            <w:pPr>
-              <w:jc w:val="both"/>
+              <w:t xml:space="preserve">                        frame = </w:t>
+            </w:r>
+            <w:proofErr w:type="spellStart"/>
+            <w:r>
               <w:rPr>
                 <w:color w:val="A61C00"/>
                 <w:sz w:val="24"/>
                 <w:szCs w:val="24"/>
               </w:rPr>
-            </w:pPr>
+              <w:t>dynamicFrameCustomers</w:t>
+            </w:r>
+            <w:proofErr w:type="spellEnd"/>
             <w:r>
               <w:rPr>
                 <w:color w:val="A61C00"/>
                 <w:sz w:val="24"/>
                 <w:szCs w:val="24"/>
               </w:rPr>
-              <w:t xml:space="preserve">                        connection_type="s3", </w:t>
+              <w:t>,</w:t>
             </w:r>
           </w:p>
           <w:p>
@@ -2303,24 +2968,78 @@
                 <w:sz w:val="24"/>
                 <w:szCs w:val="24"/>
               </w:rPr>
-              <w:t xml:space="preserve">                        connection_options = {"path": "s3://&lt;YOUR_S£_BUCKET_NAME&gt;/write_down_dyf_to_s3"}, </w:t>
-            </w:r>
-          </w:p>
-          <w:p>
-            <w:pPr>
-              <w:jc w:val="both"/>
+              <w:t xml:space="preserve">                        </w:t>
+            </w:r>
+            <w:proofErr w:type="spellStart"/>
+            <w:r>
               <w:rPr>
                 <w:color w:val="A61C00"/>
                 <w:sz w:val="24"/>
                 <w:szCs w:val="24"/>
               </w:rPr>
-            </w:pPr>
+              <w:t>connection_type</w:t>
+            </w:r>
+            <w:proofErr w:type="spellEnd"/>
             <w:r>
               <w:rPr>
                 <w:color w:val="A61C00"/>
                 <w:sz w:val="24"/>
                 <w:szCs w:val="24"/>
               </w:rPr>
+              <w:t xml:space="preserve">="s3", </w:t>
+            </w:r>
+          </w:p>
+          <w:p>
+            <w:pPr>
+              <w:jc w:val="both"/>
+              <w:rPr>
+                <w:color w:val="A61C00"/>
+                <w:sz w:val="24"/>
+                <w:szCs w:val="24"/>
+              </w:rPr>
+            </w:pPr>
+            <w:r>
+              <w:rPr>
+                <w:color w:val="A61C00"/>
+                <w:sz w:val="24"/>
+                <w:szCs w:val="24"/>
+              </w:rPr>
+              <w:t xml:space="preserve">                        </w:t>
+            </w:r>
+            <w:proofErr w:type="spellStart"/>
+            <w:r>
+              <w:rPr>
+                <w:color w:val="A61C00"/>
+                <w:sz w:val="24"/>
+                <w:szCs w:val="24"/>
+              </w:rPr>
+              <w:t>connection_options</w:t>
+            </w:r>
+            <w:proofErr w:type="spellEnd"/>
+            <w:r>
+              <w:rPr>
+                <w:color w:val="A61C00"/>
+                <w:sz w:val="24"/>
+                <w:szCs w:val="24"/>
+              </w:rPr>
+              <w:t xml:space="preserve"> = {"path": "s3://&lt;YOUR_S£_BUCKET_NAME&gt;/write_down_dyf_to_s3"}, </w:t>
+            </w:r>
+          </w:p>
+          <w:p>
+            <w:pPr>
+              <w:jc w:val="both"/>
+              <w:rPr>
+                <w:color w:val="A61C00"/>
+                <w:sz w:val="24"/>
+                <w:szCs w:val="24"/>
+              </w:rPr>
+            </w:pPr>
+            <w:r>
+              <w:rPr>
+                <w:color w:val="A61C00"/>
+                <w:sz w:val="24"/>
+                <w:szCs w:val="24"/>
+              </w:rPr>
               <w:t xml:space="preserve">                        format = "csv", </w:t>
             </w:r>
           </w:p>
@@ -2339,8 +3058,18 @@
                 <w:sz w:val="24"/>
                 <w:szCs w:val="24"/>
               </w:rPr>
-              <w:t xml:space="preserve">                        format_options</w:t>
-            </w:r>
+              <w:t xml:space="preserve">                        </w:t>
+            </w:r>
+            <w:proofErr w:type="spellStart"/>
+            <w:r>
+              <w:rPr>
+                <w:color w:val="A61C00"/>
+                <w:sz w:val="24"/>
+                <w:szCs w:val="24"/>
+              </w:rPr>
+              <w:t>format_options</w:t>
+            </w:r>
+            <w:proofErr w:type="spellEnd"/>
             <w:proofErr w:type="gramStart"/>
             <w:r>
               <w:rPr>
@@ -2403,7 +3132,25 @@
                 <w:sz w:val="24"/>
                 <w:szCs w:val="24"/>
               </w:rPr>
-              <w:t xml:space="preserve">                        transformation_ctx = "datasink2")</w:t>
+              <w:t xml:space="preserve">                        </w:t>
+            </w:r>
+            <w:proofErr w:type="spellStart"/>
+            <w:r>
+              <w:rPr>
+                <w:color w:val="A61C00"/>
+                <w:sz w:val="24"/>
+                <w:szCs w:val="24"/>
+              </w:rPr>
+              <w:t>transformation_ctx</w:t>
+            </w:r>
+            <w:proofErr w:type="spellEnd"/>
+            <w:r>
+              <w:rPr>
+                <w:color w:val="A61C00"/>
+                <w:sz w:val="24"/>
+                <w:szCs w:val="24"/>
+              </w:rPr>
+              <w:t xml:space="preserve"> = "datasink2")</w:t>
             </w:r>
           </w:p>
         </w:tc>
@@ -2446,8 +3193,19 @@
           <w:szCs w:val="24"/>
         </w:rPr>
         <w:lastRenderedPageBreak/>
-        <w:t>Write Down Data from a Dynamic Frame using Glue Data Catalog</w:t>
-      </w:r>
+        <w:t xml:space="preserve">Write Down Data from a Dynamic Frame using Glue Data </w:t>
+      </w:r>
+      <w:proofErr w:type="spellStart"/>
+      <w:r>
+        <w:rPr>
+          <w:b/>
+          <w:color w:val="1F2328"/>
+          <w:sz w:val="24"/>
+          <w:szCs w:val="24"/>
+        </w:rPr>
+        <w:t>Catalog</w:t>
+      </w:r>
+      <w:proofErr w:type="spellEnd"/>
       <w:r>
         <w:rPr>
           <w:color w:val="1F2328"/>
@@ -2519,18 +3277,73 @@
                 <w:sz w:val="24"/>
                 <w:szCs w:val="24"/>
               </w:rPr>
-              <w:t xml:space="preserve"> data from the dynamicFrameCustomers to customers_write_dyf table using the meta data stored in the glue data catalog </w:t>
-            </w:r>
-          </w:p>
-          <w:p>
-            <w:pPr>
-              <w:jc w:val="both"/>
-              <w:rPr>
-                <w:color w:val="85200C"/>
-                <w:sz w:val="24"/>
-                <w:szCs w:val="24"/>
-              </w:rPr>
-            </w:pPr>
+              <w:t xml:space="preserve"> data from the </w:t>
+            </w:r>
+            <w:proofErr w:type="spellStart"/>
+            <w:r>
+              <w:rPr>
+                <w:color w:val="85200C"/>
+                <w:sz w:val="24"/>
+                <w:szCs w:val="24"/>
+              </w:rPr>
+              <w:t>dynamicFrameCustomers</w:t>
+            </w:r>
+            <w:proofErr w:type="spellEnd"/>
+            <w:r>
+              <w:rPr>
+                <w:color w:val="85200C"/>
+                <w:sz w:val="24"/>
+                <w:szCs w:val="24"/>
+              </w:rPr>
+              <w:t xml:space="preserve"> to </w:t>
+            </w:r>
+            <w:proofErr w:type="spellStart"/>
+            <w:r>
+              <w:rPr>
+                <w:color w:val="85200C"/>
+                <w:sz w:val="24"/>
+                <w:szCs w:val="24"/>
+              </w:rPr>
+              <w:t>customers_write_dyf</w:t>
+            </w:r>
+            <w:proofErr w:type="spellEnd"/>
+            <w:r>
+              <w:rPr>
+                <w:color w:val="85200C"/>
+                <w:sz w:val="24"/>
+                <w:szCs w:val="24"/>
+              </w:rPr>
+              <w:t xml:space="preserve"> table using the meta data stored in the glue data </w:t>
+            </w:r>
+            <w:proofErr w:type="spellStart"/>
+            <w:r>
+              <w:rPr>
+                <w:color w:val="85200C"/>
+                <w:sz w:val="24"/>
+                <w:szCs w:val="24"/>
+              </w:rPr>
+              <w:t>catalog</w:t>
+            </w:r>
+            <w:proofErr w:type="spellEnd"/>
+            <w:r>
+              <w:rPr>
+                <w:color w:val="85200C"/>
+                <w:sz w:val="24"/>
+                <w:szCs w:val="24"/>
+              </w:rPr>
+              <w:t xml:space="preserve"> </w:t>
+            </w:r>
+          </w:p>
+          <w:p>
+            <w:pPr>
+              <w:jc w:val="both"/>
+              <w:rPr>
+                <w:color w:val="85200C"/>
+                <w:sz w:val="24"/>
+                <w:szCs w:val="24"/>
+              </w:rPr>
+            </w:pPr>
+            <w:proofErr w:type="spellStart"/>
             <w:r>
               <w:rPr>
                 <w:color w:val="85200C"/>
@@ -2564,7 +3377,16 @@
                 <w:sz w:val="24"/>
                 <w:szCs w:val="24"/>
               </w:rPr>
-              <w:t>catalog(</w:t>
+              <w:t>catalog</w:t>
+            </w:r>
+            <w:proofErr w:type="spellEnd"/>
+            <w:r>
+              <w:rPr>
+                <w:color w:val="85200C"/>
+                <w:sz w:val="24"/>
+                <w:szCs w:val="24"/>
+              </w:rPr>
+              <w:t>(</w:t>
             </w:r>
             <w:proofErr w:type="gramEnd"/>
           </w:p>
@@ -2583,7 +3405,25 @@
                 <w:sz w:val="24"/>
                 <w:szCs w:val="24"/>
               </w:rPr>
-              <w:t xml:space="preserve">    frame=dynamicFrameCustomers,</w:t>
+              <w:t xml:space="preserve">    frame=</w:t>
+            </w:r>
+            <w:proofErr w:type="spellStart"/>
+            <w:r>
+              <w:rPr>
+                <w:color w:val="85200C"/>
+                <w:sz w:val="24"/>
+                <w:szCs w:val="24"/>
+              </w:rPr>
+              <w:t>dynamicFrameCustomers</w:t>
+            </w:r>
+            <w:proofErr w:type="spellEnd"/>
+            <w:r>
+              <w:rPr>
+                <w:color w:val="85200C"/>
+                <w:sz w:val="24"/>
+                <w:szCs w:val="24"/>
+              </w:rPr>
+              <w:t>,</w:t>
             </w:r>
           </w:p>
           <w:p>
@@ -2619,7 +3459,25 @@
                 <w:sz w:val="24"/>
                 <w:szCs w:val="24"/>
               </w:rPr>
-              <w:t xml:space="preserve">    table_name = "customers"</w:t>
+              <w:t xml:space="preserve">    </w:t>
+            </w:r>
+            <w:proofErr w:type="spellStart"/>
+            <w:r>
+              <w:rPr>
+                <w:color w:val="85200C"/>
+                <w:sz w:val="24"/>
+                <w:szCs w:val="24"/>
+              </w:rPr>
+              <w:t>table_name</w:t>
+            </w:r>
+            <w:proofErr w:type="spellEnd"/>
+            <w:r>
+              <w:rPr>
+                <w:color w:val="85200C"/>
+                <w:sz w:val="24"/>
+                <w:szCs w:val="24"/>
+              </w:rPr>
+              <w:t xml:space="preserve"> = "customers"</w:t>
             </w:r>
           </w:p>
           <w:p>
@@ -2702,8 +3560,19 @@
           <w:sz w:val="24"/>
           <w:szCs w:val="24"/>
         </w:rPr>
-        <w:t xml:space="preserve"> Spark DataFrame</w:t>
-      </w:r>
+        <w:t xml:space="preserve"> Spark </w:t>
+      </w:r>
+      <w:proofErr w:type="spellStart"/>
+      <w:r>
+        <w:rPr>
+          <w:b/>
+          <w:color w:val="1F2328"/>
+          <w:sz w:val="24"/>
+          <w:szCs w:val="24"/>
+        </w:rPr>
+        <w:t>DataFrame</w:t>
+      </w:r>
+      <w:proofErr w:type="spellEnd"/>
       <w:r>
         <w:rPr>
           <w:color w:val="1F2328"/>
@@ -2757,25 +3626,71 @@
                 <w:sz w:val="24"/>
                 <w:szCs w:val="24"/>
               </w:rPr>
-              <w:t xml:space="preserve"># Dynamic Frame to Spark DataFrame </w:t>
-            </w:r>
-          </w:p>
-          <w:p>
-            <w:pPr>
-              <w:jc w:val="both"/>
-              <w:rPr>
-                <w:color w:val="85200C"/>
-                <w:sz w:val="24"/>
-                <w:szCs w:val="24"/>
-              </w:rPr>
-            </w:pPr>
-            <w:r>
-              <w:rPr>
-                <w:color w:val="85200C"/>
-                <w:sz w:val="24"/>
-                <w:szCs w:val="24"/>
-              </w:rPr>
-              <w:t>sparkDf = dynamicFrameCustomers.toDF()</w:t>
+              <w:t xml:space="preserve"># Dynamic Frame to Spark </w:t>
+            </w:r>
+            <w:proofErr w:type="spellStart"/>
+            <w:r>
+              <w:rPr>
+                <w:color w:val="85200C"/>
+                <w:sz w:val="24"/>
+                <w:szCs w:val="24"/>
+              </w:rPr>
+              <w:t>DataFrame</w:t>
+            </w:r>
+            <w:proofErr w:type="spellEnd"/>
+            <w:r>
+              <w:rPr>
+                <w:color w:val="85200C"/>
+                <w:sz w:val="24"/>
+                <w:szCs w:val="24"/>
+              </w:rPr>
+              <w:t xml:space="preserve"> </w:t>
+            </w:r>
+          </w:p>
+          <w:p>
+            <w:pPr>
+              <w:jc w:val="both"/>
+              <w:rPr>
+                <w:color w:val="85200C"/>
+                <w:sz w:val="24"/>
+                <w:szCs w:val="24"/>
+              </w:rPr>
+            </w:pPr>
+            <w:proofErr w:type="spellStart"/>
+            <w:r>
+              <w:rPr>
+                <w:color w:val="85200C"/>
+                <w:sz w:val="24"/>
+                <w:szCs w:val="24"/>
+              </w:rPr>
+              <w:t>sparkDf</w:t>
+            </w:r>
+            <w:proofErr w:type="spellEnd"/>
+            <w:r>
+              <w:rPr>
+                <w:color w:val="85200C"/>
+                <w:sz w:val="24"/>
+                <w:szCs w:val="24"/>
+              </w:rPr>
+              <w:t xml:space="preserve"> = </w:t>
+            </w:r>
+            <w:proofErr w:type="spellStart"/>
+            <w:r>
+              <w:rPr>
+                <w:color w:val="85200C"/>
+                <w:sz w:val="24"/>
+                <w:szCs w:val="24"/>
+              </w:rPr>
+              <w:t>dynamicFrameCustomers.toDF</w:t>
+            </w:r>
+            <w:proofErr w:type="spellEnd"/>
+            <w:r>
+              <w:rPr>
+                <w:color w:val="85200C"/>
+                <w:sz w:val="24"/>
+                <w:szCs w:val="24"/>
+              </w:rPr>
+              <w:t>()</w:t>
             </w:r>
           </w:p>
           <w:p>
@@ -2815,13 +3730,23 @@
                 <w:szCs w:val="24"/>
               </w:rPr>
             </w:pPr>
-            <w:r>
-              <w:rPr>
-                <w:color w:val="85200C"/>
-                <w:sz w:val="24"/>
-                <w:szCs w:val="24"/>
-              </w:rPr>
-              <w:t>sparkDf.show()</w:t>
+            <w:proofErr w:type="spellStart"/>
+            <w:r>
+              <w:rPr>
+                <w:color w:val="85200C"/>
+                <w:sz w:val="24"/>
+                <w:szCs w:val="24"/>
+              </w:rPr>
+              <w:t>sparkDf.show</w:t>
+            </w:r>
+            <w:proofErr w:type="spellEnd"/>
+            <w:r>
+              <w:rPr>
+                <w:color w:val="85200C"/>
+                <w:sz w:val="24"/>
+                <w:szCs w:val="24"/>
+              </w:rPr>
+              <w:t>()</w:t>
             </w:r>
           </w:p>
         </w:tc>
@@ -2886,8 +3811,19 @@
           <w:sz w:val="24"/>
           <w:szCs w:val="24"/>
         </w:rPr>
-        <w:t xml:space="preserve"> a Spark DataFrame</w:t>
-      </w:r>
+        <w:t xml:space="preserve"> a Spark </w:t>
+      </w:r>
+      <w:proofErr w:type="spellStart"/>
+      <w:r>
+        <w:rPr>
+          <w:b/>
+          <w:color w:val="1F2328"/>
+          <w:sz w:val="24"/>
+          <w:szCs w:val="24"/>
+        </w:rPr>
+        <w:t>DataFrame</w:t>
+      </w:r>
+      <w:proofErr w:type="spellEnd"/>
       <w:r>
         <w:rPr>
           <w:color w:val="1F2328"/>
@@ -2941,25 +3877,99 @@
                 <w:sz w:val="24"/>
                 <w:szCs w:val="24"/>
               </w:rPr>
-              <w:t># Select columns from spark dataframe</w:t>
-            </w:r>
-          </w:p>
-          <w:p>
-            <w:pPr>
-              <w:jc w:val="both"/>
-              <w:rPr>
-                <w:color w:val="85200C"/>
-                <w:sz w:val="24"/>
-                <w:szCs w:val="24"/>
-              </w:rPr>
-            </w:pPr>
-            <w:r>
-              <w:rPr>
-                <w:color w:val="85200C"/>
-                <w:sz w:val="24"/>
-                <w:szCs w:val="24"/>
-              </w:rPr>
-              <w:t>dfSelect = sparkDf.select("customerid","fullname")</w:t>
+              <w:t xml:space="preserve"># Select columns from spark </w:t>
+            </w:r>
+            <w:proofErr w:type="spellStart"/>
+            <w:r>
+              <w:rPr>
+                <w:color w:val="85200C"/>
+                <w:sz w:val="24"/>
+                <w:szCs w:val="24"/>
+              </w:rPr>
+              <w:t>dataframe</w:t>
+            </w:r>
+            <w:proofErr w:type="spellEnd"/>
+          </w:p>
+          <w:p>
+            <w:pPr>
+              <w:jc w:val="both"/>
+              <w:rPr>
+                <w:color w:val="85200C"/>
+                <w:sz w:val="24"/>
+                <w:szCs w:val="24"/>
+              </w:rPr>
+            </w:pPr>
+            <w:proofErr w:type="spellStart"/>
+            <w:r>
+              <w:rPr>
+                <w:color w:val="85200C"/>
+                <w:sz w:val="24"/>
+                <w:szCs w:val="24"/>
+              </w:rPr>
+              <w:t>dfSelect</w:t>
+            </w:r>
+            <w:proofErr w:type="spellEnd"/>
+            <w:r>
+              <w:rPr>
+                <w:color w:val="85200C"/>
+                <w:sz w:val="24"/>
+                <w:szCs w:val="24"/>
+              </w:rPr>
+              <w:t xml:space="preserve"> = </w:t>
+            </w:r>
+            <w:proofErr w:type="spellStart"/>
+            <w:r>
+              <w:rPr>
+                <w:color w:val="85200C"/>
+                <w:sz w:val="24"/>
+                <w:szCs w:val="24"/>
+              </w:rPr>
+              <w:t>sparkDf.select</w:t>
+            </w:r>
+            <w:proofErr w:type="spellEnd"/>
+            <w:r>
+              <w:rPr>
+                <w:color w:val="85200C"/>
+                <w:sz w:val="24"/>
+                <w:szCs w:val="24"/>
+              </w:rPr>
+              <w:t>("</w:t>
+            </w:r>
+            <w:proofErr w:type="spellStart"/>
+            <w:r>
+              <w:rPr>
+                <w:color w:val="85200C"/>
+                <w:sz w:val="24"/>
+                <w:szCs w:val="24"/>
+              </w:rPr>
+              <w:t>customerid</w:t>
+            </w:r>
+            <w:proofErr w:type="spellEnd"/>
+            <w:r>
+              <w:rPr>
+                <w:color w:val="85200C"/>
+                <w:sz w:val="24"/>
+                <w:szCs w:val="24"/>
+              </w:rPr>
+              <w:t>","</w:t>
+            </w:r>
+            <w:proofErr w:type="spellStart"/>
+            <w:r>
+              <w:rPr>
+                <w:color w:val="85200C"/>
+                <w:sz w:val="24"/>
+                <w:szCs w:val="24"/>
+              </w:rPr>
+              <w:t>fullname</w:t>
+            </w:r>
+            <w:proofErr w:type="spellEnd"/>
+            <w:r>
+              <w:rPr>
+                <w:color w:val="85200C"/>
+                <w:sz w:val="24"/>
+                <w:szCs w:val="24"/>
+              </w:rPr>
+              <w:t>")</w:t>
             </w:r>
           </w:p>
           <w:p>
@@ -2999,13 +4009,23 @@
                 <w:szCs w:val="24"/>
               </w:rPr>
             </w:pPr>
-            <w:r>
-              <w:rPr>
-                <w:color w:val="85200C"/>
-                <w:sz w:val="24"/>
-                <w:szCs w:val="24"/>
-              </w:rPr>
-              <w:t>dfSelect.show()</w:t>
+            <w:proofErr w:type="spellStart"/>
+            <w:r>
+              <w:rPr>
+                <w:color w:val="85200C"/>
+                <w:sz w:val="24"/>
+                <w:szCs w:val="24"/>
+              </w:rPr>
+              <w:t>dfSelect.show</w:t>
+            </w:r>
+            <w:proofErr w:type="spellEnd"/>
+            <w:r>
+              <w:rPr>
+                <w:color w:val="85200C"/>
+                <w:sz w:val="24"/>
+                <w:szCs w:val="24"/>
+              </w:rPr>
+              <w:t>()</w:t>
             </w:r>
           </w:p>
         </w:tc>
@@ -3080,8 +4100,19 @@
           <w:sz w:val="24"/>
           <w:szCs w:val="24"/>
         </w:rPr>
-        <w:t xml:space="preserve"> Spark Dataframe</w:t>
-      </w:r>
+        <w:t xml:space="preserve"> Spark </w:t>
+      </w:r>
+      <w:proofErr w:type="spellStart"/>
+      <w:r>
+        <w:rPr>
+          <w:b/>
+          <w:color w:val="1F2328"/>
+          <w:sz w:val="24"/>
+          <w:szCs w:val="24"/>
+        </w:rPr>
+        <w:t>Dataframe</w:t>
+      </w:r>
+      <w:proofErr w:type="spellEnd"/>
     </w:p>
     <w:p>
       <w:pPr>
@@ -3153,7 +4184,25 @@
                 <w:sz w:val="24"/>
                 <w:szCs w:val="24"/>
               </w:rPr>
-              <w:t xml:space="preserve">#import lit from sql functions </w:t>
+              <w:t xml:space="preserve">#import lit from </w:t>
+            </w:r>
+            <w:proofErr w:type="spellStart"/>
+            <w:r>
+              <w:rPr>
+                <w:color w:val="85200C"/>
+                <w:sz w:val="24"/>
+                <w:szCs w:val="24"/>
+              </w:rPr>
+              <w:t>sql</w:t>
+            </w:r>
+            <w:proofErr w:type="spellEnd"/>
+            <w:r>
+              <w:rPr>
+                <w:color w:val="85200C"/>
+                <w:sz w:val="24"/>
+                <w:szCs w:val="24"/>
+              </w:rPr>
+              <w:t xml:space="preserve"> functions </w:t>
             </w:r>
           </w:p>
           <w:p>
@@ -3172,7 +4221,16 @@
                 <w:sz w:val="24"/>
                 <w:szCs w:val="24"/>
               </w:rPr>
-              <w:t>from  pyspark.sql</w:t>
+              <w:t xml:space="preserve">from  </w:t>
+            </w:r>
+            <w:proofErr w:type="spellStart"/>
+            <w:r>
+              <w:rPr>
+                <w:color w:val="85200C"/>
+                <w:sz w:val="24"/>
+                <w:szCs w:val="24"/>
+              </w:rPr>
+              <w:t>pyspark.sql</w:t>
             </w:r>
             <w:proofErr w:type="gramEnd"/>
             <w:r>
@@ -3181,53 +4239,100 @@
                 <w:sz w:val="24"/>
                 <w:szCs w:val="24"/>
               </w:rPr>
-              <w:t>.functions import lit</w:t>
-            </w:r>
-          </w:p>
-          <w:p>
-            <w:pPr>
-              <w:jc w:val="both"/>
-              <w:rPr>
-                <w:color w:val="85200C"/>
-                <w:sz w:val="24"/>
-                <w:szCs w:val="24"/>
-              </w:rPr>
-            </w:pPr>
-          </w:p>
-          <w:p>
-            <w:pPr>
-              <w:jc w:val="both"/>
-              <w:rPr>
-                <w:color w:val="85200C"/>
-                <w:sz w:val="24"/>
-                <w:szCs w:val="24"/>
-              </w:rPr>
-            </w:pPr>
-            <w:r>
-              <w:rPr>
-                <w:color w:val="85200C"/>
-                <w:sz w:val="24"/>
-                <w:szCs w:val="24"/>
-              </w:rPr>
-              <w:t># Add new column to spark dataframe</w:t>
-            </w:r>
-          </w:p>
-          <w:p>
-            <w:pPr>
-              <w:jc w:val="both"/>
-              <w:rPr>
-                <w:color w:val="85200C"/>
-                <w:sz w:val="24"/>
-                <w:szCs w:val="24"/>
-              </w:rPr>
-            </w:pPr>
-            <w:r>
-              <w:rPr>
-                <w:color w:val="85200C"/>
-                <w:sz w:val="24"/>
-                <w:szCs w:val="24"/>
-              </w:rPr>
-              <w:t xml:space="preserve">dfNewColumn = sparkDf.withColumn("date", </w:t>
+              <w:t>.functions</w:t>
+            </w:r>
+            <w:proofErr w:type="spellEnd"/>
+            <w:r>
+              <w:rPr>
+                <w:color w:val="85200C"/>
+                <w:sz w:val="24"/>
+                <w:szCs w:val="24"/>
+              </w:rPr>
+              <w:t xml:space="preserve"> import lit</w:t>
+            </w:r>
+          </w:p>
+          <w:p>
+            <w:pPr>
+              <w:jc w:val="both"/>
+              <w:rPr>
+                <w:color w:val="85200C"/>
+                <w:sz w:val="24"/>
+                <w:szCs w:val="24"/>
+              </w:rPr>
+            </w:pPr>
+          </w:p>
+          <w:p>
+            <w:pPr>
+              <w:jc w:val="both"/>
+              <w:rPr>
+                <w:color w:val="85200C"/>
+                <w:sz w:val="24"/>
+                <w:szCs w:val="24"/>
+              </w:rPr>
+            </w:pPr>
+            <w:r>
+              <w:rPr>
+                <w:color w:val="85200C"/>
+                <w:sz w:val="24"/>
+                <w:szCs w:val="24"/>
+              </w:rPr>
+              <w:t xml:space="preserve"># Add new column to spark </w:t>
+            </w:r>
+            <w:proofErr w:type="spellStart"/>
+            <w:r>
+              <w:rPr>
+                <w:color w:val="85200C"/>
+                <w:sz w:val="24"/>
+                <w:szCs w:val="24"/>
+              </w:rPr>
+              <w:t>dataframe</w:t>
+            </w:r>
+            <w:proofErr w:type="spellEnd"/>
+          </w:p>
+          <w:p>
+            <w:pPr>
+              <w:jc w:val="both"/>
+              <w:rPr>
+                <w:color w:val="85200C"/>
+                <w:sz w:val="24"/>
+                <w:szCs w:val="24"/>
+              </w:rPr>
+            </w:pPr>
+            <w:proofErr w:type="spellStart"/>
+            <w:r>
+              <w:rPr>
+                <w:color w:val="85200C"/>
+                <w:sz w:val="24"/>
+                <w:szCs w:val="24"/>
+              </w:rPr>
+              <w:t>dfNewColumn</w:t>
+            </w:r>
+            <w:proofErr w:type="spellEnd"/>
+            <w:r>
+              <w:rPr>
+                <w:color w:val="85200C"/>
+                <w:sz w:val="24"/>
+                <w:szCs w:val="24"/>
+              </w:rPr>
+              <w:t xml:space="preserve"> = </w:t>
+            </w:r>
+            <w:proofErr w:type="spellStart"/>
+            <w:r>
+              <w:rPr>
+                <w:color w:val="85200C"/>
+                <w:sz w:val="24"/>
+                <w:szCs w:val="24"/>
+              </w:rPr>
+              <w:t>sparkDf.withColumn</w:t>
+            </w:r>
+            <w:proofErr w:type="spellEnd"/>
+            <w:r>
+              <w:rPr>
+                <w:color w:val="85200C"/>
+                <w:sz w:val="24"/>
+                <w:szCs w:val="24"/>
+              </w:rPr>
+              <w:t xml:space="preserve">("date", </w:t>
             </w:r>
             <w:proofErr w:type="gramStart"/>
             <w:r>
@@ -3273,18 +4378,37 @@
                 <w:sz w:val="24"/>
                 <w:szCs w:val="24"/>
               </w:rPr>
-              <w:t># show df with new column</w:t>
-            </w:r>
-          </w:p>
-          <w:p>
-            <w:pPr>
-              <w:jc w:val="both"/>
-              <w:rPr>
-                <w:color w:val="85200C"/>
-                <w:sz w:val="24"/>
-                <w:szCs w:val="24"/>
-              </w:rPr>
-            </w:pPr>
+              <w:t xml:space="preserve"># show </w:t>
+            </w:r>
+            <w:proofErr w:type="spellStart"/>
+            <w:r>
+              <w:rPr>
+                <w:color w:val="85200C"/>
+                <w:sz w:val="24"/>
+                <w:szCs w:val="24"/>
+              </w:rPr>
+              <w:t>df</w:t>
+            </w:r>
+            <w:proofErr w:type="spellEnd"/>
+            <w:r>
+              <w:rPr>
+                <w:color w:val="85200C"/>
+                <w:sz w:val="24"/>
+                <w:szCs w:val="24"/>
+              </w:rPr>
+              <w:t xml:space="preserve"> with new column</w:t>
+            </w:r>
+          </w:p>
+          <w:p>
+            <w:pPr>
+              <w:jc w:val="both"/>
+              <w:rPr>
+                <w:color w:val="85200C"/>
+                <w:sz w:val="24"/>
+                <w:szCs w:val="24"/>
+              </w:rPr>
+            </w:pPr>
+            <w:proofErr w:type="spellStart"/>
             <w:r>
               <w:rPr>
                 <w:color w:val="85200C"/>
@@ -3292,7 +4416,16 @@
                 <w:szCs w:val="24"/>
               </w:rPr>
               <w:lastRenderedPageBreak/>
-              <w:t>dfNewColumn.show()</w:t>
+              <w:t>dfNewColumn.show</w:t>
+            </w:r>
+            <w:proofErr w:type="spellEnd"/>
+            <w:r>
+              <w:rPr>
+                <w:color w:val="85200C"/>
+                <w:sz w:val="24"/>
+                <w:szCs w:val="24"/>
+              </w:rPr>
+              <w:t>()</w:t>
             </w:r>
           </w:p>
         </w:tc>
@@ -3325,7 +4458,27 @@
           <w:sz w:val="24"/>
           <w:szCs w:val="24"/>
         </w:rPr>
-        <w:t>Using concat to concatenate two columns together</w:t>
+        <w:t xml:space="preserve">Using </w:t>
+      </w:r>
+      <w:proofErr w:type="spellStart"/>
+      <w:r>
+        <w:rPr>
+          <w:b/>
+          <w:color w:val="1F2328"/>
+          <w:sz w:val="24"/>
+          <w:szCs w:val="24"/>
+        </w:rPr>
+        <w:t>concat</w:t>
+      </w:r>
+      <w:proofErr w:type="spellEnd"/>
+      <w:r>
+        <w:rPr>
+          <w:b/>
+          <w:color w:val="1F2328"/>
+          <w:sz w:val="24"/>
+          <w:szCs w:val="24"/>
+        </w:rPr>
+        <w:t xml:space="preserve"> to concatenate two columns together</w:t>
       </w:r>
       <w:r>
         <w:rPr>
@@ -3379,7 +4532,25 @@
                 <w:sz w:val="24"/>
                 <w:szCs w:val="24"/>
               </w:rPr>
-              <w:t xml:space="preserve">#import concat from functions </w:t>
+              <w:t xml:space="preserve">#import </w:t>
+            </w:r>
+            <w:proofErr w:type="spellStart"/>
+            <w:r>
+              <w:rPr>
+                <w:color w:val="85200C"/>
+                <w:sz w:val="24"/>
+                <w:szCs w:val="24"/>
+              </w:rPr>
+              <w:t>concat</w:t>
+            </w:r>
+            <w:proofErr w:type="spellEnd"/>
+            <w:r>
+              <w:rPr>
+                <w:color w:val="85200C"/>
+                <w:sz w:val="24"/>
+                <w:szCs w:val="24"/>
+              </w:rPr>
+              <w:t xml:space="preserve"> from functions </w:t>
             </w:r>
           </w:p>
           <w:p>
@@ -3398,7 +4569,16 @@
                 <w:sz w:val="24"/>
                 <w:szCs w:val="24"/>
               </w:rPr>
-              <w:t>from  pyspark.sql</w:t>
+              <w:t xml:space="preserve">from  </w:t>
+            </w:r>
+            <w:proofErr w:type="spellStart"/>
+            <w:r>
+              <w:rPr>
+                <w:color w:val="85200C"/>
+                <w:sz w:val="24"/>
+                <w:szCs w:val="24"/>
+              </w:rPr>
+              <w:t>pyspark.sql</w:t>
             </w:r>
             <w:proofErr w:type="gramEnd"/>
             <w:r>
@@ -3407,8 +4587,27 @@
                 <w:sz w:val="24"/>
                 <w:szCs w:val="24"/>
               </w:rPr>
-              <w:t>.functions import concat</w:t>
-            </w:r>
+              <w:t>.functions</w:t>
+            </w:r>
+            <w:proofErr w:type="spellEnd"/>
+            <w:r>
+              <w:rPr>
+                <w:color w:val="85200C"/>
+                <w:sz w:val="24"/>
+                <w:szCs w:val="24"/>
+              </w:rPr>
+              <w:t xml:space="preserve"> import </w:t>
+            </w:r>
+            <w:proofErr w:type="spellStart"/>
+            <w:r>
+              <w:rPr>
+                <w:color w:val="85200C"/>
+                <w:sz w:val="24"/>
+                <w:szCs w:val="24"/>
+              </w:rPr>
+              <w:t>concat</w:t>
+            </w:r>
+            <w:proofErr w:type="spellEnd"/>
           </w:p>
           <w:p>
             <w:pPr>
@@ -3465,13 +4664,23 @@
                 <w:szCs w:val="24"/>
               </w:rPr>
             </w:pPr>
-            <w:r>
-              <w:rPr>
-                <w:color w:val="85200C"/>
-                <w:sz w:val="24"/>
-                <w:szCs w:val="24"/>
-              </w:rPr>
-              <w:t>dfNewFullName = sparkDf.withColumn("new_full_name</w:t>
+            <w:proofErr w:type="spellStart"/>
+            <w:r>
+              <w:rPr>
+                <w:color w:val="85200C"/>
+                <w:sz w:val="24"/>
+                <w:szCs w:val="24"/>
+              </w:rPr>
+              <w:t>dfNewFullName</w:t>
+            </w:r>
+            <w:proofErr w:type="spellEnd"/>
+            <w:r>
+              <w:rPr>
+                <w:color w:val="85200C"/>
+                <w:sz w:val="24"/>
+                <w:szCs w:val="24"/>
+              </w:rPr>
+              <w:t xml:space="preserve"> = sparkDf.withColumn("new_full_name</w:t>
             </w:r>
             <w:proofErr w:type="gramStart"/>
             <w:r>
@@ -3525,7 +4734,25 @@
                 <w:sz w:val="24"/>
                 <w:szCs w:val="24"/>
               </w:rPr>
-              <w:t>' '),"lastname")))</w:t>
+              <w:t>' '),"</w:t>
+            </w:r>
+            <w:proofErr w:type="spellStart"/>
+            <w:r>
+              <w:rPr>
+                <w:color w:val="85200C"/>
+                <w:sz w:val="24"/>
+                <w:szCs w:val="24"/>
+              </w:rPr>
+              <w:t>lastname</w:t>
+            </w:r>
+            <w:proofErr w:type="spellEnd"/>
+            <w:r>
+              <w:rPr>
+                <w:color w:val="85200C"/>
+                <w:sz w:val="24"/>
+                <w:szCs w:val="24"/>
+              </w:rPr>
+              <w:t>")))</w:t>
             </w:r>
           </w:p>
           <w:p>
@@ -3583,13 +4810,23 @@
                 <w:szCs w:val="24"/>
               </w:rPr>
             </w:pPr>
-            <w:r>
-              <w:rPr>
-                <w:color w:val="85200C"/>
-                <w:sz w:val="24"/>
-                <w:szCs w:val="24"/>
-              </w:rPr>
-              <w:t>dfNewFullName.show()</w:t>
+            <w:proofErr w:type="spellStart"/>
+            <w:r>
+              <w:rPr>
+                <w:color w:val="85200C"/>
+                <w:sz w:val="24"/>
+                <w:szCs w:val="24"/>
+              </w:rPr>
+              <w:t>dfNewFullName.show</w:t>
+            </w:r>
+            <w:proofErr w:type="spellEnd"/>
+            <w:r>
+              <w:rPr>
+                <w:color w:val="85200C"/>
+                <w:sz w:val="24"/>
+                <w:szCs w:val="24"/>
+              </w:rPr>
+              <w:t>()</w:t>
             </w:r>
           </w:p>
         </w:tc>
@@ -3675,71 +4912,165 @@
                 <w:sz w:val="24"/>
                 <w:szCs w:val="24"/>
               </w:rPr>
-              <w:t># Drop column from spark dataframe</w:t>
-            </w:r>
-          </w:p>
-          <w:p>
-            <w:pPr>
-              <w:jc w:val="both"/>
-              <w:rPr>
-                <w:color w:val="85200C"/>
-                <w:sz w:val="24"/>
-                <w:szCs w:val="24"/>
-              </w:rPr>
-            </w:pPr>
-            <w:r>
-              <w:rPr>
-                <w:color w:val="85200C"/>
-                <w:sz w:val="24"/>
-                <w:szCs w:val="24"/>
-              </w:rPr>
-              <w:t>dfDropCol = sparkDf.drop("firstname","lastname")</w:t>
-            </w:r>
-          </w:p>
-          <w:p>
-            <w:pPr>
-              <w:jc w:val="both"/>
-              <w:rPr>
-                <w:color w:val="85200C"/>
-                <w:sz w:val="24"/>
-                <w:szCs w:val="24"/>
-              </w:rPr>
-            </w:pPr>
-          </w:p>
-          <w:p>
-            <w:pPr>
-              <w:jc w:val="both"/>
-              <w:rPr>
-                <w:color w:val="85200C"/>
-                <w:sz w:val="24"/>
-                <w:szCs w:val="24"/>
-              </w:rPr>
-            </w:pPr>
-            <w:r>
-              <w:rPr>
-                <w:color w:val="85200C"/>
-                <w:sz w:val="24"/>
-                <w:szCs w:val="24"/>
-              </w:rPr>
-              <w:t>#show dropped column df</w:t>
-            </w:r>
-          </w:p>
-          <w:p>
-            <w:pPr>
-              <w:jc w:val="both"/>
-              <w:rPr>
-                <w:color w:val="85200C"/>
-                <w:sz w:val="24"/>
-                <w:szCs w:val="24"/>
-              </w:rPr>
-            </w:pPr>
-            <w:r>
-              <w:rPr>
-                <w:color w:val="85200C"/>
-                <w:sz w:val="24"/>
-                <w:szCs w:val="24"/>
-              </w:rPr>
-              <w:t>dfDropCol.show()</w:t>
+              <w:t xml:space="preserve"># Drop column from spark </w:t>
+            </w:r>
+            <w:proofErr w:type="spellStart"/>
+            <w:r>
+              <w:rPr>
+                <w:color w:val="85200C"/>
+                <w:sz w:val="24"/>
+                <w:szCs w:val="24"/>
+              </w:rPr>
+              <w:t>dataframe</w:t>
+            </w:r>
+            <w:proofErr w:type="spellEnd"/>
+          </w:p>
+          <w:p>
+            <w:pPr>
+              <w:jc w:val="both"/>
+              <w:rPr>
+                <w:color w:val="85200C"/>
+                <w:sz w:val="24"/>
+                <w:szCs w:val="24"/>
+              </w:rPr>
+            </w:pPr>
+            <w:proofErr w:type="spellStart"/>
+            <w:r>
+              <w:rPr>
+                <w:color w:val="85200C"/>
+                <w:sz w:val="24"/>
+                <w:szCs w:val="24"/>
+              </w:rPr>
+              <w:t>dfDropCol</w:t>
+            </w:r>
+            <w:proofErr w:type="spellEnd"/>
+            <w:r>
+              <w:rPr>
+                <w:color w:val="85200C"/>
+                <w:sz w:val="24"/>
+                <w:szCs w:val="24"/>
+              </w:rPr>
+              <w:t xml:space="preserve"> = </w:t>
+            </w:r>
+            <w:proofErr w:type="spellStart"/>
+            <w:r>
+              <w:rPr>
+                <w:color w:val="85200C"/>
+                <w:sz w:val="24"/>
+                <w:szCs w:val="24"/>
+              </w:rPr>
+              <w:t>sparkDf.drop</w:t>
+            </w:r>
+            <w:proofErr w:type="spellEnd"/>
+            <w:r>
+              <w:rPr>
+                <w:color w:val="85200C"/>
+                <w:sz w:val="24"/>
+                <w:szCs w:val="24"/>
+              </w:rPr>
+              <w:t>("</w:t>
+            </w:r>
+            <w:proofErr w:type="spellStart"/>
+            <w:r>
+              <w:rPr>
+                <w:color w:val="85200C"/>
+                <w:sz w:val="24"/>
+                <w:szCs w:val="24"/>
+              </w:rPr>
+              <w:t>firstname</w:t>
+            </w:r>
+            <w:proofErr w:type="spellEnd"/>
+            <w:r>
+              <w:rPr>
+                <w:color w:val="85200C"/>
+                <w:sz w:val="24"/>
+                <w:szCs w:val="24"/>
+              </w:rPr>
+              <w:t>","</w:t>
+            </w:r>
+            <w:proofErr w:type="spellStart"/>
+            <w:r>
+              <w:rPr>
+                <w:color w:val="85200C"/>
+                <w:sz w:val="24"/>
+                <w:szCs w:val="24"/>
+              </w:rPr>
+              <w:t>lastname</w:t>
+            </w:r>
+            <w:proofErr w:type="spellEnd"/>
+            <w:r>
+              <w:rPr>
+                <w:color w:val="85200C"/>
+                <w:sz w:val="24"/>
+                <w:szCs w:val="24"/>
+              </w:rPr>
+              <w:t>")</w:t>
+            </w:r>
+          </w:p>
+          <w:p>
+            <w:pPr>
+              <w:jc w:val="both"/>
+              <w:rPr>
+                <w:color w:val="85200C"/>
+                <w:sz w:val="24"/>
+                <w:szCs w:val="24"/>
+              </w:rPr>
+            </w:pPr>
+          </w:p>
+          <w:p>
+            <w:pPr>
+              <w:jc w:val="both"/>
+              <w:rPr>
+                <w:color w:val="85200C"/>
+                <w:sz w:val="24"/>
+                <w:szCs w:val="24"/>
+              </w:rPr>
+            </w:pPr>
+            <w:r>
+              <w:rPr>
+                <w:color w:val="85200C"/>
+                <w:sz w:val="24"/>
+                <w:szCs w:val="24"/>
+              </w:rPr>
+              <w:t xml:space="preserve">#show dropped column </w:t>
+            </w:r>
+            <w:proofErr w:type="spellStart"/>
+            <w:r>
+              <w:rPr>
+                <w:color w:val="85200C"/>
+                <w:sz w:val="24"/>
+                <w:szCs w:val="24"/>
+              </w:rPr>
+              <w:t>df</w:t>
+            </w:r>
+            <w:proofErr w:type="spellEnd"/>
+          </w:p>
+          <w:p>
+            <w:pPr>
+              <w:jc w:val="both"/>
+              <w:rPr>
+                <w:color w:val="85200C"/>
+                <w:sz w:val="24"/>
+                <w:szCs w:val="24"/>
+              </w:rPr>
+            </w:pPr>
+            <w:proofErr w:type="spellStart"/>
+            <w:r>
+              <w:rPr>
+                <w:color w:val="85200C"/>
+                <w:sz w:val="24"/>
+                <w:szCs w:val="24"/>
+              </w:rPr>
+              <w:t>dfDropCol.show</w:t>
+            </w:r>
+            <w:proofErr w:type="spellEnd"/>
+            <w:r>
+              <w:rPr>
+                <w:color w:val="85200C"/>
+                <w:sz w:val="24"/>
+                <w:szCs w:val="24"/>
+              </w:rPr>
+              <w:t>()</w:t>
             </w:r>
           </w:p>
         </w:tc>
@@ -3837,71 +5168,165 @@
                 <w:sz w:val="24"/>
                 <w:szCs w:val="24"/>
               </w:rPr>
-              <w:t># Rename column in Spark dataframe</w:t>
-            </w:r>
-          </w:p>
-          <w:p>
-            <w:pPr>
-              <w:jc w:val="both"/>
-              <w:rPr>
-                <w:color w:val="85200C"/>
-                <w:sz w:val="24"/>
-                <w:szCs w:val="24"/>
-              </w:rPr>
-            </w:pPr>
-            <w:r>
-              <w:rPr>
-                <w:color w:val="85200C"/>
-                <w:sz w:val="24"/>
-                <w:szCs w:val="24"/>
-              </w:rPr>
-              <w:t>dfRenameCol = sparkDf.withColumnRenamed("fullname","full_name")</w:t>
-            </w:r>
-          </w:p>
-          <w:p>
-            <w:pPr>
-              <w:jc w:val="both"/>
-              <w:rPr>
-                <w:color w:val="85200C"/>
-                <w:sz w:val="24"/>
-                <w:szCs w:val="24"/>
-              </w:rPr>
-            </w:pPr>
-          </w:p>
-          <w:p>
-            <w:pPr>
-              <w:jc w:val="both"/>
-              <w:rPr>
-                <w:color w:val="85200C"/>
-                <w:sz w:val="24"/>
-                <w:szCs w:val="24"/>
-              </w:rPr>
-            </w:pPr>
-            <w:r>
-              <w:rPr>
-                <w:color w:val="85200C"/>
-                <w:sz w:val="24"/>
-                <w:szCs w:val="24"/>
-              </w:rPr>
-              <w:t>#show renamed column dataframe</w:t>
-            </w:r>
-          </w:p>
-          <w:p>
-            <w:pPr>
-              <w:jc w:val="both"/>
-              <w:rPr>
-                <w:color w:val="85200C"/>
-                <w:sz w:val="24"/>
-                <w:szCs w:val="24"/>
-              </w:rPr>
-            </w:pPr>
-            <w:r>
-              <w:rPr>
-                <w:color w:val="85200C"/>
-                <w:sz w:val="24"/>
-                <w:szCs w:val="24"/>
-              </w:rPr>
-              <w:t>dfRenameCol.show()</w:t>
+              <w:t xml:space="preserve"># Rename column in Spark </w:t>
+            </w:r>
+            <w:proofErr w:type="spellStart"/>
+            <w:r>
+              <w:rPr>
+                <w:color w:val="85200C"/>
+                <w:sz w:val="24"/>
+                <w:szCs w:val="24"/>
+              </w:rPr>
+              <w:t>dataframe</w:t>
+            </w:r>
+            <w:proofErr w:type="spellEnd"/>
+          </w:p>
+          <w:p>
+            <w:pPr>
+              <w:jc w:val="both"/>
+              <w:rPr>
+                <w:color w:val="85200C"/>
+                <w:sz w:val="24"/>
+                <w:szCs w:val="24"/>
+              </w:rPr>
+            </w:pPr>
+            <w:proofErr w:type="spellStart"/>
+            <w:r>
+              <w:rPr>
+                <w:color w:val="85200C"/>
+                <w:sz w:val="24"/>
+                <w:szCs w:val="24"/>
+              </w:rPr>
+              <w:t>dfRenameCol</w:t>
+            </w:r>
+            <w:proofErr w:type="spellEnd"/>
+            <w:r>
+              <w:rPr>
+                <w:color w:val="85200C"/>
+                <w:sz w:val="24"/>
+                <w:szCs w:val="24"/>
+              </w:rPr>
+              <w:t xml:space="preserve"> = </w:t>
+            </w:r>
+            <w:proofErr w:type="spellStart"/>
+            <w:r>
+              <w:rPr>
+                <w:color w:val="85200C"/>
+                <w:sz w:val="24"/>
+                <w:szCs w:val="24"/>
+              </w:rPr>
+              <w:t>sparkDf.withColumnRenamed</w:t>
+            </w:r>
+            <w:proofErr w:type="spellEnd"/>
+            <w:r>
+              <w:rPr>
+                <w:color w:val="85200C"/>
+                <w:sz w:val="24"/>
+                <w:szCs w:val="24"/>
+              </w:rPr>
+              <w:t>("</w:t>
+            </w:r>
+            <w:proofErr w:type="spellStart"/>
+            <w:r>
+              <w:rPr>
+                <w:color w:val="85200C"/>
+                <w:sz w:val="24"/>
+                <w:szCs w:val="24"/>
+              </w:rPr>
+              <w:t>fullname</w:t>
+            </w:r>
+            <w:proofErr w:type="spellEnd"/>
+            <w:r>
+              <w:rPr>
+                <w:color w:val="85200C"/>
+                <w:sz w:val="24"/>
+                <w:szCs w:val="24"/>
+              </w:rPr>
+              <w:t>","</w:t>
+            </w:r>
+            <w:proofErr w:type="spellStart"/>
+            <w:r>
+              <w:rPr>
+                <w:color w:val="85200C"/>
+                <w:sz w:val="24"/>
+                <w:szCs w:val="24"/>
+              </w:rPr>
+              <w:t>full_name</w:t>
+            </w:r>
+            <w:proofErr w:type="spellEnd"/>
+            <w:r>
+              <w:rPr>
+                <w:color w:val="85200C"/>
+                <w:sz w:val="24"/>
+                <w:szCs w:val="24"/>
+              </w:rPr>
+              <w:t>")</w:t>
+            </w:r>
+          </w:p>
+          <w:p>
+            <w:pPr>
+              <w:jc w:val="both"/>
+              <w:rPr>
+                <w:color w:val="85200C"/>
+                <w:sz w:val="24"/>
+                <w:szCs w:val="24"/>
+              </w:rPr>
+            </w:pPr>
+          </w:p>
+          <w:p>
+            <w:pPr>
+              <w:jc w:val="both"/>
+              <w:rPr>
+                <w:color w:val="85200C"/>
+                <w:sz w:val="24"/>
+                <w:szCs w:val="24"/>
+              </w:rPr>
+            </w:pPr>
+            <w:r>
+              <w:rPr>
+                <w:color w:val="85200C"/>
+                <w:sz w:val="24"/>
+                <w:szCs w:val="24"/>
+              </w:rPr>
+              <w:t xml:space="preserve">#show renamed column </w:t>
+            </w:r>
+            <w:proofErr w:type="spellStart"/>
+            <w:r>
+              <w:rPr>
+                <w:color w:val="85200C"/>
+                <w:sz w:val="24"/>
+                <w:szCs w:val="24"/>
+              </w:rPr>
+              <w:t>dataframe</w:t>
+            </w:r>
+            <w:proofErr w:type="spellEnd"/>
+          </w:p>
+          <w:p>
+            <w:pPr>
+              <w:jc w:val="both"/>
+              <w:rPr>
+                <w:color w:val="85200C"/>
+                <w:sz w:val="24"/>
+                <w:szCs w:val="24"/>
+              </w:rPr>
+            </w:pPr>
+            <w:proofErr w:type="spellStart"/>
+            <w:r>
+              <w:rPr>
+                <w:color w:val="85200C"/>
+                <w:sz w:val="24"/>
+                <w:szCs w:val="24"/>
+              </w:rPr>
+              <w:t>dfRenameCol.show</w:t>
+            </w:r>
+            <w:proofErr w:type="spellEnd"/>
+            <w:r>
+              <w:rPr>
+                <w:color w:val="85200C"/>
+                <w:sz w:val="24"/>
+                <w:szCs w:val="24"/>
+              </w:rPr>
+              <w:t>()</w:t>
             </w:r>
           </w:p>
         </w:tc>
@@ -3927,6 +5352,7 @@
           <w:szCs w:val="24"/>
         </w:rPr>
       </w:pPr>
+      <w:proofErr w:type="spellStart"/>
       <w:r>
         <w:rPr>
           <w:b/>
@@ -3934,7 +5360,17 @@
           <w:sz w:val="24"/>
           <w:szCs w:val="24"/>
         </w:rPr>
-        <w:t>GroupBy and Aggregate Operations</w:t>
+        <w:t>GroupBy</w:t>
+      </w:r>
+      <w:proofErr w:type="spellEnd"/>
+      <w:r>
+        <w:rPr>
+          <w:b/>
+          <w:color w:val="1F2328"/>
+          <w:sz w:val="24"/>
+          <w:szCs w:val="24"/>
+        </w:rPr>
+        <w:t xml:space="preserve"> and Aggregate Operations</w:t>
       </w:r>
     </w:p>
     <w:p>
@@ -3998,25 +5434,89 @@
                 <w:sz w:val="24"/>
                 <w:szCs w:val="24"/>
               </w:rPr>
-              <w:t># Group by lastname then print counts of lastname and show</w:t>
-            </w:r>
-          </w:p>
-          <w:p>
-            <w:pPr>
-              <w:jc w:val="both"/>
-              <w:rPr>
-                <w:color w:val="85200C"/>
-                <w:sz w:val="24"/>
-                <w:szCs w:val="24"/>
-              </w:rPr>
-            </w:pPr>
-            <w:r>
-              <w:rPr>
-                <w:color w:val="85200C"/>
-                <w:sz w:val="24"/>
-                <w:szCs w:val="24"/>
-              </w:rPr>
-              <w:t>sparkDf.groupBy("lastname"</w:t>
+              <w:t xml:space="preserve"># Group by </w:t>
+            </w:r>
+            <w:proofErr w:type="spellStart"/>
+            <w:r>
+              <w:rPr>
+                <w:color w:val="85200C"/>
+                <w:sz w:val="24"/>
+                <w:szCs w:val="24"/>
+              </w:rPr>
+              <w:t>lastname</w:t>
+            </w:r>
+            <w:proofErr w:type="spellEnd"/>
+            <w:r>
+              <w:rPr>
+                <w:color w:val="85200C"/>
+                <w:sz w:val="24"/>
+                <w:szCs w:val="24"/>
+              </w:rPr>
+              <w:t xml:space="preserve"> then print counts of </w:t>
+            </w:r>
+            <w:proofErr w:type="spellStart"/>
+            <w:r>
+              <w:rPr>
+                <w:color w:val="85200C"/>
+                <w:sz w:val="24"/>
+                <w:szCs w:val="24"/>
+              </w:rPr>
+              <w:t>lastname</w:t>
+            </w:r>
+            <w:proofErr w:type="spellEnd"/>
+            <w:r>
+              <w:rPr>
+                <w:color w:val="85200C"/>
+                <w:sz w:val="24"/>
+                <w:szCs w:val="24"/>
+              </w:rPr>
+              <w:t xml:space="preserve"> and show</w:t>
+            </w:r>
+          </w:p>
+          <w:p>
+            <w:pPr>
+              <w:jc w:val="both"/>
+              <w:rPr>
+                <w:color w:val="85200C"/>
+                <w:sz w:val="24"/>
+                <w:szCs w:val="24"/>
+              </w:rPr>
+            </w:pPr>
+            <w:proofErr w:type="spellStart"/>
+            <w:r>
+              <w:rPr>
+                <w:color w:val="85200C"/>
+                <w:sz w:val="24"/>
+                <w:szCs w:val="24"/>
+              </w:rPr>
+              <w:t>sparkDf.groupBy</w:t>
+            </w:r>
+            <w:proofErr w:type="spellEnd"/>
+            <w:r>
+              <w:rPr>
+                <w:color w:val="85200C"/>
+                <w:sz w:val="24"/>
+                <w:szCs w:val="24"/>
+              </w:rPr>
+              <w:t>("</w:t>
+            </w:r>
+            <w:proofErr w:type="spellStart"/>
+            <w:r>
+              <w:rPr>
+                <w:color w:val="85200C"/>
+                <w:sz w:val="24"/>
+                <w:szCs w:val="24"/>
+              </w:rPr>
+              <w:t>lastname</w:t>
+            </w:r>
+            <w:proofErr w:type="spellEnd"/>
+            <w:r>
+              <w:rPr>
+                <w:color w:val="85200C"/>
+                <w:sz w:val="24"/>
+                <w:szCs w:val="24"/>
+              </w:rPr>
+              <w:t>"</w:t>
             </w:r>
             <w:proofErr w:type="gramStart"/>
             <w:r>
@@ -4128,8 +5628,18 @@
           <w:sz w:val="24"/>
           <w:szCs w:val="24"/>
         </w:rPr>
-        <w:t>Filter the spark dataframe</w:t>
-      </w:r>
+        <w:t xml:space="preserve">Filter the spark </w:t>
+      </w:r>
+      <w:proofErr w:type="spellStart"/>
+      <w:r>
+        <w:rPr>
+          <w:color w:val="1F2328"/>
+          <w:sz w:val="24"/>
+          <w:szCs w:val="24"/>
+        </w:rPr>
+        <w:t>dataframe</w:t>
+      </w:r>
+      <w:proofErr w:type="spellEnd"/>
       <w:r>
         <w:rPr>
           <w:color w:val="1F2328"/>
@@ -4182,25 +5692,89 @@
                 <w:sz w:val="24"/>
                 <w:szCs w:val="24"/>
               </w:rPr>
-              <w:t># Filter spark DataFrame for customers who have the last name Adams</w:t>
-            </w:r>
-          </w:p>
-          <w:p>
-            <w:pPr>
-              <w:jc w:val="both"/>
-              <w:rPr>
-                <w:color w:val="85200C"/>
-                <w:sz w:val="24"/>
-                <w:szCs w:val="24"/>
-              </w:rPr>
-            </w:pPr>
-            <w:r>
-              <w:rPr>
-                <w:color w:val="85200C"/>
-                <w:sz w:val="24"/>
-                <w:szCs w:val="24"/>
-              </w:rPr>
-              <w:t>sparkDf.filter(sparkDf["lastname"] == "Adams"</w:t>
+              <w:t xml:space="preserve"># Filter spark </w:t>
+            </w:r>
+            <w:proofErr w:type="spellStart"/>
+            <w:r>
+              <w:rPr>
+                <w:color w:val="85200C"/>
+                <w:sz w:val="24"/>
+                <w:szCs w:val="24"/>
+              </w:rPr>
+              <w:t>DataFrame</w:t>
+            </w:r>
+            <w:proofErr w:type="spellEnd"/>
+            <w:r>
+              <w:rPr>
+                <w:color w:val="85200C"/>
+                <w:sz w:val="24"/>
+                <w:szCs w:val="24"/>
+              </w:rPr>
+              <w:t xml:space="preserve"> for customers who have the last name Adams</w:t>
+            </w:r>
+          </w:p>
+          <w:p>
+            <w:pPr>
+              <w:jc w:val="both"/>
+              <w:rPr>
+                <w:color w:val="85200C"/>
+                <w:sz w:val="24"/>
+                <w:szCs w:val="24"/>
+              </w:rPr>
+            </w:pPr>
+            <w:proofErr w:type="spellStart"/>
+            <w:r>
+              <w:rPr>
+                <w:color w:val="85200C"/>
+                <w:sz w:val="24"/>
+                <w:szCs w:val="24"/>
+              </w:rPr>
+              <w:t>sparkDf.filter</w:t>
+            </w:r>
+            <w:proofErr w:type="spellEnd"/>
+            <w:r>
+              <w:rPr>
+                <w:color w:val="85200C"/>
+                <w:sz w:val="24"/>
+                <w:szCs w:val="24"/>
+              </w:rPr>
+              <w:t>(</w:t>
+            </w:r>
+            <w:proofErr w:type="spellStart"/>
+            <w:r>
+              <w:rPr>
+                <w:color w:val="85200C"/>
+                <w:sz w:val="24"/>
+                <w:szCs w:val="24"/>
+              </w:rPr>
+              <w:t>sparkDf</w:t>
+            </w:r>
+            <w:proofErr w:type="spellEnd"/>
+            <w:r>
+              <w:rPr>
+                <w:color w:val="85200C"/>
+                <w:sz w:val="24"/>
+                <w:szCs w:val="24"/>
+              </w:rPr>
+              <w:t>["</w:t>
+            </w:r>
+            <w:proofErr w:type="spellStart"/>
+            <w:r>
+              <w:rPr>
+                <w:color w:val="85200C"/>
+                <w:sz w:val="24"/>
+                <w:szCs w:val="24"/>
+              </w:rPr>
+              <w:t>lastname</w:t>
+            </w:r>
+            <w:proofErr w:type="spellEnd"/>
+            <w:r>
+              <w:rPr>
+                <w:color w:val="85200C"/>
+                <w:sz w:val="24"/>
+                <w:szCs w:val="24"/>
+              </w:rPr>
+              <w:t>"] == "Adams"</w:t>
             </w:r>
             <w:proofErr w:type="gramStart"/>
             <w:r>
@@ -4323,25 +5897,71 @@
                 <w:sz w:val="24"/>
                 <w:szCs w:val="24"/>
               </w:rPr>
-              <w:t># Where clause spark DataFrame for customers who have the last name Adams</w:t>
-            </w:r>
-          </w:p>
-          <w:p>
-            <w:pPr>
-              <w:jc w:val="both"/>
-              <w:rPr>
-                <w:color w:val="85200C"/>
-                <w:sz w:val="24"/>
-                <w:szCs w:val="24"/>
-              </w:rPr>
-            </w:pPr>
-            <w:r>
-              <w:rPr>
-                <w:color w:val="85200C"/>
-                <w:sz w:val="24"/>
-                <w:szCs w:val="24"/>
-              </w:rPr>
-              <w:t>sparkDf.where("lastname =='Adams'"</w:t>
+              <w:t xml:space="preserve"># Where clause spark </w:t>
+            </w:r>
+            <w:proofErr w:type="spellStart"/>
+            <w:r>
+              <w:rPr>
+                <w:color w:val="85200C"/>
+                <w:sz w:val="24"/>
+                <w:szCs w:val="24"/>
+              </w:rPr>
+              <w:t>DataFrame</w:t>
+            </w:r>
+            <w:proofErr w:type="spellEnd"/>
+            <w:r>
+              <w:rPr>
+                <w:color w:val="85200C"/>
+                <w:sz w:val="24"/>
+                <w:szCs w:val="24"/>
+              </w:rPr>
+              <w:t xml:space="preserve"> for customers who have the last name Adams</w:t>
+            </w:r>
+          </w:p>
+          <w:p>
+            <w:pPr>
+              <w:jc w:val="both"/>
+              <w:rPr>
+                <w:color w:val="85200C"/>
+                <w:sz w:val="24"/>
+                <w:szCs w:val="24"/>
+              </w:rPr>
+            </w:pPr>
+            <w:proofErr w:type="spellStart"/>
+            <w:r>
+              <w:rPr>
+                <w:color w:val="85200C"/>
+                <w:sz w:val="24"/>
+                <w:szCs w:val="24"/>
+              </w:rPr>
+              <w:t>sparkDf.where</w:t>
+            </w:r>
+            <w:proofErr w:type="spellEnd"/>
+            <w:r>
+              <w:rPr>
+                <w:color w:val="85200C"/>
+                <w:sz w:val="24"/>
+                <w:szCs w:val="24"/>
+              </w:rPr>
+              <w:t>("</w:t>
+            </w:r>
+            <w:proofErr w:type="spellStart"/>
+            <w:r>
+              <w:rPr>
+                <w:color w:val="85200C"/>
+                <w:sz w:val="24"/>
+                <w:szCs w:val="24"/>
+              </w:rPr>
+              <w:t>lastname</w:t>
+            </w:r>
+            <w:proofErr w:type="spellEnd"/>
+            <w:r>
+              <w:rPr>
+                <w:color w:val="85200C"/>
+                <w:sz w:val="24"/>
+                <w:szCs w:val="24"/>
+              </w:rPr>
+              <w:t xml:space="preserve"> =='Adams'"</w:t>
             </w:r>
             <w:proofErr w:type="gramStart"/>
             <w:r>
@@ -4412,8 +6032,18 @@
           <w:sz w:val="24"/>
           <w:szCs w:val="24"/>
         </w:rPr>
-        <w:t>read up orders dataset and convert to spark dataframe</w:t>
-      </w:r>
+        <w:t xml:space="preserve">read up orders dataset and convert to spark </w:t>
+      </w:r>
+      <w:proofErr w:type="spellStart"/>
+      <w:r>
+        <w:rPr>
+          <w:color w:val="1F2328"/>
+          <w:sz w:val="24"/>
+          <w:szCs w:val="24"/>
+        </w:rPr>
+        <w:t>dataframe</w:t>
+      </w:r>
+      <w:proofErr w:type="spellEnd"/>
       <w:r>
         <w:rPr>
           <w:color w:val="1F2328"/>
@@ -4466,25 +6096,72 @@
                 <w:sz w:val="24"/>
                 <w:szCs w:val="24"/>
               </w:rPr>
-              <w:t># Read from the customers table in the glue data catalog using a dynamic frame and convert to spark dataframe</w:t>
-            </w:r>
-          </w:p>
-          <w:p>
-            <w:pPr>
-              <w:jc w:val="both"/>
-              <w:rPr>
-                <w:color w:val="85200C"/>
-                <w:sz w:val="24"/>
-                <w:szCs w:val="24"/>
-              </w:rPr>
-            </w:pPr>
-            <w:r>
-              <w:rPr>
-                <w:color w:val="85200C"/>
-                <w:sz w:val="24"/>
-                <w:szCs w:val="24"/>
-              </w:rPr>
-              <w:t>dfOrders = glueContext.create_dynamic_</w:t>
+              <w:t xml:space="preserve"># Read from the customers table in the glue data </w:t>
+            </w:r>
+            <w:proofErr w:type="spellStart"/>
+            <w:r>
+              <w:rPr>
+                <w:color w:val="85200C"/>
+                <w:sz w:val="24"/>
+                <w:szCs w:val="24"/>
+              </w:rPr>
+              <w:t>catalog</w:t>
+            </w:r>
+            <w:proofErr w:type="spellEnd"/>
+            <w:r>
+              <w:rPr>
+                <w:color w:val="85200C"/>
+                <w:sz w:val="24"/>
+                <w:szCs w:val="24"/>
+              </w:rPr>
+              <w:t xml:space="preserve"> using a dynamic frame and convert to spark </w:t>
+            </w:r>
+            <w:proofErr w:type="spellStart"/>
+            <w:r>
+              <w:rPr>
+                <w:color w:val="85200C"/>
+                <w:sz w:val="24"/>
+                <w:szCs w:val="24"/>
+              </w:rPr>
+              <w:t>dataframe</w:t>
+            </w:r>
+            <w:proofErr w:type="spellEnd"/>
+          </w:p>
+          <w:p>
+            <w:pPr>
+              <w:jc w:val="both"/>
+              <w:rPr>
+                <w:color w:val="85200C"/>
+                <w:sz w:val="24"/>
+                <w:szCs w:val="24"/>
+              </w:rPr>
+            </w:pPr>
+            <w:proofErr w:type="spellStart"/>
+            <w:r>
+              <w:rPr>
+                <w:color w:val="85200C"/>
+                <w:sz w:val="24"/>
+                <w:szCs w:val="24"/>
+              </w:rPr>
+              <w:t>dfOrders</w:t>
+            </w:r>
+            <w:proofErr w:type="spellEnd"/>
+            <w:r>
+              <w:rPr>
+                <w:color w:val="85200C"/>
+                <w:sz w:val="24"/>
+                <w:szCs w:val="24"/>
+              </w:rPr>
+              <w:t xml:space="preserve"> = </w:t>
+            </w:r>
+            <w:proofErr w:type="spellStart"/>
+            <w:r>
+              <w:rPr>
+                <w:color w:val="85200C"/>
+                <w:sz w:val="24"/>
+                <w:szCs w:val="24"/>
+              </w:rPr>
+              <w:t>glueContext.create_dynamic_</w:t>
             </w:r>
             <w:proofErr w:type="gramStart"/>
             <w:r>
@@ -4511,7 +6188,16 @@
                 <w:sz w:val="24"/>
                 <w:szCs w:val="24"/>
               </w:rPr>
-              <w:t>catalog(</w:t>
+              <w:t>catalog</w:t>
+            </w:r>
+            <w:proofErr w:type="spellEnd"/>
+            <w:r>
+              <w:rPr>
+                <w:color w:val="85200C"/>
+                <w:sz w:val="24"/>
+                <w:szCs w:val="24"/>
+              </w:rPr>
+              <w:t>(</w:t>
             </w:r>
             <w:proofErr w:type="gramEnd"/>
           </w:p>
@@ -4548,7 +6234,25 @@
                 <w:sz w:val="24"/>
                 <w:szCs w:val="24"/>
               </w:rPr>
-              <w:t xml:space="preserve">                                        table_name = "orders"</w:t>
+              <w:t xml:space="preserve">                                        </w:t>
+            </w:r>
+            <w:proofErr w:type="spellStart"/>
+            <w:r>
+              <w:rPr>
+                <w:color w:val="85200C"/>
+                <w:sz w:val="24"/>
+                <w:szCs w:val="24"/>
+              </w:rPr>
+              <w:t>table_name</w:t>
+            </w:r>
+            <w:proofErr w:type="spellEnd"/>
+            <w:r>
+              <w:rPr>
+                <w:color w:val="85200C"/>
+                <w:sz w:val="24"/>
+                <w:szCs w:val="24"/>
+              </w:rPr>
+              <w:t xml:space="preserve"> = "orders"</w:t>
             </w:r>
           </w:p>
           <w:p>
@@ -4575,8 +6279,18 @@
                 <w:sz w:val="24"/>
                 <w:szCs w:val="24"/>
               </w:rPr>
-              <w:t>).toDF</w:t>
-            </w:r>
+              <w:t>).</w:t>
+            </w:r>
+            <w:proofErr w:type="spellStart"/>
+            <w:r>
+              <w:rPr>
+                <w:color w:val="85200C"/>
+                <w:sz w:val="24"/>
+                <w:szCs w:val="24"/>
+              </w:rPr>
+              <w:t>toDF</w:t>
+            </w:r>
+            <w:proofErr w:type="spellEnd"/>
             <w:proofErr w:type="gramEnd"/>
             <w:r>
               <w:rPr>
@@ -4616,7 +6330,27 @@
           <w:sz w:val="24"/>
           <w:szCs w:val="24"/>
         </w:rPr>
-        <w:t>Inner join for Spark Dataframe All Data</w:t>
+        <w:t xml:space="preserve">Inner join for Spark </w:t>
+      </w:r>
+      <w:proofErr w:type="spellStart"/>
+      <w:r>
+        <w:rPr>
+          <w:b/>
+          <w:color w:val="1F2328"/>
+          <w:sz w:val="24"/>
+          <w:szCs w:val="24"/>
+        </w:rPr>
+        <w:t>Dataframe</w:t>
+      </w:r>
+      <w:proofErr w:type="spellEnd"/>
+      <w:r>
+        <w:rPr>
+          <w:b/>
+          <w:color w:val="1F2328"/>
+          <w:sz w:val="24"/>
+          <w:szCs w:val="24"/>
+        </w:rPr>
+        <w:t xml:space="preserve"> All Data</w:t>
       </w:r>
       <w:r>
         <w:rPr>
@@ -4682,14 +6416,25 @@
                 <w:szCs w:val="24"/>
               </w:rPr>
             </w:pPr>
-            <w:r>
-              <w:rPr>
-                <w:color w:val="85200C"/>
-                <w:sz w:val="24"/>
-                <w:szCs w:val="24"/>
-              </w:rPr>
-              <w:t>sparkDf.join(</w:t>
-            </w:r>
+            <w:proofErr w:type="spellStart"/>
+            <w:r>
+              <w:rPr>
+                <w:color w:val="85200C"/>
+                <w:sz w:val="24"/>
+                <w:szCs w:val="24"/>
+              </w:rPr>
+              <w:t>sparkDf.join</w:t>
+            </w:r>
+            <w:proofErr w:type="spellEnd"/>
+            <w:r>
+              <w:rPr>
+                <w:color w:val="85200C"/>
+                <w:sz w:val="24"/>
+                <w:szCs w:val="24"/>
+              </w:rPr>
+              <w:t>(</w:t>
+            </w:r>
+            <w:proofErr w:type="spellStart"/>
             <w:proofErr w:type="gramStart"/>
             <w:r>
               <w:rPr>
@@ -4699,6 +6444,7 @@
               </w:rPr>
               <w:t>dfOrders,sparkDf.customerid</w:t>
             </w:r>
+            <w:proofErr w:type="spellEnd"/>
             <w:proofErr w:type="gramEnd"/>
             <w:r>
               <w:rPr>
@@ -4715,8 +6461,18 @@
                 <w:sz w:val="24"/>
                 <w:szCs w:val="24"/>
               </w:rPr>
-              <w:t>=  dfOrders.customerid</w:t>
-            </w:r>
+              <w:t>=  dfOrders.</w:t>
+            </w:r>
+            <w:proofErr w:type="spellStart"/>
+            <w:r>
+              <w:rPr>
+                <w:color w:val="85200C"/>
+                <w:sz w:val="24"/>
+                <w:szCs w:val="24"/>
+              </w:rPr>
+              <w:t>customerid</w:t>
+            </w:r>
+            <w:proofErr w:type="spellEnd"/>
             <w:proofErr w:type="gramEnd"/>
             <w:r>
               <w:rPr>
@@ -4852,13 +6608,59 @@
                 <w:szCs w:val="24"/>
               </w:rPr>
             </w:pPr>
-            <w:r>
-              <w:rPr>
-                <w:color w:val="85200C"/>
-                <w:sz w:val="24"/>
-                <w:szCs w:val="24"/>
-              </w:rPr>
-              <w:t>dfAdams = sparkDf.where("lastname =='Adams'")</w:t>
+            <w:proofErr w:type="spellStart"/>
+            <w:r>
+              <w:rPr>
+                <w:color w:val="85200C"/>
+                <w:sz w:val="24"/>
+                <w:szCs w:val="24"/>
+              </w:rPr>
+              <w:t>dfAdams</w:t>
+            </w:r>
+            <w:proofErr w:type="spellEnd"/>
+            <w:r>
+              <w:rPr>
+                <w:color w:val="85200C"/>
+                <w:sz w:val="24"/>
+                <w:szCs w:val="24"/>
+              </w:rPr>
+              <w:t xml:space="preserve"> = </w:t>
+            </w:r>
+            <w:proofErr w:type="spellStart"/>
+            <w:r>
+              <w:rPr>
+                <w:color w:val="85200C"/>
+                <w:sz w:val="24"/>
+                <w:szCs w:val="24"/>
+              </w:rPr>
+              <w:t>sparkDf.where</w:t>
+            </w:r>
+            <w:proofErr w:type="spellEnd"/>
+            <w:r>
+              <w:rPr>
+                <w:color w:val="85200C"/>
+                <w:sz w:val="24"/>
+                <w:szCs w:val="24"/>
+              </w:rPr>
+              <w:t>("</w:t>
+            </w:r>
+            <w:proofErr w:type="spellStart"/>
+            <w:r>
+              <w:rPr>
+                <w:color w:val="85200C"/>
+                <w:sz w:val="24"/>
+                <w:szCs w:val="24"/>
+              </w:rPr>
+              <w:t>lastname</w:t>
+            </w:r>
+            <w:proofErr w:type="spellEnd"/>
+            <w:r>
+              <w:rPr>
+                <w:color w:val="85200C"/>
+                <w:sz w:val="24"/>
+                <w:szCs w:val="24"/>
+              </w:rPr>
+              <w:t xml:space="preserve"> =='Adams'")</w:t>
             </w:r>
           </w:p>
           <w:p>
@@ -4898,14 +6700,25 @@
                 <w:szCs w:val="24"/>
               </w:rPr>
             </w:pPr>
-            <w:r>
-              <w:rPr>
-                <w:color w:val="85200C"/>
-                <w:sz w:val="24"/>
-                <w:szCs w:val="24"/>
-              </w:rPr>
-              <w:t>dfAdams.join(</w:t>
-            </w:r>
+            <w:proofErr w:type="spellStart"/>
+            <w:r>
+              <w:rPr>
+                <w:color w:val="85200C"/>
+                <w:sz w:val="24"/>
+                <w:szCs w:val="24"/>
+              </w:rPr>
+              <w:t>dfAdams.join</w:t>
+            </w:r>
+            <w:proofErr w:type="spellEnd"/>
+            <w:r>
+              <w:rPr>
+                <w:color w:val="85200C"/>
+                <w:sz w:val="24"/>
+                <w:szCs w:val="24"/>
+              </w:rPr>
+              <w:t>(</w:t>
+            </w:r>
+            <w:proofErr w:type="spellStart"/>
             <w:proofErr w:type="gramStart"/>
             <w:r>
               <w:rPr>
@@ -4915,6 +6728,7 @@
               </w:rPr>
               <w:t>dfOrders,dfAdams.customerid</w:t>
             </w:r>
+            <w:proofErr w:type="spellEnd"/>
             <w:proofErr w:type="gramEnd"/>
             <w:r>
               <w:rPr>
@@ -4931,8 +6745,18 @@
                 <w:sz w:val="24"/>
                 <w:szCs w:val="24"/>
               </w:rPr>
-              <w:t>=  dfOrders.customerid</w:t>
-            </w:r>
+              <w:t>=  dfOrders.</w:t>
+            </w:r>
+            <w:proofErr w:type="spellStart"/>
+            <w:r>
+              <w:rPr>
+                <w:color w:val="85200C"/>
+                <w:sz w:val="24"/>
+                <w:szCs w:val="24"/>
+              </w:rPr>
+              <w:t>customerid</w:t>
+            </w:r>
+            <w:proofErr w:type="spellEnd"/>
             <w:proofErr w:type="gramEnd"/>
             <w:r>
               <w:rPr>
@@ -5044,26 +6868,65 @@
                 <w:sz w:val="24"/>
                 <w:szCs w:val="24"/>
               </w:rPr>
-              <w:t>#left join on orders and adams df</w:t>
-            </w:r>
-          </w:p>
-          <w:p>
-            <w:pPr>
-              <w:jc w:val="both"/>
+              <w:t xml:space="preserve">#left join on orders and </w:t>
+            </w:r>
+            <w:proofErr w:type="spellStart"/>
+            <w:r>
               <w:rPr>
                 <w:color w:val="A61C00"/>
                 <w:sz w:val="24"/>
                 <w:szCs w:val="24"/>
               </w:rPr>
-            </w:pPr>
+              <w:t>adams</w:t>
+            </w:r>
+            <w:proofErr w:type="spellEnd"/>
             <w:r>
               <w:rPr>
                 <w:color w:val="A61C00"/>
                 <w:sz w:val="24"/>
                 <w:szCs w:val="24"/>
               </w:rPr>
-              <w:t>dfOrders.join(</w:t>
-            </w:r>
+              <w:t xml:space="preserve"> </w:t>
+            </w:r>
+            <w:proofErr w:type="spellStart"/>
+            <w:r>
+              <w:rPr>
+                <w:color w:val="A61C00"/>
+                <w:sz w:val="24"/>
+                <w:szCs w:val="24"/>
+              </w:rPr>
+              <w:t>df</w:t>
+            </w:r>
+            <w:proofErr w:type="spellEnd"/>
+          </w:p>
+          <w:p>
+            <w:pPr>
+              <w:jc w:val="both"/>
+              <w:rPr>
+                <w:color w:val="A61C00"/>
+                <w:sz w:val="24"/>
+                <w:szCs w:val="24"/>
+              </w:rPr>
+            </w:pPr>
+            <w:proofErr w:type="spellStart"/>
+            <w:r>
+              <w:rPr>
+                <w:color w:val="A61C00"/>
+                <w:sz w:val="24"/>
+                <w:szCs w:val="24"/>
+              </w:rPr>
+              <w:t>dfOrders.join</w:t>
+            </w:r>
+            <w:proofErr w:type="spellEnd"/>
+            <w:r>
+              <w:rPr>
+                <w:color w:val="A61C00"/>
+                <w:sz w:val="24"/>
+                <w:szCs w:val="24"/>
+              </w:rPr>
+              <w:t>(</w:t>
+            </w:r>
+            <w:proofErr w:type="spellStart"/>
             <w:proofErr w:type="gramStart"/>
             <w:r>
               <w:rPr>
@@ -5073,6 +6936,7 @@
               </w:rPr>
               <w:t>dfAdams,dfAdams.customerid</w:t>
             </w:r>
+            <w:proofErr w:type="spellEnd"/>
             <w:proofErr w:type="gramEnd"/>
             <w:r>
               <w:rPr>
@@ -5089,8 +6953,18 @@
                 <w:sz w:val="24"/>
                 <w:szCs w:val="24"/>
               </w:rPr>
-              <w:t>=  dfOrders.customerid</w:t>
-            </w:r>
+              <w:t>=  dfOrders.</w:t>
+            </w:r>
+            <w:proofErr w:type="spellStart"/>
+            <w:r>
+              <w:rPr>
+                <w:color w:val="A61C00"/>
+                <w:sz w:val="24"/>
+                <w:szCs w:val="24"/>
+              </w:rPr>
+              <w:t>customerid</w:t>
+            </w:r>
+            <w:proofErr w:type="spellEnd"/>
             <w:proofErr w:type="gramEnd"/>
             <w:r>
               <w:rPr>
@@ -5164,8 +7038,19 @@
           <w:sz w:val="24"/>
           <w:szCs w:val="24"/>
         </w:rPr>
-        <w:t>Writing data down using the Glue Data Catalog</w:t>
-      </w:r>
+        <w:t xml:space="preserve">Writing data down using the Glue Data </w:t>
+      </w:r>
+      <w:proofErr w:type="spellStart"/>
+      <w:r>
+        <w:rPr>
+          <w:b/>
+          <w:color w:val="1F2328"/>
+          <w:sz w:val="24"/>
+          <w:szCs w:val="24"/>
+        </w:rPr>
+        <w:t>Catalog</w:t>
+      </w:r>
+      <w:proofErr w:type="spellEnd"/>
     </w:p>
     <w:p>
       <w:pPr>
@@ -5186,6 +7071,7 @@
         </w:rPr>
         <w:t xml:space="preserve">delete data from S3 in </w:t>
       </w:r>
+      <w:proofErr w:type="spellStart"/>
       <w:r>
         <w:rPr>
           <w:color w:val="188038"/>
@@ -5194,6 +7080,7 @@
         </w:rPr>
         <w:t>customers_write_dyf</w:t>
       </w:r>
+      <w:proofErr w:type="spellEnd"/>
       <w:r>
         <w:rPr>
           <w:color w:val="1F2328"/>
@@ -5226,8 +7113,36 @@
           <w:sz w:val="24"/>
           <w:szCs w:val="24"/>
         </w:rPr>
-        <w:t>convert from spark Dataframe to Glue Dynamic DataFrame</w:t>
-      </w:r>
+        <w:t xml:space="preserve">convert from spark </w:t>
+      </w:r>
+      <w:proofErr w:type="spellStart"/>
+      <w:r>
+        <w:rPr>
+          <w:color w:val="1F2328"/>
+          <w:sz w:val="24"/>
+          <w:szCs w:val="24"/>
+        </w:rPr>
+        <w:t>Dataframe</w:t>
+      </w:r>
+      <w:proofErr w:type="spellEnd"/>
+      <w:r>
+        <w:rPr>
+          <w:color w:val="1F2328"/>
+          <w:sz w:val="24"/>
+          <w:szCs w:val="24"/>
+        </w:rPr>
+        <w:t xml:space="preserve"> to Glue Dynamic </w:t>
+      </w:r>
+      <w:proofErr w:type="spellStart"/>
+      <w:r>
+        <w:rPr>
+          <w:color w:val="1F2328"/>
+          <w:sz w:val="24"/>
+          <w:szCs w:val="24"/>
+        </w:rPr>
+        <w:t>DataFrame</w:t>
+      </w:r>
+      <w:proofErr w:type="spellEnd"/>
       <w:r>
         <w:rPr>
           <w:color w:val="1F2328"/>
@@ -5280,7 +7195,25 @@
                 <w:sz w:val="24"/>
                 <w:szCs w:val="24"/>
               </w:rPr>
-              <w:t># Import Dynamic DataFrame class</w:t>
+              <w:t xml:space="preserve"># Import Dynamic </w:t>
+            </w:r>
+            <w:proofErr w:type="spellStart"/>
+            <w:r>
+              <w:rPr>
+                <w:color w:val="85200C"/>
+                <w:sz w:val="24"/>
+                <w:szCs w:val="24"/>
+              </w:rPr>
+              <w:t>DataFrame</w:t>
+            </w:r>
+            <w:proofErr w:type="spellEnd"/>
+            <w:r>
+              <w:rPr>
+                <w:color w:val="85200C"/>
+                <w:sz w:val="24"/>
+                <w:szCs w:val="24"/>
+              </w:rPr>
+              <w:t xml:space="preserve"> class</w:t>
             </w:r>
           </w:p>
           <w:p>
@@ -5300,6 +7233,7 @@
               </w:rPr>
               <w:t xml:space="preserve">from </w:t>
             </w:r>
+            <w:proofErr w:type="spellStart"/>
             <w:proofErr w:type="gramStart"/>
             <w:r>
               <w:rPr>
@@ -5309,6 +7243,7 @@
               </w:rPr>
               <w:t>awsglue.dynamicframe</w:t>
             </w:r>
+            <w:proofErr w:type="spellEnd"/>
             <w:proofErr w:type="gramEnd"/>
             <w:r>
               <w:rPr>
@@ -5316,8 +7251,18 @@
                 <w:sz w:val="24"/>
                 <w:szCs w:val="24"/>
               </w:rPr>
-              <w:t xml:space="preserve"> import DynamicFrame</w:t>
-            </w:r>
+              <w:t xml:space="preserve"> import </w:t>
+            </w:r>
+            <w:proofErr w:type="spellStart"/>
+            <w:r>
+              <w:rPr>
+                <w:color w:val="85200C"/>
+                <w:sz w:val="24"/>
+                <w:szCs w:val="24"/>
+              </w:rPr>
+              <w:t>DynamicFrame</w:t>
+            </w:r>
+            <w:proofErr w:type="spellEnd"/>
           </w:p>
           <w:p>
             <w:pPr>
@@ -5356,13 +7301,77 @@
                 <w:szCs w:val="24"/>
               </w:rPr>
             </w:pPr>
-            <w:r>
-              <w:rPr>
-                <w:color w:val="85200C"/>
-                <w:sz w:val="24"/>
-                <w:szCs w:val="24"/>
-              </w:rPr>
-              <w:t>dyfCustomersConvert = DynamicFrame.fromDF(sparkDf, glueContext, "convert")</w:t>
+            <w:proofErr w:type="spellStart"/>
+            <w:r>
+              <w:rPr>
+                <w:color w:val="85200C"/>
+                <w:sz w:val="24"/>
+                <w:szCs w:val="24"/>
+              </w:rPr>
+              <w:t>dyfCustomersConvert</w:t>
+            </w:r>
+            <w:proofErr w:type="spellEnd"/>
+            <w:r>
+              <w:rPr>
+                <w:color w:val="85200C"/>
+                <w:sz w:val="24"/>
+                <w:szCs w:val="24"/>
+              </w:rPr>
+              <w:t xml:space="preserve"> = </w:t>
+            </w:r>
+            <w:proofErr w:type="spellStart"/>
+            <w:r>
+              <w:rPr>
+                <w:color w:val="85200C"/>
+                <w:sz w:val="24"/>
+                <w:szCs w:val="24"/>
+              </w:rPr>
+              <w:t>DynamicFrame.fromDF</w:t>
+            </w:r>
+            <w:proofErr w:type="spellEnd"/>
+            <w:r>
+              <w:rPr>
+                <w:color w:val="85200C"/>
+                <w:sz w:val="24"/>
+                <w:szCs w:val="24"/>
+              </w:rPr>
+              <w:t>(</w:t>
+            </w:r>
+            <w:proofErr w:type="spellStart"/>
+            <w:r>
+              <w:rPr>
+                <w:color w:val="85200C"/>
+                <w:sz w:val="24"/>
+                <w:szCs w:val="24"/>
+              </w:rPr>
+              <w:t>sparkDf</w:t>
+            </w:r>
+            <w:proofErr w:type="spellEnd"/>
+            <w:r>
+              <w:rPr>
+                <w:color w:val="85200C"/>
+                <w:sz w:val="24"/>
+                <w:szCs w:val="24"/>
+              </w:rPr>
+              <w:t xml:space="preserve">, </w:t>
+            </w:r>
+            <w:proofErr w:type="spellStart"/>
+            <w:r>
+              <w:rPr>
+                <w:color w:val="85200C"/>
+                <w:sz w:val="24"/>
+                <w:szCs w:val="24"/>
+              </w:rPr>
+              <w:t>glueContext</w:t>
+            </w:r>
+            <w:proofErr w:type="spellEnd"/>
+            <w:r>
+              <w:rPr>
+                <w:color w:val="85200C"/>
+                <w:sz w:val="24"/>
+                <w:szCs w:val="24"/>
+              </w:rPr>
+              <w:t>, "convert")</w:t>
             </w:r>
           </w:p>
           <w:p>
@@ -5402,13 +7411,23 @@
                 <w:szCs w:val="24"/>
               </w:rPr>
             </w:pPr>
-            <w:r>
-              <w:rPr>
-                <w:color w:val="85200C"/>
-                <w:sz w:val="24"/>
-                <w:szCs w:val="24"/>
-              </w:rPr>
-              <w:t>dyfCustomersConvert.show()</w:t>
+            <w:proofErr w:type="spellStart"/>
+            <w:r>
+              <w:rPr>
+                <w:color w:val="85200C"/>
+                <w:sz w:val="24"/>
+                <w:szCs w:val="24"/>
+              </w:rPr>
+              <w:t>dyfCustomersConvert.show</w:t>
+            </w:r>
+            <w:proofErr w:type="spellEnd"/>
+            <w:r>
+              <w:rPr>
+                <w:color w:val="85200C"/>
+                <w:sz w:val="24"/>
+                <w:szCs w:val="24"/>
+              </w:rPr>
+              <w:t>()</w:t>
             </w:r>
           </w:p>
         </w:tc>
@@ -5452,7 +7471,27 @@
           <w:sz w:val="24"/>
           <w:szCs w:val="24"/>
         </w:rPr>
-        <w:t>Write Dynamic DataFrame down to S3 location</w:t>
+        <w:t xml:space="preserve">Write Dynamic </w:t>
+      </w:r>
+      <w:proofErr w:type="spellStart"/>
+      <w:r>
+        <w:rPr>
+          <w:b/>
+          <w:color w:val="1F2328"/>
+          <w:sz w:val="24"/>
+          <w:szCs w:val="24"/>
+        </w:rPr>
+        <w:t>DataFrame</w:t>
+      </w:r>
+      <w:proofErr w:type="spellEnd"/>
+      <w:r>
+        <w:rPr>
+          <w:b/>
+          <w:color w:val="1F2328"/>
+          <w:sz w:val="24"/>
+          <w:szCs w:val="24"/>
+        </w:rPr>
+        <w:t xml:space="preserve"> down to S3 location</w:t>
       </w:r>
       <w:r>
         <w:rPr>
@@ -5536,6 +7575,7 @@
                 <w:szCs w:val="24"/>
               </w:rPr>
             </w:pPr>
+            <w:proofErr w:type="spellStart"/>
             <w:r>
               <w:rPr>
                 <w:color w:val="85200C"/>
@@ -5569,7 +7609,16 @@
                 <w:sz w:val="24"/>
                 <w:szCs w:val="24"/>
               </w:rPr>
-              <w:t>options(</w:t>
+              <w:t>options</w:t>
+            </w:r>
+            <w:proofErr w:type="spellEnd"/>
+            <w:r>
+              <w:rPr>
+                <w:color w:val="85200C"/>
+                <w:sz w:val="24"/>
+                <w:szCs w:val="24"/>
+              </w:rPr>
+              <w:t>(</w:t>
             </w:r>
             <w:proofErr w:type="gramEnd"/>
           </w:p>
@@ -5588,43 +7637,97 @@
                 <w:sz w:val="24"/>
                 <w:szCs w:val="24"/>
               </w:rPr>
-              <w:t xml:space="preserve">                            frame = dyfCustomersConvert,</w:t>
-            </w:r>
-          </w:p>
-          <w:p>
-            <w:pPr>
-              <w:jc w:val="both"/>
-              <w:rPr>
-                <w:color w:val="85200C"/>
-                <w:sz w:val="24"/>
-                <w:szCs w:val="24"/>
-              </w:rPr>
-            </w:pPr>
-            <w:r>
-              <w:rPr>
-                <w:color w:val="85200C"/>
-                <w:sz w:val="24"/>
-                <w:szCs w:val="24"/>
-              </w:rPr>
-              <w:t xml:space="preserve">                            connection_type="s3", </w:t>
-            </w:r>
-          </w:p>
-          <w:p>
-            <w:pPr>
-              <w:jc w:val="both"/>
-              <w:rPr>
-                <w:color w:val="85200C"/>
-                <w:sz w:val="24"/>
-                <w:szCs w:val="24"/>
-              </w:rPr>
-            </w:pPr>
-            <w:r>
-              <w:rPr>
-                <w:color w:val="85200C"/>
-                <w:sz w:val="24"/>
-                <w:szCs w:val="24"/>
-              </w:rPr>
-              <w:t xml:space="preserve">                            connection_options = {"path": "s3://&lt;YOUR_S3_BUCKET_NAME&gt;/write_down_dyf_to_s3"}, </w:t>
+              <w:t xml:space="preserve">                            frame = </w:t>
+            </w:r>
+            <w:proofErr w:type="spellStart"/>
+            <w:r>
+              <w:rPr>
+                <w:color w:val="85200C"/>
+                <w:sz w:val="24"/>
+                <w:szCs w:val="24"/>
+              </w:rPr>
+              <w:t>dyfCustomersConvert</w:t>
+            </w:r>
+            <w:proofErr w:type="spellEnd"/>
+            <w:r>
+              <w:rPr>
+                <w:color w:val="85200C"/>
+                <w:sz w:val="24"/>
+                <w:szCs w:val="24"/>
+              </w:rPr>
+              <w:t>,</w:t>
+            </w:r>
+          </w:p>
+          <w:p>
+            <w:pPr>
+              <w:jc w:val="both"/>
+              <w:rPr>
+                <w:color w:val="85200C"/>
+                <w:sz w:val="24"/>
+                <w:szCs w:val="24"/>
+              </w:rPr>
+            </w:pPr>
+            <w:r>
+              <w:rPr>
+                <w:color w:val="85200C"/>
+                <w:sz w:val="24"/>
+                <w:szCs w:val="24"/>
+              </w:rPr>
+              <w:t xml:space="preserve">                            </w:t>
+            </w:r>
+            <w:proofErr w:type="spellStart"/>
+            <w:r>
+              <w:rPr>
+                <w:color w:val="85200C"/>
+                <w:sz w:val="24"/>
+                <w:szCs w:val="24"/>
+              </w:rPr>
+              <w:t>connection_type</w:t>
+            </w:r>
+            <w:proofErr w:type="spellEnd"/>
+            <w:r>
+              <w:rPr>
+                <w:color w:val="85200C"/>
+                <w:sz w:val="24"/>
+                <w:szCs w:val="24"/>
+              </w:rPr>
+              <w:t xml:space="preserve">="s3", </w:t>
+            </w:r>
+          </w:p>
+          <w:p>
+            <w:pPr>
+              <w:jc w:val="both"/>
+              <w:rPr>
+                <w:color w:val="85200C"/>
+                <w:sz w:val="24"/>
+                <w:szCs w:val="24"/>
+              </w:rPr>
+            </w:pPr>
+            <w:r>
+              <w:rPr>
+                <w:color w:val="85200C"/>
+                <w:sz w:val="24"/>
+                <w:szCs w:val="24"/>
+              </w:rPr>
+              <w:t xml:space="preserve">                            </w:t>
+            </w:r>
+            <w:proofErr w:type="spellStart"/>
+            <w:r>
+              <w:rPr>
+                <w:color w:val="85200C"/>
+                <w:sz w:val="24"/>
+                <w:szCs w:val="24"/>
+              </w:rPr>
+              <w:t>connection_options</w:t>
+            </w:r>
+            <w:proofErr w:type="spellEnd"/>
+            <w:r>
+              <w:rPr>
+                <w:color w:val="85200C"/>
+                <w:sz w:val="24"/>
+                <w:szCs w:val="24"/>
+              </w:rPr>
+              <w:t xml:space="preserve"> = {"path": "s3://&lt;YOUR_S3_BUCKET_NAME&gt;/write_down_dyf_to_s3"}, </w:t>
             </w:r>
           </w:p>
           <w:p>
@@ -5660,8 +7763,18 @@
                 <w:sz w:val="24"/>
                 <w:szCs w:val="24"/>
               </w:rPr>
-              <w:t xml:space="preserve">                            format_options</w:t>
-            </w:r>
+              <w:t xml:space="preserve">                            </w:t>
+            </w:r>
+            <w:proofErr w:type="spellStart"/>
+            <w:r>
+              <w:rPr>
+                <w:color w:val="85200C"/>
+                <w:sz w:val="24"/>
+                <w:szCs w:val="24"/>
+              </w:rPr>
+              <w:t>format_options</w:t>
+            </w:r>
+            <w:proofErr w:type="spellEnd"/>
             <w:proofErr w:type="gramStart"/>
             <w:r>
               <w:rPr>
@@ -5724,7 +7837,25 @@
                 <w:sz w:val="24"/>
                 <w:szCs w:val="24"/>
               </w:rPr>
-              <w:t xml:space="preserve">                            transformation_ctx = "datasink2")</w:t>
+              <w:t xml:space="preserve">                            </w:t>
+            </w:r>
+            <w:proofErr w:type="spellStart"/>
+            <w:r>
+              <w:rPr>
+                <w:color w:val="85200C"/>
+                <w:sz w:val="24"/>
+                <w:szCs w:val="24"/>
+              </w:rPr>
+              <w:t>transformation_ctx</w:t>
+            </w:r>
+            <w:proofErr w:type="spellEnd"/>
+            <w:r>
+              <w:rPr>
+                <w:color w:val="85200C"/>
+                <w:sz w:val="24"/>
+                <w:szCs w:val="24"/>
+              </w:rPr>
+              <w:t xml:space="preserve"> = "datasink2")</w:t>
             </w:r>
           </w:p>
         </w:tc>
@@ -5756,8 +7887,39 @@
           <w:sz w:val="24"/>
           <w:szCs w:val="24"/>
         </w:rPr>
-        <w:t>Write Dynamic DataFrame using Glue Data Catalog</w:t>
-      </w:r>
+        <w:t xml:space="preserve">Write Dynamic </w:t>
+      </w:r>
+      <w:proofErr w:type="spellStart"/>
+      <w:r>
+        <w:rPr>
+          <w:b/>
+          <w:color w:val="1F2328"/>
+          <w:sz w:val="24"/>
+          <w:szCs w:val="24"/>
+        </w:rPr>
+        <w:t>DataFrame</w:t>
+      </w:r>
+      <w:proofErr w:type="spellEnd"/>
+      <w:r>
+        <w:rPr>
+          <w:b/>
+          <w:color w:val="1F2328"/>
+          <w:sz w:val="24"/>
+          <w:szCs w:val="24"/>
+        </w:rPr>
+        <w:t xml:space="preserve"> using Glue Data </w:t>
+      </w:r>
+      <w:proofErr w:type="spellStart"/>
+      <w:r>
+        <w:rPr>
+          <w:b/>
+          <w:color w:val="1F2328"/>
+          <w:sz w:val="24"/>
+          <w:szCs w:val="24"/>
+        </w:rPr>
+        <w:t>Catalog</w:t>
+      </w:r>
+      <w:proofErr w:type="spellEnd"/>
       <w:r>
         <w:rPr>
           <w:color w:val="1F2328"/>
@@ -5829,18 +7991,55 @@
                 <w:sz w:val="24"/>
                 <w:szCs w:val="24"/>
               </w:rPr>
-              <w:t xml:space="preserve"> data from the converted to customers_write_dyf table using the metadata stored in the glue data catalog </w:t>
-            </w:r>
-          </w:p>
-          <w:p>
-            <w:pPr>
-              <w:jc w:val="both"/>
-              <w:rPr>
-                <w:color w:val="85200C"/>
-                <w:sz w:val="24"/>
-                <w:szCs w:val="24"/>
-              </w:rPr>
-            </w:pPr>
+              <w:t xml:space="preserve"> data from the converted to </w:t>
+            </w:r>
+            <w:proofErr w:type="spellStart"/>
+            <w:r>
+              <w:rPr>
+                <w:color w:val="85200C"/>
+                <w:sz w:val="24"/>
+                <w:szCs w:val="24"/>
+              </w:rPr>
+              <w:t>customers_write_dyf</w:t>
+            </w:r>
+            <w:proofErr w:type="spellEnd"/>
+            <w:r>
+              <w:rPr>
+                <w:color w:val="85200C"/>
+                <w:sz w:val="24"/>
+                <w:szCs w:val="24"/>
+              </w:rPr>
+              <w:t xml:space="preserve"> table using the metadata stored in the glue data </w:t>
+            </w:r>
+            <w:proofErr w:type="spellStart"/>
+            <w:r>
+              <w:rPr>
+                <w:color w:val="85200C"/>
+                <w:sz w:val="24"/>
+                <w:szCs w:val="24"/>
+              </w:rPr>
+              <w:t>catalog</w:t>
+            </w:r>
+            <w:proofErr w:type="spellEnd"/>
+            <w:r>
+              <w:rPr>
+                <w:color w:val="85200C"/>
+                <w:sz w:val="24"/>
+                <w:szCs w:val="24"/>
+              </w:rPr>
+              <w:t xml:space="preserve"> </w:t>
+            </w:r>
+          </w:p>
+          <w:p>
+            <w:pPr>
+              <w:jc w:val="both"/>
+              <w:rPr>
+                <w:color w:val="85200C"/>
+                <w:sz w:val="24"/>
+                <w:szCs w:val="24"/>
+              </w:rPr>
+            </w:pPr>
+            <w:proofErr w:type="spellStart"/>
             <w:r>
               <w:rPr>
                 <w:color w:val="85200C"/>
@@ -5874,7 +8073,16 @@
                 <w:sz w:val="24"/>
                 <w:szCs w:val="24"/>
               </w:rPr>
-              <w:t>catalog(</w:t>
+              <w:t>catalog</w:t>
+            </w:r>
+            <w:proofErr w:type="spellEnd"/>
+            <w:r>
+              <w:rPr>
+                <w:color w:val="85200C"/>
+                <w:sz w:val="24"/>
+                <w:szCs w:val="24"/>
+              </w:rPr>
+              <w:t>(</w:t>
             </w:r>
             <w:proofErr w:type="gramEnd"/>
           </w:p>
@@ -5893,7 +8101,25 @@
                 <w:sz w:val="24"/>
                 <w:szCs w:val="24"/>
               </w:rPr>
-              <w:t xml:space="preserve">    frame = dyfCustomersConvert,</w:t>
+              <w:t xml:space="preserve">    frame = </w:t>
+            </w:r>
+            <w:proofErr w:type="spellStart"/>
+            <w:r>
+              <w:rPr>
+                <w:color w:val="85200C"/>
+                <w:sz w:val="24"/>
+                <w:szCs w:val="24"/>
+              </w:rPr>
+              <w:t>dyfCustomersConvert</w:t>
+            </w:r>
+            <w:proofErr w:type="spellEnd"/>
+            <w:r>
+              <w:rPr>
+                <w:color w:val="85200C"/>
+                <w:sz w:val="24"/>
+                <w:szCs w:val="24"/>
+              </w:rPr>
+              <w:t>,</w:t>
             </w:r>
           </w:p>
           <w:p>
@@ -5920,7 +8146,16 @@
                 <w:sz w:val="24"/>
                 <w:szCs w:val="24"/>
               </w:rPr>
-              <w:t>",  table</w:t>
+              <w:t xml:space="preserve">",  </w:t>
+            </w:r>
+            <w:proofErr w:type="spellStart"/>
+            <w:r>
+              <w:rPr>
+                <w:color w:val="85200C"/>
+                <w:sz w:val="24"/>
+                <w:szCs w:val="24"/>
+              </w:rPr>
+              <w:t>table</w:t>
             </w:r>
             <w:proofErr w:type="gramEnd"/>
             <w:r>
@@ -5929,12 +8164,302 @@
                 <w:sz w:val="24"/>
                 <w:szCs w:val="24"/>
               </w:rPr>
-              <w:t>_name = "customers_write_dyf")</w:t>
+              <w:t>_name</w:t>
+            </w:r>
+            <w:proofErr w:type="spellEnd"/>
+            <w:r>
+              <w:rPr>
+                <w:color w:val="85200C"/>
+                <w:sz w:val="24"/>
+                <w:szCs w:val="24"/>
+              </w:rPr>
+              <w:t xml:space="preserve"> = "</w:t>
+            </w:r>
+            <w:proofErr w:type="spellStart"/>
+            <w:r>
+              <w:rPr>
+                <w:color w:val="85200C"/>
+                <w:sz w:val="24"/>
+                <w:szCs w:val="24"/>
+              </w:rPr>
+              <w:t>customers_write_dyf</w:t>
+            </w:r>
+            <w:proofErr w:type="spellEnd"/>
+            <w:r>
+              <w:rPr>
+                <w:color w:val="85200C"/>
+                <w:sz w:val="24"/>
+                <w:szCs w:val="24"/>
+              </w:rPr>
+              <w:t>")</w:t>
             </w:r>
           </w:p>
         </w:tc>
       </w:tr>
     </w:tbl>
+    <w:p>
+      <w:pPr>
+        <w:jc w:val="both"/>
+        <w:rPr>
+          <w:color w:val="1F2328"/>
+          <w:sz w:val="24"/>
+          <w:szCs w:val="24"/>
+        </w:rPr>
+      </w:pPr>
+    </w:p>
+    <w:p>
+      <w:pPr>
+        <w:jc w:val="both"/>
+        <w:rPr>
+          <w:color w:val="1F2328"/>
+          <w:sz w:val="24"/>
+          <w:szCs w:val="24"/>
+        </w:rPr>
+      </w:pPr>
+    </w:p>
+    <w:p>
+      <w:pPr>
+        <w:jc w:val="both"/>
+        <w:rPr>
+          <w:b/>
+          <w:bCs/>
+          <w:color w:val="1F2328"/>
+          <w:sz w:val="24"/>
+          <w:szCs w:val="24"/>
+        </w:rPr>
+      </w:pPr>
+      <w:r>
+        <w:rPr>
+          <w:b/>
+          <w:bCs/>
+          <w:color w:val="1F2328"/>
+          <w:sz w:val="24"/>
+          <w:szCs w:val="24"/>
+        </w:rPr>
+        <w:t>Overall Summary</w:t>
+      </w:r>
+    </w:p>
+    <w:p>
+      <w:pPr>
+        <w:jc w:val="both"/>
+        <w:rPr>
+          <w:color w:val="1F2328"/>
+          <w:sz w:val="24"/>
+          <w:szCs w:val="24"/>
+        </w:rPr>
+      </w:pPr>
+    </w:p>
+    <w:p>
+      <w:pPr>
+        <w:jc w:val="both"/>
+        <w:rPr>
+          <w:color w:val="1F2328"/>
+          <w:sz w:val="24"/>
+          <w:szCs w:val="24"/>
+          <w:lang w:val="en-US"/>
+        </w:rPr>
+      </w:pPr>
+      <w:r>
+        <w:rPr>
+          <w:color w:val="1F2328"/>
+          <w:sz w:val="24"/>
+          <w:szCs w:val="24"/>
+          <w:lang w:val="en-US"/>
+        </w:rPr>
+        <w:t xml:space="preserve">This document explains how to use AWS Glue, Amazon S3, and </w:t>
+      </w:r>
+      <w:proofErr w:type="spellStart"/>
+      <w:r>
+        <w:rPr>
+          <w:color w:val="1F2328"/>
+          <w:sz w:val="24"/>
+          <w:szCs w:val="24"/>
+          <w:lang w:val="en-US"/>
+        </w:rPr>
+        <w:t>PySpark</w:t>
+      </w:r>
+      <w:proofErr w:type="spellEnd"/>
+      <w:r>
+        <w:rPr>
+          <w:color w:val="1F2328"/>
+          <w:sz w:val="24"/>
+          <w:szCs w:val="24"/>
+          <w:lang w:val="en-US"/>
+        </w:rPr>
+        <w:t xml:space="preserve"> to perform ETL operations on customer and order data. First, data is uploaded to S3, and AWS Glue Crawlers create tables in the Glue Data Catalog. Using Glue Notebooks, data is read into </w:t>
+      </w:r>
+      <w:proofErr w:type="spellStart"/>
+      <w:r>
+        <w:rPr>
+          <w:color w:val="1F2328"/>
+          <w:sz w:val="24"/>
+          <w:szCs w:val="24"/>
+          <w:lang w:val="en-US"/>
+        </w:rPr>
+        <w:t>DynamicFrames</w:t>
+      </w:r>
+      <w:proofErr w:type="spellEnd"/>
+      <w:r>
+        <w:rPr>
+          <w:color w:val="1F2328"/>
+          <w:sz w:val="24"/>
+          <w:szCs w:val="24"/>
+          <w:lang w:val="en-US"/>
+        </w:rPr>
+        <w:t xml:space="preserve"> to inspect schemas, count records, select, drop, rename, filter, and join data.</w:t>
+      </w:r>
+    </w:p>
+    <w:p>
+      <w:pPr>
+        <w:jc w:val="both"/>
+        <w:rPr>
+          <w:color w:val="1F2328"/>
+          <w:sz w:val="24"/>
+          <w:szCs w:val="24"/>
+          <w:lang w:val="en-US"/>
+        </w:rPr>
+      </w:pPr>
+      <w:r>
+        <w:rPr>
+          <w:color w:val="1F2328"/>
+          <w:sz w:val="24"/>
+          <w:szCs w:val="24"/>
+          <w:lang w:val="en-US"/>
+        </w:rPr>
+        <w:t xml:space="preserve">The document also covers converting </w:t>
+      </w:r>
+      <w:proofErr w:type="spellStart"/>
+      <w:r>
+        <w:rPr>
+          <w:color w:val="1F2328"/>
+          <w:sz w:val="24"/>
+          <w:szCs w:val="24"/>
+          <w:lang w:val="en-US"/>
+        </w:rPr>
+        <w:t>DynamicFrames</w:t>
+      </w:r>
+      <w:proofErr w:type="spellEnd"/>
+      <w:r>
+        <w:rPr>
+          <w:color w:val="1F2328"/>
+          <w:sz w:val="24"/>
+          <w:szCs w:val="24"/>
+          <w:lang w:val="en-US"/>
+        </w:rPr>
+        <w:t xml:space="preserve"> into Spark </w:t>
+      </w:r>
+      <w:proofErr w:type="spellStart"/>
+      <w:r>
+        <w:rPr>
+          <w:color w:val="1F2328"/>
+          <w:sz w:val="24"/>
+          <w:szCs w:val="24"/>
+          <w:lang w:val="en-US"/>
+        </w:rPr>
+        <w:t>DataFrames</w:t>
+      </w:r>
+      <w:proofErr w:type="spellEnd"/>
+      <w:r>
+        <w:rPr>
+          <w:color w:val="1F2328"/>
+          <w:sz w:val="24"/>
+          <w:szCs w:val="24"/>
+          <w:lang w:val="en-US"/>
+        </w:rPr>
+        <w:t xml:space="preserve"> to perform </w:t>
+      </w:r>
+      <w:proofErr w:type="spellStart"/>
+      <w:r>
+        <w:rPr>
+          <w:color w:val="1F2328"/>
+          <w:sz w:val="24"/>
+          <w:szCs w:val="24"/>
+          <w:lang w:val="en-US"/>
+        </w:rPr>
+        <w:t>PySpark</w:t>
+      </w:r>
+      <w:proofErr w:type="spellEnd"/>
+      <w:r>
+        <w:rPr>
+          <w:color w:val="1F2328"/>
+          <w:sz w:val="24"/>
+          <w:szCs w:val="24"/>
+          <w:lang w:val="en-US"/>
+        </w:rPr>
+        <w:t xml:space="preserve"> operations such as adding columns, concatenating strings, grouping, filtering, and joining datasets using inner and left joins. Finally, the processed data is converted back into </w:t>
+      </w:r>
+      <w:proofErr w:type="spellStart"/>
+      <w:r>
+        <w:rPr>
+          <w:color w:val="1F2328"/>
+          <w:sz w:val="24"/>
+          <w:szCs w:val="24"/>
+          <w:lang w:val="en-US"/>
+        </w:rPr>
+        <w:t>DynamicFrames</w:t>
+      </w:r>
+      <w:proofErr w:type="spellEnd"/>
+      <w:r>
+        <w:rPr>
+          <w:color w:val="1F2328"/>
+          <w:sz w:val="24"/>
+          <w:szCs w:val="24"/>
+          <w:lang w:val="en-US"/>
+        </w:rPr>
+        <w:t xml:space="preserve"> and written to S3 or Glue Catalog tables.</w:t>
+      </w:r>
+    </w:p>
+    <w:p>
+      <w:pPr>
+        <w:jc w:val="both"/>
+        <w:rPr>
+          <w:color w:val="1F2328"/>
+          <w:sz w:val="24"/>
+          <w:szCs w:val="24"/>
+          <w:lang w:val="en-US"/>
+        </w:rPr>
+      </w:pPr>
+      <w:r>
+        <w:rPr>
+          <w:color w:val="1F2328"/>
+          <w:sz w:val="24"/>
+          <w:szCs w:val="24"/>
+          <w:lang w:val="en-US"/>
+        </w:rPr>
+        <w:t xml:space="preserve">In conclusion, this practice demonstrates an end-to-end AWS data processing workflow, from storing raw data in S3 to transforming and joining datasets with AWS Glue and </w:t>
+      </w:r>
+      <w:proofErr w:type="spellStart"/>
+      <w:proofErr w:type="gramStart"/>
+      <w:r>
+        <w:rPr>
+          <w:color w:val="1F2328"/>
+          <w:sz w:val="24"/>
+          <w:szCs w:val="24"/>
+          <w:lang w:val="en-US"/>
+        </w:rPr>
+        <w:t>PySpark</w:t>
+      </w:r>
+      <w:proofErr w:type="spellEnd"/>
+      <w:r>
+        <w:rPr>
+          <w:color w:val="1F2328"/>
+          <w:sz w:val="24"/>
+          <w:szCs w:val="24"/>
+          <w:lang w:val="en-US"/>
+        </w:rPr>
+        <w:t>, and</w:t>
+      </w:r>
+      <w:proofErr w:type="gramEnd"/>
+      <w:r>
+        <w:rPr>
+          <w:color w:val="1F2328"/>
+          <w:sz w:val="24"/>
+          <w:szCs w:val="24"/>
+          <w:lang w:val="en-US"/>
+        </w:rPr>
+        <w:t xml:space="preserve"> saving the processed results for further analysis.</w:t>
+      </w:r>
+    </w:p>
     <w:p>
       <w:pPr>
         <w:jc w:val="both"/>
@@ -6738,7 +9263,6 @@
   <w:style w:type="character" w:default="1" w:styleId="DefaultParagraphFont">
     <w:name w:val="Default Paragraph Font"/>
     <w:uiPriority w:val="1"/>
-    <w:semiHidden/>
     <w:unhideWhenUsed/>
   </w:style>
   <w:style w:type="table" w:default="1" w:styleId="TableNormal">

</xml_diff>

<commit_message>
How Glue concept work together with S3
</commit_message>
<xml_diff>
--- a/New folder/Upload data on S3 & Creating Glue tables.docx
+++ b/New folder/Upload data on S3 & Creating Glue tables.docx
@@ -3100,6 +3100,70 @@
           <w:szCs w:val="24"/>
         </w:rPr>
       </w:pPr>
+    </w:p>
+    <w:p>
+      <w:pPr>
+        <w:jc w:val="both"/>
+        <w:rPr>
+          <w:color w:val="1F2328"/>
+          <w:sz w:val="24"/>
+          <w:szCs w:val="24"/>
+        </w:rPr>
+      </w:pPr>
+    </w:p>
+    <w:p>
+      <w:pPr>
+        <w:jc w:val="both"/>
+        <w:rPr>
+          <w:color w:val="1F2328"/>
+          <w:sz w:val="24"/>
+          <w:szCs w:val="24"/>
+        </w:rPr>
+      </w:pPr>
+    </w:p>
+    <w:p>
+      <w:pPr>
+        <w:jc w:val="both"/>
+        <w:rPr>
+          <w:color w:val="1F2328"/>
+          <w:sz w:val="24"/>
+          <w:szCs w:val="24"/>
+        </w:rPr>
+      </w:pPr>
+      <w:r>
+        <w:rPr>
+          <w:color w:val="1F2328"/>
+          <w:sz w:val="24"/>
+          <w:szCs w:val="24"/>
+        </w:rPr>
+        <w:t xml:space="preserve">1. </w:t>
+      </w:r>
+      <w:r>
+        <w:rPr>
+          <w:color w:val="1F2328"/>
+          <w:sz w:val="24"/>
+          <w:szCs w:val="24"/>
+        </w:rPr>
+        <w:t>How Glue concept work together with S3</w:t>
+      </w:r>
+    </w:p>
+    <w:p>
+      <w:pPr>
+        <w:jc w:val="both"/>
+        <w:rPr>
+          <w:color w:val="1F2328"/>
+          <w:sz w:val="24"/>
+          <w:szCs w:val="24"/>
+        </w:rPr>
+      </w:pPr>
+      <w:r>
+        <w:rPr>
+          <w:color w:val="1F2328"/>
+          <w:sz w:val="24"/>
+          <w:szCs w:val="24"/>
+        </w:rPr>
+        <w:t>This documentation introduces AWS Glue, the Glue Data Catalog, Crawlers, DynamicFrames, and Spark DataFrames for building ETL (Extract, Transform, Load) pipelines. AWS Glue is a serverless data integration service that helps discover, prepare, transform, and move data. In this project, orders, employee, and customer files are uploaded to Amazon S3, and Glue Crawlers scan the data to identify its schema and create table metadata in the Glue Data Catalog. A DynamicFrame then allows us to read and transform cataloged data, including selecting or dropping fields, renaming columns, filtering records, joining datasets, and writing results to S3 or catalog tables. DynamicFrames are particularly useful in Glue because they can handle inconsistencies in data types, while Spark DataFrames provide a familiar tabular structure for more advanced PySpark transformations.</w:t>
+      </w:r>
     </w:p>
     <w:p>
       <w:pPr>

</xml_diff>

<commit_message>
AWS Glue's True Purpose section added
</commit_message>
<xml_diff>
--- a/New folder/Upload data on S3 & Creating Glue tables.docx
+++ b/New folder/Upload data on S3 & Creating Glue tables.docx
@@ -119,26 +119,100 @@
                 <w:sz w:val="24"/>
                 <w:szCs w:val="24"/>
               </w:rPr>
-              <w:t># Read from the customers table in the glue data catalog using a dynamic frame</w:t>
-            </w:r>
-          </w:p>
-          <w:p>
-            <w:pPr>
-              <w:jc w:val="both"/>
-              <w:rPr>
-                <w:color w:val="85200C"/>
-                <w:sz w:val="24"/>
-                <w:szCs w:val="24"/>
-              </w:rPr>
-            </w:pPr>
-            <w:r>
-              <w:rPr>
-                <w:color w:val="85200C"/>
-                <w:sz w:val="24"/>
-                <w:szCs w:val="24"/>
-              </w:rPr>
-              <w:t>dynamicFrameCustomers = glueContext.create_dynamic_frame.from_catalog(</w:t>
-            </w:r>
+              <w:t xml:space="preserve"># Read from the customers table in the glue data </w:t>
+            </w:r>
+            <w:proofErr w:type="spellStart"/>
+            <w:r>
+              <w:rPr>
+                <w:color w:val="85200C"/>
+                <w:sz w:val="24"/>
+                <w:szCs w:val="24"/>
+              </w:rPr>
+              <w:t>catalog</w:t>
+            </w:r>
+            <w:proofErr w:type="spellEnd"/>
+            <w:r>
+              <w:rPr>
+                <w:color w:val="85200C"/>
+                <w:sz w:val="24"/>
+                <w:szCs w:val="24"/>
+              </w:rPr>
+              <w:t xml:space="preserve"> using a dynamic frame</w:t>
+            </w:r>
+          </w:p>
+          <w:p>
+            <w:pPr>
+              <w:jc w:val="both"/>
+              <w:rPr>
+                <w:color w:val="85200C"/>
+                <w:sz w:val="24"/>
+                <w:szCs w:val="24"/>
+              </w:rPr>
+            </w:pPr>
+            <w:proofErr w:type="spellStart"/>
+            <w:r>
+              <w:rPr>
+                <w:color w:val="85200C"/>
+                <w:sz w:val="24"/>
+                <w:szCs w:val="24"/>
+              </w:rPr>
+              <w:t>dynamicFrameCustomers</w:t>
+            </w:r>
+            <w:proofErr w:type="spellEnd"/>
+            <w:r>
+              <w:rPr>
+                <w:color w:val="85200C"/>
+                <w:sz w:val="24"/>
+                <w:szCs w:val="24"/>
+              </w:rPr>
+              <w:t xml:space="preserve"> = </w:t>
+            </w:r>
+            <w:proofErr w:type="spellStart"/>
+            <w:r>
+              <w:rPr>
+                <w:color w:val="85200C"/>
+                <w:sz w:val="24"/>
+                <w:szCs w:val="24"/>
+              </w:rPr>
+              <w:t>glueContext.create_dynamic_</w:t>
+            </w:r>
+            <w:proofErr w:type="gramStart"/>
+            <w:r>
+              <w:rPr>
+                <w:color w:val="85200C"/>
+                <w:sz w:val="24"/>
+                <w:szCs w:val="24"/>
+              </w:rPr>
+              <w:t>frame.from</w:t>
+            </w:r>
+            <w:proofErr w:type="gramEnd"/>
+            <w:r>
+              <w:rPr>
+                <w:color w:val="85200C"/>
+                <w:sz w:val="24"/>
+                <w:szCs w:val="24"/>
+              </w:rPr>
+              <w:t>_</w:t>
+            </w:r>
+            <w:proofErr w:type="gramStart"/>
+            <w:r>
+              <w:rPr>
+                <w:color w:val="85200C"/>
+                <w:sz w:val="24"/>
+                <w:szCs w:val="24"/>
+              </w:rPr>
+              <w:t>catalog</w:t>
+            </w:r>
+            <w:proofErr w:type="spellEnd"/>
+            <w:r>
+              <w:rPr>
+                <w:color w:val="85200C"/>
+                <w:sz w:val="24"/>
+                <w:szCs w:val="24"/>
+              </w:rPr>
+              <w:t>(</w:t>
+            </w:r>
+            <w:proofErr w:type="gramEnd"/>
           </w:p>
           <w:p>
             <w:pPr>
@@ -167,13 +241,23 @@
                 <w:szCs w:val="24"/>
               </w:rPr>
             </w:pPr>
-            <w:r>
-              <w:rPr>
-                <w:color w:val="85200C"/>
-                <w:sz w:val="24"/>
-                <w:szCs w:val="24"/>
-              </w:rPr>
-              <w:t>table_name = "customers"</w:t>
+            <w:proofErr w:type="spellStart"/>
+            <w:r>
+              <w:rPr>
+                <w:color w:val="85200C"/>
+                <w:sz w:val="24"/>
+                <w:szCs w:val="24"/>
+              </w:rPr>
+              <w:t>table_name</w:t>
+            </w:r>
+            <w:proofErr w:type="spellEnd"/>
+            <w:r>
+              <w:rPr>
+                <w:color w:val="85200C"/>
+                <w:sz w:val="24"/>
+                <w:szCs w:val="24"/>
+              </w:rPr>
+              <w:t xml:space="preserve"> = "customers"</w:t>
             </w:r>
           </w:p>
           <w:p>
@@ -219,25 +303,45 @@
                 <w:sz w:val="24"/>
                 <w:szCs w:val="24"/>
               </w:rPr>
-              <w:t># Show the top 10 rows from the dynamic dataframe</w:t>
-            </w:r>
-          </w:p>
-          <w:p>
-            <w:pPr>
-              <w:jc w:val="both"/>
-              <w:rPr>
-                <w:color w:val="85200C"/>
-                <w:sz w:val="24"/>
-                <w:szCs w:val="24"/>
-              </w:rPr>
-            </w:pPr>
-            <w:r>
-              <w:rPr>
-                <w:color w:val="85200C"/>
-                <w:sz w:val="24"/>
-                <w:szCs w:val="24"/>
-              </w:rPr>
-              <w:t>dynamicFrameCustomers.show(10)</w:t>
+              <w:t xml:space="preserve"># Show the top 10 rows from the dynamic </w:t>
+            </w:r>
+            <w:proofErr w:type="spellStart"/>
+            <w:r>
+              <w:rPr>
+                <w:color w:val="85200C"/>
+                <w:sz w:val="24"/>
+                <w:szCs w:val="24"/>
+              </w:rPr>
+              <w:t>dataframe</w:t>
+            </w:r>
+            <w:proofErr w:type="spellEnd"/>
+          </w:p>
+          <w:p>
+            <w:pPr>
+              <w:jc w:val="both"/>
+              <w:rPr>
+                <w:color w:val="85200C"/>
+                <w:sz w:val="24"/>
+                <w:szCs w:val="24"/>
+              </w:rPr>
+            </w:pPr>
+            <w:proofErr w:type="spellStart"/>
+            <w:r>
+              <w:rPr>
+                <w:color w:val="85200C"/>
+                <w:sz w:val="24"/>
+                <w:szCs w:val="24"/>
+              </w:rPr>
+              <w:t>dynamicFrameCustomers.show</w:t>
+            </w:r>
+            <w:proofErr w:type="spellEnd"/>
+            <w:r>
+              <w:rPr>
+                <w:color w:val="85200C"/>
+                <w:sz w:val="24"/>
+                <w:szCs w:val="24"/>
+              </w:rPr>
+              <w:t>(10)</w:t>
             </w:r>
           </w:p>
           <w:p>
@@ -358,13 +462,23 @@
                 <w:szCs w:val="24"/>
               </w:rPr>
             </w:pPr>
-            <w:r>
-              <w:rPr>
-                <w:color w:val="85200C"/>
-                <w:sz w:val="24"/>
-                <w:szCs w:val="24"/>
-              </w:rPr>
-              <w:t>dynamicFrameCustomers.printSchema()</w:t>
+            <w:proofErr w:type="spellStart"/>
+            <w:r>
+              <w:rPr>
+                <w:color w:val="85200C"/>
+                <w:sz w:val="24"/>
+                <w:szCs w:val="24"/>
+              </w:rPr>
+              <w:t>dynamicFrameCustomers.printSchema</w:t>
+            </w:r>
+            <w:proofErr w:type="spellEnd"/>
+            <w:r>
+              <w:rPr>
+                <w:color w:val="85200C"/>
+                <w:sz w:val="24"/>
+                <w:szCs w:val="24"/>
+              </w:rPr>
+              <w:t>()</w:t>
             </w:r>
           </w:p>
         </w:tc>
@@ -398,8 +512,19 @@
           <w:sz w:val="24"/>
           <w:szCs w:val="24"/>
         </w:rPr>
-        <w:t>Count The Number of Rows in a Dynamic DataFrame</w:t>
-      </w:r>
+        <w:t xml:space="preserve">Count The Number of Rows in a Dynamic </w:t>
+      </w:r>
+      <w:proofErr w:type="spellStart"/>
+      <w:r>
+        <w:rPr>
+          <w:b/>
+          <w:color w:val="1F2328"/>
+          <w:sz w:val="24"/>
+          <w:szCs w:val="24"/>
+        </w:rPr>
+        <w:t>DataFrame</w:t>
+      </w:r>
+      <w:proofErr w:type="spellEnd"/>
       <w:r>
         <w:rPr>
           <w:color w:val="1F2328"/>
@@ -453,25 +578,53 @@
                 <w:sz w:val="24"/>
                 <w:szCs w:val="24"/>
               </w:rPr>
-              <w:t xml:space="preserve"># Count The Number of Rows in a Dynamic Dataframe </w:t>
-            </w:r>
-          </w:p>
-          <w:p>
-            <w:pPr>
-              <w:jc w:val="both"/>
-              <w:rPr>
-                <w:color w:val="85200C"/>
-                <w:sz w:val="24"/>
-                <w:szCs w:val="24"/>
-              </w:rPr>
-            </w:pPr>
-            <w:r>
-              <w:rPr>
-                <w:color w:val="85200C"/>
-                <w:sz w:val="24"/>
-                <w:szCs w:val="24"/>
-              </w:rPr>
-              <w:t>dynamicFrameCustomers.count()</w:t>
+              <w:t xml:space="preserve"># Count The Number of Rows in a Dynamic </w:t>
+            </w:r>
+            <w:proofErr w:type="spellStart"/>
+            <w:r>
+              <w:rPr>
+                <w:color w:val="85200C"/>
+                <w:sz w:val="24"/>
+                <w:szCs w:val="24"/>
+              </w:rPr>
+              <w:t>Dataframe</w:t>
+            </w:r>
+            <w:proofErr w:type="spellEnd"/>
+            <w:r>
+              <w:rPr>
+                <w:color w:val="85200C"/>
+                <w:sz w:val="24"/>
+                <w:szCs w:val="24"/>
+              </w:rPr>
+              <w:t xml:space="preserve"> </w:t>
+            </w:r>
+          </w:p>
+          <w:p>
+            <w:pPr>
+              <w:jc w:val="both"/>
+              <w:rPr>
+                <w:color w:val="85200C"/>
+                <w:sz w:val="24"/>
+                <w:szCs w:val="24"/>
+              </w:rPr>
+            </w:pPr>
+            <w:proofErr w:type="spellStart"/>
+            <w:r>
+              <w:rPr>
+                <w:color w:val="85200C"/>
+                <w:sz w:val="24"/>
+                <w:szCs w:val="24"/>
+              </w:rPr>
+              <w:t>dynamicFrameCustomers.count</w:t>
+            </w:r>
+            <w:proofErr w:type="spellEnd"/>
+            <w:r>
+              <w:rPr>
+                <w:color w:val="85200C"/>
+                <w:sz w:val="24"/>
+                <w:szCs w:val="24"/>
+              </w:rPr>
+              <w:t>()</w:t>
             </w:r>
           </w:p>
           <w:p>
@@ -522,7 +675,47 @@
           <w:sz w:val="24"/>
           <w:szCs w:val="24"/>
         </w:rPr>
-        <w:t>Select Fields From A Dynamic frame</w:t>
+        <w:t xml:space="preserve">Select Fields </w:t>
+      </w:r>
+      <w:proofErr w:type="gramStart"/>
+      <w:r>
+        <w:rPr>
+          <w:b/>
+          <w:color w:val="1F2328"/>
+          <w:sz w:val="24"/>
+          <w:szCs w:val="24"/>
+        </w:rPr>
+        <w:t>From</w:t>
+      </w:r>
+      <w:proofErr w:type="gramEnd"/>
+      <w:r>
+        <w:rPr>
+          <w:b/>
+          <w:color w:val="1F2328"/>
+          <w:sz w:val="24"/>
+          <w:szCs w:val="24"/>
+        </w:rPr>
+        <w:t xml:space="preserve"> </w:t>
+      </w:r>
+      <w:proofErr w:type="gramStart"/>
+      <w:r>
+        <w:rPr>
+          <w:b/>
+          <w:color w:val="1F2328"/>
+          <w:sz w:val="24"/>
+          <w:szCs w:val="24"/>
+        </w:rPr>
+        <w:t>A</w:t>
+      </w:r>
+      <w:proofErr w:type="gramEnd"/>
+      <w:r>
+        <w:rPr>
+          <w:b/>
+          <w:color w:val="1F2328"/>
+          <w:sz w:val="24"/>
+          <w:szCs w:val="24"/>
+        </w:rPr>
+        <w:t xml:space="preserve"> Dynamic frame</w:t>
       </w:r>
       <w:r>
         <w:rPr>
@@ -577,25 +770,117 @@
                 <w:sz w:val="24"/>
                 <w:szCs w:val="24"/>
               </w:rPr>
-              <w:t># Selecting certain fields from a Dynamic DataFrame</w:t>
-            </w:r>
-          </w:p>
-          <w:p>
-            <w:pPr>
-              <w:jc w:val="both"/>
-              <w:rPr>
-                <w:color w:val="85200C"/>
-                <w:sz w:val="24"/>
-                <w:szCs w:val="24"/>
-              </w:rPr>
-            </w:pPr>
-            <w:r>
-              <w:rPr>
-                <w:color w:val="85200C"/>
-                <w:sz w:val="24"/>
-                <w:szCs w:val="24"/>
-              </w:rPr>
-              <w:t>dyfCustomerSelectFields = dynamicFrameCustomers.select_fields(["customerid", "fullname"])</w:t>
+              <w:t xml:space="preserve"># Selecting certain fields from a Dynamic </w:t>
+            </w:r>
+            <w:proofErr w:type="spellStart"/>
+            <w:r>
+              <w:rPr>
+                <w:color w:val="85200C"/>
+                <w:sz w:val="24"/>
+                <w:szCs w:val="24"/>
+              </w:rPr>
+              <w:t>DataFrame</w:t>
+            </w:r>
+            <w:proofErr w:type="spellEnd"/>
+          </w:p>
+          <w:p>
+            <w:pPr>
+              <w:jc w:val="both"/>
+              <w:rPr>
+                <w:color w:val="85200C"/>
+                <w:sz w:val="24"/>
+                <w:szCs w:val="24"/>
+              </w:rPr>
+            </w:pPr>
+            <w:proofErr w:type="spellStart"/>
+            <w:r>
+              <w:rPr>
+                <w:color w:val="85200C"/>
+                <w:sz w:val="24"/>
+                <w:szCs w:val="24"/>
+              </w:rPr>
+              <w:t>dyfCustomerSelectFields</w:t>
+            </w:r>
+            <w:proofErr w:type="spellEnd"/>
+            <w:r>
+              <w:rPr>
+                <w:color w:val="85200C"/>
+                <w:sz w:val="24"/>
+                <w:szCs w:val="24"/>
+              </w:rPr>
+              <w:t xml:space="preserve"> = </w:t>
+            </w:r>
+            <w:proofErr w:type="spellStart"/>
+            <w:r>
+              <w:rPr>
+                <w:color w:val="85200C"/>
+                <w:sz w:val="24"/>
+                <w:szCs w:val="24"/>
+              </w:rPr>
+              <w:t>dynamicFrameCustomers.select_</w:t>
+            </w:r>
+            <w:proofErr w:type="gramStart"/>
+            <w:r>
+              <w:rPr>
+                <w:color w:val="85200C"/>
+                <w:sz w:val="24"/>
+                <w:szCs w:val="24"/>
+              </w:rPr>
+              <w:t>fields</w:t>
+            </w:r>
+            <w:proofErr w:type="spellEnd"/>
+            <w:r>
+              <w:rPr>
+                <w:color w:val="85200C"/>
+                <w:sz w:val="24"/>
+                <w:szCs w:val="24"/>
+              </w:rPr>
+              <w:t>(</w:t>
+            </w:r>
+            <w:proofErr w:type="gramEnd"/>
+            <w:r>
+              <w:rPr>
+                <w:color w:val="85200C"/>
+                <w:sz w:val="24"/>
+                <w:szCs w:val="24"/>
+              </w:rPr>
+              <w:t>["</w:t>
+            </w:r>
+            <w:proofErr w:type="spellStart"/>
+            <w:r>
+              <w:rPr>
+                <w:color w:val="85200C"/>
+                <w:sz w:val="24"/>
+                <w:szCs w:val="24"/>
+              </w:rPr>
+              <w:t>customerid</w:t>
+            </w:r>
+            <w:proofErr w:type="spellEnd"/>
+            <w:r>
+              <w:rPr>
+                <w:color w:val="85200C"/>
+                <w:sz w:val="24"/>
+                <w:szCs w:val="24"/>
+              </w:rPr>
+              <w:t>", "</w:t>
+            </w:r>
+            <w:proofErr w:type="spellStart"/>
+            <w:r>
+              <w:rPr>
+                <w:color w:val="85200C"/>
+                <w:sz w:val="24"/>
+                <w:szCs w:val="24"/>
+              </w:rPr>
+              <w:t>fullname</w:t>
+            </w:r>
+            <w:proofErr w:type="spellEnd"/>
+            <w:r>
+              <w:rPr>
+                <w:color w:val="85200C"/>
+                <w:sz w:val="24"/>
+                <w:szCs w:val="24"/>
+              </w:rPr>
+              <w:t>"])</w:t>
             </w:r>
           </w:p>
           <w:p>
@@ -635,13 +920,23 @@
                 <w:szCs w:val="24"/>
               </w:rPr>
             </w:pPr>
-            <w:r>
-              <w:rPr>
-                <w:color w:val="85200C"/>
-                <w:sz w:val="24"/>
-                <w:szCs w:val="24"/>
-              </w:rPr>
-              <w:t>dyfCustomerSelectFields.show(10)</w:t>
+            <w:proofErr w:type="spellStart"/>
+            <w:r>
+              <w:rPr>
+                <w:color w:val="85200C"/>
+                <w:sz w:val="24"/>
+                <w:szCs w:val="24"/>
+              </w:rPr>
+              <w:t>dyfCustomerSelectFields.show</w:t>
+            </w:r>
+            <w:proofErr w:type="spellEnd"/>
+            <w:r>
+              <w:rPr>
+                <w:color w:val="85200C"/>
+                <w:sz w:val="24"/>
+                <w:szCs w:val="24"/>
+              </w:rPr>
+              <w:t>(10)</w:t>
             </w:r>
           </w:p>
           <w:p>
@@ -760,59 +1055,151 @@
                 <w:szCs w:val="24"/>
               </w:rPr>
             </w:pPr>
-            <w:r>
-              <w:rPr>
-                <w:color w:val="85200C"/>
-                <w:sz w:val="24"/>
-                <w:szCs w:val="24"/>
-              </w:rPr>
-              <w:t>dyfCustomerDropFields = dynamicFrameCustomers.drop_fields(["firstname","lastname"])</w:t>
-            </w:r>
-          </w:p>
-          <w:p>
-            <w:pPr>
-              <w:jc w:val="both"/>
-              <w:rPr>
-                <w:color w:val="85200C"/>
-                <w:sz w:val="24"/>
-                <w:szCs w:val="24"/>
-              </w:rPr>
-            </w:pPr>
-          </w:p>
-          <w:p>
-            <w:pPr>
-              <w:jc w:val="both"/>
-              <w:rPr>
-                <w:color w:val="85200C"/>
-                <w:sz w:val="24"/>
-                <w:szCs w:val="24"/>
-              </w:rPr>
-            </w:pPr>
-            <w:r>
-              <w:rPr>
-                <w:color w:val="85200C"/>
-                <w:sz w:val="24"/>
-                <w:szCs w:val="24"/>
-              </w:rPr>
-              <w:t># Show Top 10 rows of dyfCustomerDropFields Dynamic Frame</w:t>
-            </w:r>
-          </w:p>
-          <w:p>
-            <w:pPr>
-              <w:jc w:val="both"/>
-              <w:rPr>
-                <w:color w:val="85200C"/>
-                <w:sz w:val="24"/>
-                <w:szCs w:val="24"/>
-              </w:rPr>
-            </w:pPr>
-            <w:r>
-              <w:rPr>
-                <w:color w:val="85200C"/>
-                <w:sz w:val="24"/>
-                <w:szCs w:val="24"/>
-              </w:rPr>
-              <w:t>dyfCustomerDropFields.show(10)</w:t>
+            <w:proofErr w:type="spellStart"/>
+            <w:r>
+              <w:rPr>
+                <w:color w:val="85200C"/>
+                <w:sz w:val="24"/>
+                <w:szCs w:val="24"/>
+              </w:rPr>
+              <w:t>dyfCustomerDropFields</w:t>
+            </w:r>
+            <w:proofErr w:type="spellEnd"/>
+            <w:r>
+              <w:rPr>
+                <w:color w:val="85200C"/>
+                <w:sz w:val="24"/>
+                <w:szCs w:val="24"/>
+              </w:rPr>
+              <w:t xml:space="preserve"> = </w:t>
+            </w:r>
+            <w:proofErr w:type="spellStart"/>
+            <w:r>
+              <w:rPr>
+                <w:color w:val="85200C"/>
+                <w:sz w:val="24"/>
+                <w:szCs w:val="24"/>
+              </w:rPr>
+              <w:t>dynamicFrameCustomers.drop_fields</w:t>
+            </w:r>
+            <w:proofErr w:type="spellEnd"/>
+            <w:r>
+              <w:rPr>
+                <w:color w:val="85200C"/>
+                <w:sz w:val="24"/>
+                <w:szCs w:val="24"/>
+              </w:rPr>
+              <w:t>(["</w:t>
+            </w:r>
+            <w:proofErr w:type="spellStart"/>
+            <w:r>
+              <w:rPr>
+                <w:color w:val="85200C"/>
+                <w:sz w:val="24"/>
+                <w:szCs w:val="24"/>
+              </w:rPr>
+              <w:t>firstname</w:t>
+            </w:r>
+            <w:proofErr w:type="spellEnd"/>
+            <w:r>
+              <w:rPr>
+                <w:color w:val="85200C"/>
+                <w:sz w:val="24"/>
+                <w:szCs w:val="24"/>
+              </w:rPr>
+              <w:t>","</w:t>
+            </w:r>
+            <w:proofErr w:type="spellStart"/>
+            <w:r>
+              <w:rPr>
+                <w:color w:val="85200C"/>
+                <w:sz w:val="24"/>
+                <w:szCs w:val="24"/>
+              </w:rPr>
+              <w:t>lastname</w:t>
+            </w:r>
+            <w:proofErr w:type="spellEnd"/>
+            <w:r>
+              <w:rPr>
+                <w:color w:val="85200C"/>
+                <w:sz w:val="24"/>
+                <w:szCs w:val="24"/>
+              </w:rPr>
+              <w:t>"])</w:t>
+            </w:r>
+          </w:p>
+          <w:p>
+            <w:pPr>
+              <w:jc w:val="both"/>
+              <w:rPr>
+                <w:color w:val="85200C"/>
+                <w:sz w:val="24"/>
+                <w:szCs w:val="24"/>
+              </w:rPr>
+            </w:pPr>
+          </w:p>
+          <w:p>
+            <w:pPr>
+              <w:jc w:val="both"/>
+              <w:rPr>
+                <w:color w:val="85200C"/>
+                <w:sz w:val="24"/>
+                <w:szCs w:val="24"/>
+              </w:rPr>
+            </w:pPr>
+            <w:r>
+              <w:rPr>
+                <w:color w:val="85200C"/>
+                <w:sz w:val="24"/>
+                <w:szCs w:val="24"/>
+              </w:rPr>
+              <w:t xml:space="preserve"># Show Top 10 rows of </w:t>
+            </w:r>
+            <w:proofErr w:type="spellStart"/>
+            <w:r>
+              <w:rPr>
+                <w:color w:val="85200C"/>
+                <w:sz w:val="24"/>
+                <w:szCs w:val="24"/>
+              </w:rPr>
+              <w:t>dyfCustomerDropFields</w:t>
+            </w:r>
+            <w:proofErr w:type="spellEnd"/>
+            <w:r>
+              <w:rPr>
+                <w:color w:val="85200C"/>
+                <w:sz w:val="24"/>
+                <w:szCs w:val="24"/>
+              </w:rPr>
+              <w:t xml:space="preserve"> Dynamic Frame</w:t>
+            </w:r>
+          </w:p>
+          <w:p>
+            <w:pPr>
+              <w:jc w:val="both"/>
+              <w:rPr>
+                <w:color w:val="85200C"/>
+                <w:sz w:val="24"/>
+                <w:szCs w:val="24"/>
+              </w:rPr>
+            </w:pPr>
+            <w:proofErr w:type="spellStart"/>
+            <w:r>
+              <w:rPr>
+                <w:color w:val="85200C"/>
+                <w:sz w:val="24"/>
+                <w:szCs w:val="24"/>
+              </w:rPr>
+              <w:t>dyfCustomerDropFields.show</w:t>
+            </w:r>
+            <w:proofErr w:type="spellEnd"/>
+            <w:r>
+              <w:rPr>
+                <w:color w:val="85200C"/>
+                <w:sz w:val="24"/>
+                <w:szCs w:val="24"/>
+              </w:rPr>
+              <w:t>(10)</w:t>
             </w:r>
           </w:p>
         </w:tc>
@@ -899,89 +1286,279 @@
                 <w:sz w:val="24"/>
                 <w:szCs w:val="24"/>
               </w:rPr>
-              <w:t># Mapping array for column rename fullname -&gt; name</w:t>
-            </w:r>
-          </w:p>
-          <w:p>
-            <w:pPr>
-              <w:jc w:val="both"/>
-              <w:rPr>
-                <w:color w:val="85200C"/>
-                <w:sz w:val="24"/>
-                <w:szCs w:val="24"/>
-              </w:rPr>
-            </w:pPr>
-            <w:r>
-              <w:rPr>
-                <w:color w:val="85200C"/>
-                <w:sz w:val="24"/>
-                <w:szCs w:val="24"/>
-              </w:rPr>
-              <w:t>mapping=[("customerid", "string", "customerid","string"),("fullname", "string", "name", "string")]</w:t>
-            </w:r>
-          </w:p>
-          <w:p>
-            <w:pPr>
-              <w:jc w:val="both"/>
-              <w:rPr>
-                <w:color w:val="85200C"/>
-                <w:sz w:val="24"/>
-                <w:szCs w:val="24"/>
-              </w:rPr>
-            </w:pPr>
-          </w:p>
-          <w:p>
-            <w:pPr>
-              <w:jc w:val="both"/>
-              <w:rPr>
-                <w:color w:val="85200C"/>
-                <w:sz w:val="24"/>
-                <w:szCs w:val="24"/>
-              </w:rPr>
-            </w:pPr>
-            <w:r>
-              <w:rPr>
-                <w:color w:val="85200C"/>
-                <w:sz w:val="24"/>
-                <w:szCs w:val="24"/>
-              </w:rPr>
-              <w:t># Apply the mapping to rename fullname -&gt; name</w:t>
-            </w:r>
-          </w:p>
-          <w:p>
-            <w:pPr>
-              <w:jc w:val="both"/>
-              <w:rPr>
-                <w:color w:val="85200C"/>
-                <w:sz w:val="24"/>
-                <w:szCs w:val="24"/>
-              </w:rPr>
-            </w:pPr>
-            <w:r>
-              <w:rPr>
-                <w:color w:val="85200C"/>
-                <w:sz w:val="24"/>
-                <w:szCs w:val="24"/>
-              </w:rPr>
-              <w:t>dfyMapping = ApplyMapping.apply(</w:t>
-            </w:r>
-          </w:p>
-          <w:p>
-            <w:pPr>
-              <w:jc w:val="both"/>
-              <w:rPr>
-                <w:color w:val="85200C"/>
-                <w:sz w:val="24"/>
-                <w:szCs w:val="24"/>
-              </w:rPr>
-            </w:pPr>
-            <w:r>
-              <w:rPr>
-                <w:color w:val="85200C"/>
-                <w:sz w:val="24"/>
-                <w:szCs w:val="24"/>
-              </w:rPr>
-              <w:t xml:space="preserve">                                frame = dyfCustomerDropFields, </w:t>
+              <w:t xml:space="preserve"># Mapping array for column </w:t>
+            </w:r>
+            <w:proofErr w:type="gramStart"/>
+            <w:r>
+              <w:rPr>
+                <w:color w:val="85200C"/>
+                <w:sz w:val="24"/>
+                <w:szCs w:val="24"/>
+              </w:rPr>
+              <w:t>rename</w:t>
+            </w:r>
+            <w:proofErr w:type="gramEnd"/>
+            <w:r>
+              <w:rPr>
+                <w:color w:val="85200C"/>
+                <w:sz w:val="24"/>
+                <w:szCs w:val="24"/>
+              </w:rPr>
+              <w:t xml:space="preserve"> </w:t>
+            </w:r>
+            <w:proofErr w:type="spellStart"/>
+            <w:r>
+              <w:rPr>
+                <w:color w:val="85200C"/>
+                <w:sz w:val="24"/>
+                <w:szCs w:val="24"/>
+              </w:rPr>
+              <w:t>fullname</w:t>
+            </w:r>
+            <w:proofErr w:type="spellEnd"/>
+            <w:r>
+              <w:rPr>
+                <w:color w:val="85200C"/>
+                <w:sz w:val="24"/>
+                <w:szCs w:val="24"/>
+              </w:rPr>
+              <w:t xml:space="preserve"> -&gt; name</w:t>
+            </w:r>
+          </w:p>
+          <w:p>
+            <w:pPr>
+              <w:jc w:val="both"/>
+              <w:rPr>
+                <w:color w:val="85200C"/>
+                <w:sz w:val="24"/>
+                <w:szCs w:val="24"/>
+              </w:rPr>
+            </w:pPr>
+            <w:r>
+              <w:rPr>
+                <w:color w:val="85200C"/>
+                <w:sz w:val="24"/>
+                <w:szCs w:val="24"/>
+              </w:rPr>
+              <w:t>mapping</w:t>
+            </w:r>
+            <w:proofErr w:type="gramStart"/>
+            <w:r>
+              <w:rPr>
+                <w:color w:val="85200C"/>
+                <w:sz w:val="24"/>
+                <w:szCs w:val="24"/>
+              </w:rPr>
+              <w:t>=[</w:t>
+            </w:r>
+            <w:proofErr w:type="gramEnd"/>
+            <w:r>
+              <w:rPr>
+                <w:color w:val="85200C"/>
+                <w:sz w:val="24"/>
+                <w:szCs w:val="24"/>
+              </w:rPr>
+              <w:t>("</w:t>
+            </w:r>
+            <w:proofErr w:type="spellStart"/>
+            <w:r>
+              <w:rPr>
+                <w:color w:val="85200C"/>
+                <w:sz w:val="24"/>
+                <w:szCs w:val="24"/>
+              </w:rPr>
+              <w:t>customerid</w:t>
+            </w:r>
+            <w:proofErr w:type="spellEnd"/>
+            <w:r>
+              <w:rPr>
+                <w:color w:val="85200C"/>
+                <w:sz w:val="24"/>
+                <w:szCs w:val="24"/>
+              </w:rPr>
+              <w:t>", "string", "</w:t>
+            </w:r>
+            <w:proofErr w:type="spellStart"/>
+            <w:r>
+              <w:rPr>
+                <w:color w:val="85200C"/>
+                <w:sz w:val="24"/>
+                <w:szCs w:val="24"/>
+              </w:rPr>
+              <w:t>customerid</w:t>
+            </w:r>
+            <w:proofErr w:type="spellEnd"/>
+            <w:r>
+              <w:rPr>
+                <w:color w:val="85200C"/>
+                <w:sz w:val="24"/>
+                <w:szCs w:val="24"/>
+              </w:rPr>
+              <w:t>","string"</w:t>
+            </w:r>
+            <w:proofErr w:type="gramStart"/>
+            <w:r>
+              <w:rPr>
+                <w:color w:val="85200C"/>
+                <w:sz w:val="24"/>
+                <w:szCs w:val="24"/>
+              </w:rPr>
+              <w:t>),(</w:t>
+            </w:r>
+            <w:proofErr w:type="gramEnd"/>
+            <w:r>
+              <w:rPr>
+                <w:color w:val="85200C"/>
+                <w:sz w:val="24"/>
+                <w:szCs w:val="24"/>
+              </w:rPr>
+              <w:t>"</w:t>
+            </w:r>
+            <w:proofErr w:type="spellStart"/>
+            <w:r>
+              <w:rPr>
+                <w:color w:val="85200C"/>
+                <w:sz w:val="24"/>
+                <w:szCs w:val="24"/>
+              </w:rPr>
+              <w:t>fullname</w:t>
+            </w:r>
+            <w:proofErr w:type="spellEnd"/>
+            <w:r>
+              <w:rPr>
+                <w:color w:val="85200C"/>
+                <w:sz w:val="24"/>
+                <w:szCs w:val="24"/>
+              </w:rPr>
+              <w:t>", "string", "name", "string")]</w:t>
+            </w:r>
+          </w:p>
+          <w:p>
+            <w:pPr>
+              <w:jc w:val="both"/>
+              <w:rPr>
+                <w:color w:val="85200C"/>
+                <w:sz w:val="24"/>
+                <w:szCs w:val="24"/>
+              </w:rPr>
+            </w:pPr>
+          </w:p>
+          <w:p>
+            <w:pPr>
+              <w:jc w:val="both"/>
+              <w:rPr>
+                <w:color w:val="85200C"/>
+                <w:sz w:val="24"/>
+                <w:szCs w:val="24"/>
+              </w:rPr>
+            </w:pPr>
+            <w:r>
+              <w:rPr>
+                <w:color w:val="85200C"/>
+                <w:sz w:val="24"/>
+                <w:szCs w:val="24"/>
+              </w:rPr>
+              <w:t xml:space="preserve"># Apply the mapping to rename </w:t>
+            </w:r>
+            <w:proofErr w:type="spellStart"/>
+            <w:r>
+              <w:rPr>
+                <w:color w:val="85200C"/>
+                <w:sz w:val="24"/>
+                <w:szCs w:val="24"/>
+              </w:rPr>
+              <w:t>fullname</w:t>
+            </w:r>
+            <w:proofErr w:type="spellEnd"/>
+            <w:r>
+              <w:rPr>
+                <w:color w:val="85200C"/>
+                <w:sz w:val="24"/>
+                <w:szCs w:val="24"/>
+              </w:rPr>
+              <w:t xml:space="preserve"> -&gt; name</w:t>
+            </w:r>
+          </w:p>
+          <w:p>
+            <w:pPr>
+              <w:jc w:val="both"/>
+              <w:rPr>
+                <w:color w:val="85200C"/>
+                <w:sz w:val="24"/>
+                <w:szCs w:val="24"/>
+              </w:rPr>
+            </w:pPr>
+            <w:proofErr w:type="spellStart"/>
+            <w:r>
+              <w:rPr>
+                <w:color w:val="85200C"/>
+                <w:sz w:val="24"/>
+                <w:szCs w:val="24"/>
+              </w:rPr>
+              <w:t>dfyMapping</w:t>
+            </w:r>
+            <w:proofErr w:type="spellEnd"/>
+            <w:r>
+              <w:rPr>
+                <w:color w:val="85200C"/>
+                <w:sz w:val="24"/>
+                <w:szCs w:val="24"/>
+              </w:rPr>
+              <w:t xml:space="preserve"> = </w:t>
+            </w:r>
+            <w:proofErr w:type="spellStart"/>
+            <w:r>
+              <w:rPr>
+                <w:color w:val="85200C"/>
+                <w:sz w:val="24"/>
+                <w:szCs w:val="24"/>
+              </w:rPr>
+              <w:t>ApplyMapping.apply</w:t>
+            </w:r>
+            <w:proofErr w:type="spellEnd"/>
+            <w:r>
+              <w:rPr>
+                <w:color w:val="85200C"/>
+                <w:sz w:val="24"/>
+                <w:szCs w:val="24"/>
+              </w:rPr>
+              <w:t>(</w:t>
+            </w:r>
+          </w:p>
+          <w:p>
+            <w:pPr>
+              <w:jc w:val="both"/>
+              <w:rPr>
+                <w:color w:val="85200C"/>
+                <w:sz w:val="24"/>
+                <w:szCs w:val="24"/>
+              </w:rPr>
+            </w:pPr>
+            <w:r>
+              <w:rPr>
+                <w:color w:val="85200C"/>
+                <w:sz w:val="24"/>
+                <w:szCs w:val="24"/>
+              </w:rPr>
+              <w:t xml:space="preserve">                                frame = </w:t>
+            </w:r>
+            <w:proofErr w:type="spellStart"/>
+            <w:r>
+              <w:rPr>
+                <w:color w:val="85200C"/>
+                <w:sz w:val="24"/>
+                <w:szCs w:val="24"/>
+              </w:rPr>
+              <w:t>dyfCustomerDropFields</w:t>
+            </w:r>
+            <w:proofErr w:type="spellEnd"/>
+            <w:r>
+              <w:rPr>
+                <w:color w:val="85200C"/>
+                <w:sz w:val="24"/>
+                <w:szCs w:val="24"/>
+              </w:rPr>
+              <w:t xml:space="preserve">, </w:t>
             </w:r>
           </w:p>
           <w:p>
@@ -1017,7 +1594,25 @@
                 <w:sz w:val="24"/>
                 <w:szCs w:val="24"/>
               </w:rPr>
-              <w:t xml:space="preserve">                                transformation_ctx = "applymapping1"</w:t>
+              <w:t xml:space="preserve">                                </w:t>
+            </w:r>
+            <w:proofErr w:type="spellStart"/>
+            <w:r>
+              <w:rPr>
+                <w:color w:val="85200C"/>
+                <w:sz w:val="24"/>
+                <w:szCs w:val="24"/>
+              </w:rPr>
+              <w:t>transformation_ctx</w:t>
+            </w:r>
+            <w:proofErr w:type="spellEnd"/>
+            <w:r>
+              <w:rPr>
+                <w:color w:val="85200C"/>
+                <w:sz w:val="24"/>
+                <w:szCs w:val="24"/>
+              </w:rPr>
+              <w:t xml:space="preserve"> = "applymapping1"</w:t>
             </w:r>
           </w:p>
           <w:p>
@@ -1063,25 +1658,53 @@
                 <w:sz w:val="24"/>
                 <w:szCs w:val="24"/>
               </w:rPr>
-              <w:t xml:space="preserve"># show the new dynamic frame with name column </w:t>
-            </w:r>
-          </w:p>
-          <w:p>
-            <w:pPr>
-              <w:jc w:val="both"/>
-              <w:rPr>
-                <w:color w:val="85200C"/>
-                <w:sz w:val="24"/>
-                <w:szCs w:val="24"/>
-              </w:rPr>
-            </w:pPr>
-            <w:r>
-              <w:rPr>
-                <w:color w:val="85200C"/>
-                <w:sz w:val="24"/>
-                <w:szCs w:val="24"/>
-              </w:rPr>
-              <w:t>dfyMapping.show(10)</w:t>
+              <w:t xml:space="preserve"># </w:t>
+            </w:r>
+            <w:proofErr w:type="gramStart"/>
+            <w:r>
+              <w:rPr>
+                <w:color w:val="85200C"/>
+                <w:sz w:val="24"/>
+                <w:szCs w:val="24"/>
+              </w:rPr>
+              <w:t>show</w:t>
+            </w:r>
+            <w:proofErr w:type="gramEnd"/>
+            <w:r>
+              <w:rPr>
+                <w:color w:val="85200C"/>
+                <w:sz w:val="24"/>
+                <w:szCs w:val="24"/>
+              </w:rPr>
+              <w:t xml:space="preserve"> the new dynamic frame with name column </w:t>
+            </w:r>
+          </w:p>
+          <w:p>
+            <w:pPr>
+              <w:jc w:val="both"/>
+              <w:rPr>
+                <w:color w:val="85200C"/>
+                <w:sz w:val="24"/>
+                <w:szCs w:val="24"/>
+              </w:rPr>
+            </w:pPr>
+            <w:proofErr w:type="spellStart"/>
+            <w:r>
+              <w:rPr>
+                <w:color w:val="85200C"/>
+                <w:sz w:val="24"/>
+                <w:szCs w:val="24"/>
+              </w:rPr>
+              <w:t>dfyMapping.show</w:t>
+            </w:r>
+            <w:proofErr w:type="spellEnd"/>
+            <w:r>
+              <w:rPr>
+                <w:color w:val="85200C"/>
+                <w:sz w:val="24"/>
+                <w:szCs w:val="24"/>
+              </w:rPr>
+              <w:t>(10)</w:t>
             </w:r>
           </w:p>
         </w:tc>
@@ -1181,43 +1804,127 @@
                 <w:sz w:val="24"/>
                 <w:szCs w:val="24"/>
               </w:rPr>
-              <w:t># Filter dynamicFrameCustomers for customers who have the last name Adams</w:t>
-            </w:r>
-          </w:p>
-          <w:p>
-            <w:pPr>
-              <w:jc w:val="both"/>
-              <w:rPr>
-                <w:color w:val="85200C"/>
-                <w:sz w:val="24"/>
-                <w:szCs w:val="24"/>
-              </w:rPr>
-            </w:pPr>
-            <w:r>
-              <w:rPr>
-                <w:color w:val="85200C"/>
-                <w:sz w:val="24"/>
-                <w:szCs w:val="24"/>
-              </w:rPr>
-              <w:t xml:space="preserve">dyfFilter=  Filter.apply(frame = dynamicFrameCustomers, </w:t>
-            </w:r>
-          </w:p>
-          <w:p>
-            <w:pPr>
-              <w:jc w:val="both"/>
-              <w:rPr>
-                <w:color w:val="85200C"/>
-                <w:sz w:val="24"/>
-                <w:szCs w:val="24"/>
-              </w:rPr>
-            </w:pPr>
-            <w:r>
-              <w:rPr>
-                <w:color w:val="85200C"/>
-                <w:sz w:val="24"/>
-                <w:szCs w:val="24"/>
-              </w:rPr>
-              <w:t xml:space="preserve">                                        f = lambda x: x["lastname"] in "Adams"</w:t>
+              <w:t xml:space="preserve"># Filter </w:t>
+            </w:r>
+            <w:proofErr w:type="spellStart"/>
+            <w:r>
+              <w:rPr>
+                <w:color w:val="85200C"/>
+                <w:sz w:val="24"/>
+                <w:szCs w:val="24"/>
+              </w:rPr>
+              <w:t>dynamicFrameCustomers</w:t>
+            </w:r>
+            <w:proofErr w:type="spellEnd"/>
+            <w:r>
+              <w:rPr>
+                <w:color w:val="85200C"/>
+                <w:sz w:val="24"/>
+                <w:szCs w:val="24"/>
+              </w:rPr>
+              <w:t xml:space="preserve"> for customers who have the last name Adams</w:t>
+            </w:r>
+          </w:p>
+          <w:p>
+            <w:pPr>
+              <w:jc w:val="both"/>
+              <w:rPr>
+                <w:color w:val="85200C"/>
+                <w:sz w:val="24"/>
+                <w:szCs w:val="24"/>
+              </w:rPr>
+            </w:pPr>
+            <w:proofErr w:type="spellStart"/>
+            <w:r>
+              <w:rPr>
+                <w:color w:val="85200C"/>
+                <w:sz w:val="24"/>
+                <w:szCs w:val="24"/>
+              </w:rPr>
+              <w:t>dyfFilter</w:t>
+            </w:r>
+            <w:proofErr w:type="spellEnd"/>
+            <w:proofErr w:type="gramStart"/>
+            <w:r>
+              <w:rPr>
+                <w:color w:val="85200C"/>
+                <w:sz w:val="24"/>
+                <w:szCs w:val="24"/>
+              </w:rPr>
+              <w:t xml:space="preserve">=  </w:t>
+            </w:r>
+            <w:proofErr w:type="spellStart"/>
+            <w:r>
+              <w:rPr>
+                <w:color w:val="85200C"/>
+                <w:sz w:val="24"/>
+                <w:szCs w:val="24"/>
+              </w:rPr>
+              <w:t>Filter.apply</w:t>
+            </w:r>
+            <w:proofErr w:type="spellEnd"/>
+            <w:proofErr w:type="gramEnd"/>
+            <w:r>
+              <w:rPr>
+                <w:color w:val="85200C"/>
+                <w:sz w:val="24"/>
+                <w:szCs w:val="24"/>
+              </w:rPr>
+              <w:t xml:space="preserve">(frame = </w:t>
+            </w:r>
+            <w:proofErr w:type="spellStart"/>
+            <w:r>
+              <w:rPr>
+                <w:color w:val="85200C"/>
+                <w:sz w:val="24"/>
+                <w:szCs w:val="24"/>
+              </w:rPr>
+              <w:t>dynamicFrameCustomers</w:t>
+            </w:r>
+            <w:proofErr w:type="spellEnd"/>
+            <w:r>
+              <w:rPr>
+                <w:color w:val="85200C"/>
+                <w:sz w:val="24"/>
+                <w:szCs w:val="24"/>
+              </w:rPr>
+              <w:t xml:space="preserve">, </w:t>
+            </w:r>
+          </w:p>
+          <w:p>
+            <w:pPr>
+              <w:jc w:val="both"/>
+              <w:rPr>
+                <w:color w:val="85200C"/>
+                <w:sz w:val="24"/>
+                <w:szCs w:val="24"/>
+              </w:rPr>
+            </w:pPr>
+            <w:r>
+              <w:rPr>
+                <w:color w:val="85200C"/>
+                <w:sz w:val="24"/>
+                <w:szCs w:val="24"/>
+              </w:rPr>
+              <w:t xml:space="preserve">                                        f = lambda x: x["</w:t>
+            </w:r>
+            <w:proofErr w:type="spellStart"/>
+            <w:r>
+              <w:rPr>
+                <w:color w:val="85200C"/>
+                <w:sz w:val="24"/>
+                <w:szCs w:val="24"/>
+              </w:rPr>
+              <w:t>lastname</w:t>
+            </w:r>
+            <w:proofErr w:type="spellEnd"/>
+            <w:r>
+              <w:rPr>
+                <w:color w:val="85200C"/>
+                <w:sz w:val="24"/>
+                <w:szCs w:val="24"/>
+              </w:rPr>
+              <w:t>"] in "Adams"</w:t>
             </w:r>
           </w:p>
           <w:p>
@@ -1263,25 +1970,53 @@
                 <w:sz w:val="24"/>
                 <w:szCs w:val="24"/>
               </w:rPr>
-              <w:t xml:space="preserve"># Show the top 10 customers  from the filtered Dynamic frame </w:t>
-            </w:r>
-          </w:p>
-          <w:p>
-            <w:pPr>
-              <w:jc w:val="both"/>
-              <w:rPr>
-                <w:color w:val="85200C"/>
-                <w:sz w:val="24"/>
-                <w:szCs w:val="24"/>
-              </w:rPr>
-            </w:pPr>
-            <w:r>
-              <w:rPr>
-                <w:color w:val="85200C"/>
-                <w:sz w:val="24"/>
-                <w:szCs w:val="24"/>
-              </w:rPr>
-              <w:t>dyfFilter.show(10)</w:t>
+              <w:t xml:space="preserve"># Show the top 10 </w:t>
+            </w:r>
+            <w:proofErr w:type="gramStart"/>
+            <w:r>
+              <w:rPr>
+                <w:color w:val="85200C"/>
+                <w:sz w:val="24"/>
+                <w:szCs w:val="24"/>
+              </w:rPr>
+              <w:t>customers  from</w:t>
+            </w:r>
+            <w:proofErr w:type="gramEnd"/>
+            <w:r>
+              <w:rPr>
+                <w:color w:val="85200C"/>
+                <w:sz w:val="24"/>
+                <w:szCs w:val="24"/>
+              </w:rPr>
+              <w:t xml:space="preserve"> the filtered Dynamic frame </w:t>
+            </w:r>
+          </w:p>
+          <w:p>
+            <w:pPr>
+              <w:jc w:val="both"/>
+              <w:rPr>
+                <w:color w:val="85200C"/>
+                <w:sz w:val="24"/>
+                <w:szCs w:val="24"/>
+              </w:rPr>
+            </w:pPr>
+            <w:proofErr w:type="spellStart"/>
+            <w:r>
+              <w:rPr>
+                <w:color w:val="85200C"/>
+                <w:sz w:val="24"/>
+                <w:szCs w:val="24"/>
+              </w:rPr>
+              <w:t>dyfFilter.show</w:t>
+            </w:r>
+            <w:proofErr w:type="spellEnd"/>
+            <w:r>
+              <w:rPr>
+                <w:color w:val="85200C"/>
+                <w:sz w:val="24"/>
+                <w:szCs w:val="24"/>
+              </w:rPr>
+              <w:t>(10)</w:t>
             </w:r>
           </w:p>
           <w:p>
@@ -1335,7 +2070,27 @@
           <w:sz w:val="24"/>
           <w:szCs w:val="24"/>
         </w:rPr>
-        <w:t>Join Two Dynamic frames on a equality join</w:t>
+        <w:t xml:space="preserve">Join Two Dynamic frames on </w:t>
+      </w:r>
+      <w:proofErr w:type="gramStart"/>
+      <w:r>
+        <w:rPr>
+          <w:b/>
+          <w:color w:val="1F2328"/>
+          <w:sz w:val="24"/>
+          <w:szCs w:val="24"/>
+        </w:rPr>
+        <w:t>a</w:t>
+      </w:r>
+      <w:proofErr w:type="gramEnd"/>
+      <w:r>
+        <w:rPr>
+          <w:b/>
+          <w:color w:val="1F2328"/>
+          <w:sz w:val="24"/>
+          <w:szCs w:val="24"/>
+        </w:rPr>
+        <w:t xml:space="preserve"> equality join</w:t>
       </w:r>
     </w:p>
     <w:p>
@@ -1409,26 +2164,100 @@
                 <w:szCs w:val="24"/>
               </w:rPr>
               <w:lastRenderedPageBreak/>
-              <w:t># Read from the customers table in the glue data catalog using a dynamic frame</w:t>
-            </w:r>
-          </w:p>
-          <w:p>
-            <w:pPr>
-              <w:jc w:val="both"/>
-              <w:rPr>
-                <w:color w:val="85200C"/>
-                <w:sz w:val="24"/>
-                <w:szCs w:val="24"/>
-              </w:rPr>
-            </w:pPr>
-            <w:r>
-              <w:rPr>
-                <w:color w:val="85200C"/>
-                <w:sz w:val="24"/>
-                <w:szCs w:val="24"/>
-              </w:rPr>
-              <w:t>dynamicFrameOrders = glueContext.create_dynamic_frame.from_catalog(</w:t>
-            </w:r>
+              <w:t xml:space="preserve"># Read from the customers table in the glue data </w:t>
+            </w:r>
+            <w:proofErr w:type="spellStart"/>
+            <w:r>
+              <w:rPr>
+                <w:color w:val="85200C"/>
+                <w:sz w:val="24"/>
+                <w:szCs w:val="24"/>
+              </w:rPr>
+              <w:t>catalog</w:t>
+            </w:r>
+            <w:proofErr w:type="spellEnd"/>
+            <w:r>
+              <w:rPr>
+                <w:color w:val="85200C"/>
+                <w:sz w:val="24"/>
+                <w:szCs w:val="24"/>
+              </w:rPr>
+              <w:t xml:space="preserve"> using a dynamic frame</w:t>
+            </w:r>
+          </w:p>
+          <w:p>
+            <w:pPr>
+              <w:jc w:val="both"/>
+              <w:rPr>
+                <w:color w:val="85200C"/>
+                <w:sz w:val="24"/>
+                <w:szCs w:val="24"/>
+              </w:rPr>
+            </w:pPr>
+            <w:proofErr w:type="spellStart"/>
+            <w:r>
+              <w:rPr>
+                <w:color w:val="85200C"/>
+                <w:sz w:val="24"/>
+                <w:szCs w:val="24"/>
+              </w:rPr>
+              <w:t>dynamicFrameOrders</w:t>
+            </w:r>
+            <w:proofErr w:type="spellEnd"/>
+            <w:r>
+              <w:rPr>
+                <w:color w:val="85200C"/>
+                <w:sz w:val="24"/>
+                <w:szCs w:val="24"/>
+              </w:rPr>
+              <w:t xml:space="preserve"> = </w:t>
+            </w:r>
+            <w:proofErr w:type="spellStart"/>
+            <w:r>
+              <w:rPr>
+                <w:color w:val="85200C"/>
+                <w:sz w:val="24"/>
+                <w:szCs w:val="24"/>
+              </w:rPr>
+              <w:t>glueContext.create_dynamic_</w:t>
+            </w:r>
+            <w:proofErr w:type="gramStart"/>
+            <w:r>
+              <w:rPr>
+                <w:color w:val="85200C"/>
+                <w:sz w:val="24"/>
+                <w:szCs w:val="24"/>
+              </w:rPr>
+              <w:t>frame.from</w:t>
+            </w:r>
+            <w:proofErr w:type="gramEnd"/>
+            <w:r>
+              <w:rPr>
+                <w:color w:val="85200C"/>
+                <w:sz w:val="24"/>
+                <w:szCs w:val="24"/>
+              </w:rPr>
+              <w:t>_</w:t>
+            </w:r>
+            <w:proofErr w:type="gramStart"/>
+            <w:r>
+              <w:rPr>
+                <w:color w:val="85200C"/>
+                <w:sz w:val="24"/>
+                <w:szCs w:val="24"/>
+              </w:rPr>
+              <w:t>catalog</w:t>
+            </w:r>
+            <w:proofErr w:type="spellEnd"/>
+            <w:r>
+              <w:rPr>
+                <w:color w:val="85200C"/>
+                <w:sz w:val="24"/>
+                <w:szCs w:val="24"/>
+              </w:rPr>
+              <w:t>(</w:t>
+            </w:r>
+            <w:proofErr w:type="gramEnd"/>
           </w:p>
           <w:p>
             <w:pPr>
@@ -1457,13 +2286,23 @@
                 <w:szCs w:val="24"/>
               </w:rPr>
             </w:pPr>
-            <w:r>
-              <w:rPr>
-                <w:color w:val="85200C"/>
-                <w:sz w:val="24"/>
-                <w:szCs w:val="24"/>
-              </w:rPr>
-              <w:t>table_name = "orders"</w:t>
+            <w:proofErr w:type="spellStart"/>
+            <w:r>
+              <w:rPr>
+                <w:color w:val="85200C"/>
+                <w:sz w:val="24"/>
+                <w:szCs w:val="24"/>
+              </w:rPr>
+              <w:t>table_name</w:t>
+            </w:r>
+            <w:proofErr w:type="spellEnd"/>
+            <w:r>
+              <w:rPr>
+                <w:color w:val="85200C"/>
+                <w:sz w:val="24"/>
+                <w:szCs w:val="24"/>
+              </w:rPr>
+              <w:t xml:space="preserve"> = "orders"</w:t>
             </w:r>
           </w:p>
           <w:p>
@@ -1509,25 +2348,53 @@
                 <w:sz w:val="24"/>
                 <w:szCs w:val="24"/>
               </w:rPr>
-              <w:t># show top 10 rows of orders table</w:t>
-            </w:r>
-          </w:p>
-          <w:p>
-            <w:pPr>
-              <w:jc w:val="both"/>
-              <w:rPr>
-                <w:color w:val="85200C"/>
-                <w:sz w:val="24"/>
-                <w:szCs w:val="24"/>
-              </w:rPr>
-            </w:pPr>
-            <w:r>
-              <w:rPr>
-                <w:color w:val="85200C"/>
-                <w:sz w:val="24"/>
-                <w:szCs w:val="24"/>
-              </w:rPr>
-              <w:t>dynamicFrameOrders.show(10)</w:t>
+              <w:t xml:space="preserve"># </w:t>
+            </w:r>
+            <w:proofErr w:type="gramStart"/>
+            <w:r>
+              <w:rPr>
+                <w:color w:val="85200C"/>
+                <w:sz w:val="24"/>
+                <w:szCs w:val="24"/>
+              </w:rPr>
+              <w:t>show</w:t>
+            </w:r>
+            <w:proofErr w:type="gramEnd"/>
+            <w:r>
+              <w:rPr>
+                <w:color w:val="85200C"/>
+                <w:sz w:val="24"/>
+                <w:szCs w:val="24"/>
+              </w:rPr>
+              <w:t xml:space="preserve"> top 10 rows of orders table</w:t>
+            </w:r>
+          </w:p>
+          <w:p>
+            <w:pPr>
+              <w:jc w:val="both"/>
+              <w:rPr>
+                <w:color w:val="85200C"/>
+                <w:sz w:val="24"/>
+                <w:szCs w:val="24"/>
+              </w:rPr>
+            </w:pPr>
+            <w:proofErr w:type="spellStart"/>
+            <w:r>
+              <w:rPr>
+                <w:color w:val="85200C"/>
+                <w:sz w:val="24"/>
+                <w:szCs w:val="24"/>
+              </w:rPr>
+              <w:t>dynamicFrameOrders.show</w:t>
+            </w:r>
+            <w:proofErr w:type="spellEnd"/>
+            <w:r>
+              <w:rPr>
+                <w:color w:val="85200C"/>
+                <w:sz w:val="24"/>
+                <w:szCs w:val="24"/>
+              </w:rPr>
+              <w:t>(10)</w:t>
             </w:r>
           </w:p>
           <w:p>
@@ -1645,59 +2512,135 @@
                 <w:szCs w:val="24"/>
               </w:rPr>
             </w:pPr>
+            <w:proofErr w:type="spellStart"/>
             <w:r>
               <w:rPr>
                 <w:color w:val="A61C00"/>
                 <w:sz w:val="24"/>
                 <w:szCs w:val="24"/>
               </w:rPr>
-              <w:t>dyfjoin = dynamicFrameCustomers.join(["customerid"],["customerid"],dynamicFrameOrders)</w:t>
-            </w:r>
-          </w:p>
-          <w:p>
-            <w:pPr>
-              <w:jc w:val="both"/>
+              <w:t>dyfjoin</w:t>
+            </w:r>
+            <w:proofErr w:type="spellEnd"/>
+            <w:r>
               <w:rPr>
                 <w:color w:val="A61C00"/>
                 <w:sz w:val="24"/>
                 <w:szCs w:val="24"/>
               </w:rPr>
-            </w:pPr>
-          </w:p>
-          <w:p>
-            <w:pPr>
-              <w:jc w:val="both"/>
+              <w:t xml:space="preserve"> = dynamicFrameCustomers.join(["customerid"</w:t>
+            </w:r>
+            <w:proofErr w:type="gramStart"/>
+            <w:r>
               <w:rPr>
                 <w:color w:val="A61C00"/>
                 <w:sz w:val="24"/>
                 <w:szCs w:val="24"/>
               </w:rPr>
-            </w:pPr>
+              <w:t>],[</w:t>
+            </w:r>
+            <w:proofErr w:type="gramEnd"/>
             <w:r>
               <w:rPr>
                 <w:color w:val="A61C00"/>
                 <w:sz w:val="24"/>
                 <w:szCs w:val="24"/>
               </w:rPr>
-              <w:t xml:space="preserve"># show top 10 rows for the joined dynamic </w:t>
-            </w:r>
-          </w:p>
-          <w:p>
-            <w:pPr>
-              <w:jc w:val="both"/>
+              <w:t>"customerid"</w:t>
+            </w:r>
+            <w:proofErr w:type="gramStart"/>
+            <w:r>
               <w:rPr>
                 <w:color w:val="A61C00"/>
                 <w:sz w:val="24"/>
                 <w:szCs w:val="24"/>
               </w:rPr>
-            </w:pPr>
+              <w:t>],dynamicFrameOrders</w:t>
+            </w:r>
+            <w:proofErr w:type="gramEnd"/>
             <w:r>
               <w:rPr>
                 <w:color w:val="A61C00"/>
                 <w:sz w:val="24"/>
                 <w:szCs w:val="24"/>
               </w:rPr>
-              <w:t>dyfjoin.show(10)</w:t>
+              <w:t>)</w:t>
+            </w:r>
+          </w:p>
+          <w:p>
+            <w:pPr>
+              <w:jc w:val="both"/>
+              <w:rPr>
+                <w:color w:val="A61C00"/>
+                <w:sz w:val="24"/>
+                <w:szCs w:val="24"/>
+              </w:rPr>
+            </w:pPr>
+          </w:p>
+          <w:p>
+            <w:pPr>
+              <w:jc w:val="both"/>
+              <w:rPr>
+                <w:color w:val="A61C00"/>
+                <w:sz w:val="24"/>
+                <w:szCs w:val="24"/>
+              </w:rPr>
+            </w:pPr>
+            <w:r>
+              <w:rPr>
+                <w:color w:val="A61C00"/>
+                <w:sz w:val="24"/>
+                <w:szCs w:val="24"/>
+              </w:rPr>
+              <w:t xml:space="preserve"># </w:t>
+            </w:r>
+            <w:proofErr w:type="gramStart"/>
+            <w:r>
+              <w:rPr>
+                <w:color w:val="A61C00"/>
+                <w:sz w:val="24"/>
+                <w:szCs w:val="24"/>
+              </w:rPr>
+              <w:t>show</w:t>
+            </w:r>
+            <w:proofErr w:type="gramEnd"/>
+            <w:r>
+              <w:rPr>
+                <w:color w:val="A61C00"/>
+                <w:sz w:val="24"/>
+                <w:szCs w:val="24"/>
+              </w:rPr>
+              <w:t xml:space="preserve"> top 10 rows for the joined dynamic </w:t>
+            </w:r>
+          </w:p>
+          <w:p>
+            <w:pPr>
+              <w:jc w:val="both"/>
+              <w:rPr>
+                <w:color w:val="A61C00"/>
+                <w:sz w:val="24"/>
+                <w:szCs w:val="24"/>
+              </w:rPr>
+            </w:pPr>
+            <w:proofErr w:type="spellStart"/>
+            <w:proofErr w:type="gramStart"/>
+            <w:r>
+              <w:rPr>
+                <w:color w:val="A61C00"/>
+                <w:sz w:val="24"/>
+                <w:szCs w:val="24"/>
+              </w:rPr>
+              <w:t>dyfjoin.show</w:t>
+            </w:r>
+            <w:proofErr w:type="spellEnd"/>
+            <w:proofErr w:type="gramEnd"/>
+            <w:r>
+              <w:rPr>
+                <w:color w:val="A61C00"/>
+                <w:sz w:val="24"/>
+                <w:szCs w:val="24"/>
+              </w:rPr>
+              <w:t>(10)</w:t>
             </w:r>
           </w:p>
         </w:tc>
@@ -1742,7 +2685,27 @@
           <w:sz w:val="24"/>
           <w:szCs w:val="24"/>
         </w:rPr>
-        <w:t>Write Down Data from a Dynamic Frame To S3</w:t>
+        <w:t xml:space="preserve">Write Down Data from a Dynamic Frame </w:t>
+      </w:r>
+      <w:proofErr w:type="gramStart"/>
+      <w:r>
+        <w:rPr>
+          <w:b/>
+          <w:color w:val="1F2328"/>
+          <w:sz w:val="24"/>
+          <w:szCs w:val="24"/>
+        </w:rPr>
+        <w:t>To</w:t>
+      </w:r>
+      <w:proofErr w:type="gramEnd"/>
+      <w:r>
+        <w:rPr>
+          <w:b/>
+          <w:color w:val="1F2328"/>
+          <w:sz w:val="24"/>
+          <w:szCs w:val="24"/>
+        </w:rPr>
+        <w:t xml:space="preserve"> S3</w:t>
       </w:r>
     </w:p>
     <w:p>
@@ -1760,7 +2723,25 @@
           <w:sz w:val="24"/>
           <w:szCs w:val="24"/>
         </w:rPr>
-        <w:t xml:space="preserve">Create a folder in the S3 bucket created by Cloudformation to use as a location to write the data down to </w:t>
+        <w:t xml:space="preserve">Create a folder in the S3 bucket created by </w:t>
+      </w:r>
+      <w:proofErr w:type="spellStart"/>
+      <w:r>
+        <w:rPr>
+          <w:color w:val="1F2328"/>
+          <w:sz w:val="24"/>
+          <w:szCs w:val="24"/>
+        </w:rPr>
+        <w:t>Cloudformation</w:t>
+      </w:r>
+      <w:proofErr w:type="spellEnd"/>
+      <w:r>
+        <w:rPr>
+          <w:color w:val="1F2328"/>
+          <w:sz w:val="24"/>
+          <w:szCs w:val="24"/>
+        </w:rPr>
+        <w:t xml:space="preserve"> to use as a location to write the data down to </w:t>
       </w:r>
       <w:r>
         <w:rPr>
@@ -1786,7 +2767,25 @@
           <w:sz w:val="24"/>
           <w:szCs w:val="24"/>
         </w:rPr>
-        <w:t>Write down data to S3 using the dynamic DataFrame writer class for an S3 path.</w:t>
+        <w:t xml:space="preserve">Write down data to S3 using the dynamic </w:t>
+      </w:r>
+      <w:proofErr w:type="spellStart"/>
+      <w:r>
+        <w:rPr>
+          <w:color w:val="1F2328"/>
+          <w:sz w:val="24"/>
+          <w:szCs w:val="24"/>
+        </w:rPr>
+        <w:t>DataFrame</w:t>
+      </w:r>
+      <w:proofErr w:type="spellEnd"/>
+      <w:r>
+        <w:rPr>
+          <w:color w:val="1F2328"/>
+          <w:sz w:val="24"/>
+          <w:szCs w:val="24"/>
+        </w:rPr>
+        <w:t xml:space="preserve"> writer class for an S3 path.</w:t>
       </w:r>
       <w:r>
         <w:rPr>
@@ -1841,25 +2840,25 @@
                 <w:sz w:val="24"/>
                 <w:szCs w:val="24"/>
               </w:rPr>
-              <w:t xml:space="preserve"># write down the data in a Dynamic Frame to S3 location. </w:t>
-            </w:r>
-          </w:p>
-          <w:p>
-            <w:pPr>
-              <w:jc w:val="both"/>
+              <w:t xml:space="preserve"># </w:t>
+            </w:r>
+            <w:proofErr w:type="gramStart"/>
+            <w:r>
               <w:rPr>
                 <w:color w:val="A61C00"/>
                 <w:sz w:val="24"/>
                 <w:szCs w:val="24"/>
               </w:rPr>
-            </w:pPr>
+              <w:t>write</w:t>
+            </w:r>
+            <w:proofErr w:type="gramEnd"/>
             <w:r>
               <w:rPr>
                 <w:color w:val="A61C00"/>
                 <w:sz w:val="24"/>
                 <w:szCs w:val="24"/>
               </w:rPr>
-              <w:t>glueContext.write_dynamic_frame.from_options(</w:t>
+              <w:t xml:space="preserve"> down the data in a Dynamic Frame to S3 location. </w:t>
             </w:r>
           </w:p>
           <w:p>
@@ -1871,50 +2870,52 @@
                 <w:szCs w:val="24"/>
               </w:rPr>
             </w:pPr>
+            <w:proofErr w:type="spellStart"/>
             <w:r>
               <w:rPr>
                 <w:color w:val="A61C00"/>
                 <w:sz w:val="24"/>
                 <w:szCs w:val="24"/>
               </w:rPr>
-              <w:t xml:space="preserve">                        frame = dynamicFrameCustomers,</w:t>
-            </w:r>
-          </w:p>
-          <w:p>
-            <w:pPr>
-              <w:jc w:val="both"/>
+              <w:t>glueContext.write_dynamic_</w:t>
+            </w:r>
+            <w:proofErr w:type="gramStart"/>
+            <w:r>
               <w:rPr>
                 <w:color w:val="A61C00"/>
                 <w:sz w:val="24"/>
                 <w:szCs w:val="24"/>
               </w:rPr>
-            </w:pPr>
+              <w:t>frame.from</w:t>
+            </w:r>
+            <w:proofErr w:type="gramEnd"/>
             <w:r>
               <w:rPr>
                 <w:color w:val="A61C00"/>
                 <w:sz w:val="24"/>
                 <w:szCs w:val="24"/>
               </w:rPr>
-              <w:t xml:space="preserve">                        connection_type="s3", </w:t>
-            </w:r>
-          </w:p>
-          <w:p>
-            <w:pPr>
-              <w:jc w:val="both"/>
+              <w:t>_</w:t>
+            </w:r>
+            <w:proofErr w:type="gramStart"/>
+            <w:r>
               <w:rPr>
                 <w:color w:val="A61C00"/>
                 <w:sz w:val="24"/>
                 <w:szCs w:val="24"/>
               </w:rPr>
-            </w:pPr>
+              <w:t>options</w:t>
+            </w:r>
+            <w:proofErr w:type="spellEnd"/>
             <w:r>
               <w:rPr>
                 <w:color w:val="A61C00"/>
                 <w:sz w:val="24"/>
                 <w:szCs w:val="24"/>
               </w:rPr>
-              <w:t xml:space="preserve">                        connection_options = {"path": "s3://&lt;YOUR_S£_BUCKET_NAME&gt;/write_down_dyf_to_s3"}, </w:t>
-            </w:r>
+              <w:t>(</w:t>
+            </w:r>
+            <w:proofErr w:type="gramEnd"/>
           </w:p>
           <w:p>
             <w:pPr>
@@ -1931,6 +2932,114 @@
                 <w:sz w:val="24"/>
                 <w:szCs w:val="24"/>
               </w:rPr>
+              <w:t xml:space="preserve">                        frame = </w:t>
+            </w:r>
+            <w:proofErr w:type="spellStart"/>
+            <w:r>
+              <w:rPr>
+                <w:color w:val="A61C00"/>
+                <w:sz w:val="24"/>
+                <w:szCs w:val="24"/>
+              </w:rPr>
+              <w:t>dynamicFrameCustomers</w:t>
+            </w:r>
+            <w:proofErr w:type="spellEnd"/>
+            <w:r>
+              <w:rPr>
+                <w:color w:val="A61C00"/>
+                <w:sz w:val="24"/>
+                <w:szCs w:val="24"/>
+              </w:rPr>
+              <w:t>,</w:t>
+            </w:r>
+          </w:p>
+          <w:p>
+            <w:pPr>
+              <w:jc w:val="both"/>
+              <w:rPr>
+                <w:color w:val="A61C00"/>
+                <w:sz w:val="24"/>
+                <w:szCs w:val="24"/>
+              </w:rPr>
+            </w:pPr>
+            <w:r>
+              <w:rPr>
+                <w:color w:val="A61C00"/>
+                <w:sz w:val="24"/>
+                <w:szCs w:val="24"/>
+              </w:rPr>
+              <w:t xml:space="preserve">                        </w:t>
+            </w:r>
+            <w:proofErr w:type="spellStart"/>
+            <w:r>
+              <w:rPr>
+                <w:color w:val="A61C00"/>
+                <w:sz w:val="24"/>
+                <w:szCs w:val="24"/>
+              </w:rPr>
+              <w:t>connection_type</w:t>
+            </w:r>
+            <w:proofErr w:type="spellEnd"/>
+            <w:r>
+              <w:rPr>
+                <w:color w:val="A61C00"/>
+                <w:sz w:val="24"/>
+                <w:szCs w:val="24"/>
+              </w:rPr>
+              <w:t xml:space="preserve">="s3", </w:t>
+            </w:r>
+          </w:p>
+          <w:p>
+            <w:pPr>
+              <w:jc w:val="both"/>
+              <w:rPr>
+                <w:color w:val="A61C00"/>
+                <w:sz w:val="24"/>
+                <w:szCs w:val="24"/>
+              </w:rPr>
+            </w:pPr>
+            <w:r>
+              <w:rPr>
+                <w:color w:val="A61C00"/>
+                <w:sz w:val="24"/>
+                <w:szCs w:val="24"/>
+              </w:rPr>
+              <w:t xml:space="preserve">                        </w:t>
+            </w:r>
+            <w:proofErr w:type="spellStart"/>
+            <w:r>
+              <w:rPr>
+                <w:color w:val="A61C00"/>
+                <w:sz w:val="24"/>
+                <w:szCs w:val="24"/>
+              </w:rPr>
+              <w:t>connection_options</w:t>
+            </w:r>
+            <w:proofErr w:type="spellEnd"/>
+            <w:r>
+              <w:rPr>
+                <w:color w:val="A61C00"/>
+                <w:sz w:val="24"/>
+                <w:szCs w:val="24"/>
+              </w:rPr>
+              <w:t xml:space="preserve"> = {"path": "s3://&lt;YOUR_S£_BUCKET_NAME&gt;/write_down_dyf_to_s3"}, </w:t>
+            </w:r>
+          </w:p>
+          <w:p>
+            <w:pPr>
+              <w:jc w:val="both"/>
+              <w:rPr>
+                <w:color w:val="A61C00"/>
+                <w:sz w:val="24"/>
+                <w:szCs w:val="24"/>
+              </w:rPr>
+            </w:pPr>
+            <w:r>
+              <w:rPr>
+                <w:color w:val="A61C00"/>
+                <w:sz w:val="24"/>
+                <w:szCs w:val="24"/>
+              </w:rPr>
               <w:t xml:space="preserve">                        format = "csv", </w:t>
             </w:r>
           </w:p>
@@ -1949,24 +3058,44 @@
                 <w:sz w:val="24"/>
                 <w:szCs w:val="24"/>
               </w:rPr>
-              <w:t xml:space="preserve">                        format_options={</w:t>
-            </w:r>
-          </w:p>
-          <w:p>
-            <w:pPr>
-              <w:jc w:val="both"/>
+              <w:t xml:space="preserve">                        </w:t>
+            </w:r>
+            <w:proofErr w:type="spellStart"/>
+            <w:r>
               <w:rPr>
                 <w:color w:val="A61C00"/>
                 <w:sz w:val="24"/>
                 <w:szCs w:val="24"/>
               </w:rPr>
-            </w:pPr>
+              <w:t>format_options</w:t>
+            </w:r>
+            <w:proofErr w:type="spellEnd"/>
+            <w:proofErr w:type="gramStart"/>
             <w:r>
               <w:rPr>
                 <w:color w:val="A61C00"/>
                 <w:sz w:val="24"/>
                 <w:szCs w:val="24"/>
               </w:rPr>
+              <w:t>={</w:t>
+            </w:r>
+            <w:proofErr w:type="gramEnd"/>
+          </w:p>
+          <w:p>
+            <w:pPr>
+              <w:jc w:val="both"/>
+              <w:rPr>
+                <w:color w:val="A61C00"/>
+                <w:sz w:val="24"/>
+                <w:szCs w:val="24"/>
+              </w:rPr>
+            </w:pPr>
+            <w:r>
+              <w:rPr>
+                <w:color w:val="A61C00"/>
+                <w:sz w:val="24"/>
+                <w:szCs w:val="24"/>
+              </w:rPr>
               <w:t xml:space="preserve">                            "separator": ","</w:t>
             </w:r>
           </w:p>
@@ -2003,7 +3132,25 @@
                 <w:sz w:val="24"/>
                 <w:szCs w:val="24"/>
               </w:rPr>
-              <w:t xml:space="preserve">                        transformation_ctx = "datasink2")</w:t>
+              <w:t xml:space="preserve">                        </w:t>
+            </w:r>
+            <w:proofErr w:type="spellStart"/>
+            <w:r>
+              <w:rPr>
+                <w:color w:val="A61C00"/>
+                <w:sz w:val="24"/>
+                <w:szCs w:val="24"/>
+              </w:rPr>
+              <w:t>transformation_ctx</w:t>
+            </w:r>
+            <w:proofErr w:type="spellEnd"/>
+            <w:r>
+              <w:rPr>
+                <w:color w:val="A61C00"/>
+                <w:sz w:val="24"/>
+                <w:szCs w:val="24"/>
+              </w:rPr>
+              <w:t xml:space="preserve"> = "datasink2")</w:t>
             </w:r>
           </w:p>
         </w:tc>
@@ -2046,8 +3193,19 @@
           <w:szCs w:val="24"/>
         </w:rPr>
         <w:lastRenderedPageBreak/>
-        <w:t>Write Down Data from a Dynamic Frame using Glue Data Catalog</w:t>
-      </w:r>
+        <w:t xml:space="preserve">Write Down Data from a Dynamic Frame using Glue Data </w:t>
+      </w:r>
+      <w:proofErr w:type="spellStart"/>
+      <w:r>
+        <w:rPr>
+          <w:b/>
+          <w:color w:val="1F2328"/>
+          <w:sz w:val="24"/>
+          <w:szCs w:val="24"/>
+        </w:rPr>
+        <w:t>Catalog</w:t>
+      </w:r>
+      <w:proofErr w:type="spellEnd"/>
       <w:r>
         <w:rPr>
           <w:color w:val="1F2328"/>
@@ -2101,43 +3259,171 @@
                 <w:sz w:val="24"/>
                 <w:szCs w:val="24"/>
               </w:rPr>
-              <w:t xml:space="preserve"># write data from the dynamicFrameCustomers to customers_write_dyf table using the meta data stored in the glue data catalog </w:t>
-            </w:r>
-          </w:p>
-          <w:p>
-            <w:pPr>
-              <w:jc w:val="both"/>
-              <w:rPr>
-                <w:color w:val="85200C"/>
-                <w:sz w:val="24"/>
-                <w:szCs w:val="24"/>
-              </w:rPr>
-            </w:pPr>
-            <w:r>
-              <w:rPr>
-                <w:color w:val="85200C"/>
-                <w:sz w:val="24"/>
-                <w:szCs w:val="24"/>
-              </w:rPr>
-              <w:t>glueContext.write_dynamic_frame.from_catalog(</w:t>
-            </w:r>
-          </w:p>
-          <w:p>
-            <w:pPr>
-              <w:jc w:val="both"/>
-              <w:rPr>
-                <w:color w:val="85200C"/>
-                <w:sz w:val="24"/>
-                <w:szCs w:val="24"/>
-              </w:rPr>
-            </w:pPr>
-            <w:r>
-              <w:rPr>
-                <w:color w:val="85200C"/>
-                <w:sz w:val="24"/>
-                <w:szCs w:val="24"/>
-              </w:rPr>
-              <w:t xml:space="preserve">    frame=dynamicFrameCustomers,</w:t>
+              <w:t xml:space="preserve"># </w:t>
+            </w:r>
+            <w:proofErr w:type="gramStart"/>
+            <w:r>
+              <w:rPr>
+                <w:color w:val="85200C"/>
+                <w:sz w:val="24"/>
+                <w:szCs w:val="24"/>
+              </w:rPr>
+              <w:t>write</w:t>
+            </w:r>
+            <w:proofErr w:type="gramEnd"/>
+            <w:r>
+              <w:rPr>
+                <w:color w:val="85200C"/>
+                <w:sz w:val="24"/>
+                <w:szCs w:val="24"/>
+              </w:rPr>
+              <w:t xml:space="preserve"> data from the </w:t>
+            </w:r>
+            <w:proofErr w:type="spellStart"/>
+            <w:r>
+              <w:rPr>
+                <w:color w:val="85200C"/>
+                <w:sz w:val="24"/>
+                <w:szCs w:val="24"/>
+              </w:rPr>
+              <w:t>dynamicFrameCustomers</w:t>
+            </w:r>
+            <w:proofErr w:type="spellEnd"/>
+            <w:r>
+              <w:rPr>
+                <w:color w:val="85200C"/>
+                <w:sz w:val="24"/>
+                <w:szCs w:val="24"/>
+              </w:rPr>
+              <w:t xml:space="preserve"> to </w:t>
+            </w:r>
+            <w:proofErr w:type="spellStart"/>
+            <w:r>
+              <w:rPr>
+                <w:color w:val="85200C"/>
+                <w:sz w:val="24"/>
+                <w:szCs w:val="24"/>
+              </w:rPr>
+              <w:t>customers_write_dyf</w:t>
+            </w:r>
+            <w:proofErr w:type="spellEnd"/>
+            <w:r>
+              <w:rPr>
+                <w:color w:val="85200C"/>
+                <w:sz w:val="24"/>
+                <w:szCs w:val="24"/>
+              </w:rPr>
+              <w:t xml:space="preserve"> table using the meta data stored in the glue data </w:t>
+            </w:r>
+            <w:proofErr w:type="spellStart"/>
+            <w:r>
+              <w:rPr>
+                <w:color w:val="85200C"/>
+                <w:sz w:val="24"/>
+                <w:szCs w:val="24"/>
+              </w:rPr>
+              <w:t>catalog</w:t>
+            </w:r>
+            <w:proofErr w:type="spellEnd"/>
+            <w:r>
+              <w:rPr>
+                <w:color w:val="85200C"/>
+                <w:sz w:val="24"/>
+                <w:szCs w:val="24"/>
+              </w:rPr>
+              <w:t xml:space="preserve"> </w:t>
+            </w:r>
+          </w:p>
+          <w:p>
+            <w:pPr>
+              <w:jc w:val="both"/>
+              <w:rPr>
+                <w:color w:val="85200C"/>
+                <w:sz w:val="24"/>
+                <w:szCs w:val="24"/>
+              </w:rPr>
+            </w:pPr>
+            <w:proofErr w:type="spellStart"/>
+            <w:r>
+              <w:rPr>
+                <w:color w:val="85200C"/>
+                <w:sz w:val="24"/>
+                <w:szCs w:val="24"/>
+              </w:rPr>
+              <w:t>glueContext.write_dynamic_</w:t>
+            </w:r>
+            <w:proofErr w:type="gramStart"/>
+            <w:r>
+              <w:rPr>
+                <w:color w:val="85200C"/>
+                <w:sz w:val="24"/>
+                <w:szCs w:val="24"/>
+              </w:rPr>
+              <w:t>frame.from</w:t>
+            </w:r>
+            <w:proofErr w:type="gramEnd"/>
+            <w:r>
+              <w:rPr>
+                <w:color w:val="85200C"/>
+                <w:sz w:val="24"/>
+                <w:szCs w:val="24"/>
+              </w:rPr>
+              <w:t>_</w:t>
+            </w:r>
+            <w:proofErr w:type="gramStart"/>
+            <w:r>
+              <w:rPr>
+                <w:color w:val="85200C"/>
+                <w:sz w:val="24"/>
+                <w:szCs w:val="24"/>
+              </w:rPr>
+              <w:t>catalog</w:t>
+            </w:r>
+            <w:proofErr w:type="spellEnd"/>
+            <w:r>
+              <w:rPr>
+                <w:color w:val="85200C"/>
+                <w:sz w:val="24"/>
+                <w:szCs w:val="24"/>
+              </w:rPr>
+              <w:t>(</w:t>
+            </w:r>
+            <w:proofErr w:type="gramEnd"/>
+          </w:p>
+          <w:p>
+            <w:pPr>
+              <w:jc w:val="both"/>
+              <w:rPr>
+                <w:color w:val="85200C"/>
+                <w:sz w:val="24"/>
+                <w:szCs w:val="24"/>
+              </w:rPr>
+            </w:pPr>
+            <w:r>
+              <w:rPr>
+                <w:color w:val="85200C"/>
+                <w:sz w:val="24"/>
+                <w:szCs w:val="24"/>
+              </w:rPr>
+              <w:t xml:space="preserve">    frame=</w:t>
+            </w:r>
+            <w:proofErr w:type="spellStart"/>
+            <w:r>
+              <w:rPr>
+                <w:color w:val="85200C"/>
+                <w:sz w:val="24"/>
+                <w:szCs w:val="24"/>
+              </w:rPr>
+              <w:t>dynamicFrameCustomers</w:t>
+            </w:r>
+            <w:proofErr w:type="spellEnd"/>
+            <w:r>
+              <w:rPr>
+                <w:color w:val="85200C"/>
+                <w:sz w:val="24"/>
+                <w:szCs w:val="24"/>
+              </w:rPr>
+              <w:t>,</w:t>
             </w:r>
           </w:p>
           <w:p>
@@ -2173,7 +3459,25 @@
                 <w:sz w:val="24"/>
                 <w:szCs w:val="24"/>
               </w:rPr>
-              <w:t xml:space="preserve">    table_name = "customers"</w:t>
+              <w:t xml:space="preserve">    </w:t>
+            </w:r>
+            <w:proofErr w:type="spellStart"/>
+            <w:r>
+              <w:rPr>
+                <w:color w:val="85200C"/>
+                <w:sz w:val="24"/>
+                <w:szCs w:val="24"/>
+              </w:rPr>
+              <w:t>table_name</w:t>
+            </w:r>
+            <w:proofErr w:type="spellEnd"/>
+            <w:r>
+              <w:rPr>
+                <w:color w:val="85200C"/>
+                <w:sz w:val="24"/>
+                <w:szCs w:val="24"/>
+              </w:rPr>
+              <w:t xml:space="preserve"> = "customers"</w:t>
             </w:r>
           </w:p>
           <w:p>
@@ -2236,8 +3540,39 @@
           <w:sz w:val="24"/>
           <w:szCs w:val="24"/>
         </w:rPr>
-        <w:t>Convert from Dynamic Frame To Spark DataFrame</w:t>
-      </w:r>
+        <w:t xml:space="preserve">Convert from Dynamic Frame </w:t>
+      </w:r>
+      <w:proofErr w:type="gramStart"/>
+      <w:r>
+        <w:rPr>
+          <w:b/>
+          <w:color w:val="1F2328"/>
+          <w:sz w:val="24"/>
+          <w:szCs w:val="24"/>
+        </w:rPr>
+        <w:t>To</w:t>
+      </w:r>
+      <w:proofErr w:type="gramEnd"/>
+      <w:r>
+        <w:rPr>
+          <w:b/>
+          <w:color w:val="1F2328"/>
+          <w:sz w:val="24"/>
+          <w:szCs w:val="24"/>
+        </w:rPr>
+        <w:t xml:space="preserve"> Spark </w:t>
+      </w:r>
+      <w:proofErr w:type="spellStart"/>
+      <w:r>
+        <w:rPr>
+          <w:b/>
+          <w:color w:val="1F2328"/>
+          <w:sz w:val="24"/>
+          <w:szCs w:val="24"/>
+        </w:rPr>
+        <w:t>DataFrame</w:t>
+      </w:r>
+      <w:proofErr w:type="spellEnd"/>
       <w:r>
         <w:rPr>
           <w:color w:val="1F2328"/>
@@ -2291,25 +3626,71 @@
                 <w:sz w:val="24"/>
                 <w:szCs w:val="24"/>
               </w:rPr>
-              <w:t xml:space="preserve"># Dynamic Frame to Spark DataFrame </w:t>
-            </w:r>
-          </w:p>
-          <w:p>
-            <w:pPr>
-              <w:jc w:val="both"/>
-              <w:rPr>
-                <w:color w:val="85200C"/>
-                <w:sz w:val="24"/>
-                <w:szCs w:val="24"/>
-              </w:rPr>
-            </w:pPr>
-            <w:r>
-              <w:rPr>
-                <w:color w:val="85200C"/>
-                <w:sz w:val="24"/>
-                <w:szCs w:val="24"/>
-              </w:rPr>
-              <w:t>sparkDf = dynamicFrameCustomers.toDF()</w:t>
+              <w:t xml:space="preserve"># Dynamic Frame to Spark </w:t>
+            </w:r>
+            <w:proofErr w:type="spellStart"/>
+            <w:r>
+              <w:rPr>
+                <w:color w:val="85200C"/>
+                <w:sz w:val="24"/>
+                <w:szCs w:val="24"/>
+              </w:rPr>
+              <w:t>DataFrame</w:t>
+            </w:r>
+            <w:proofErr w:type="spellEnd"/>
+            <w:r>
+              <w:rPr>
+                <w:color w:val="85200C"/>
+                <w:sz w:val="24"/>
+                <w:szCs w:val="24"/>
+              </w:rPr>
+              <w:t xml:space="preserve"> </w:t>
+            </w:r>
+          </w:p>
+          <w:p>
+            <w:pPr>
+              <w:jc w:val="both"/>
+              <w:rPr>
+                <w:color w:val="85200C"/>
+                <w:sz w:val="24"/>
+                <w:szCs w:val="24"/>
+              </w:rPr>
+            </w:pPr>
+            <w:proofErr w:type="spellStart"/>
+            <w:r>
+              <w:rPr>
+                <w:color w:val="85200C"/>
+                <w:sz w:val="24"/>
+                <w:szCs w:val="24"/>
+              </w:rPr>
+              <w:t>sparkDf</w:t>
+            </w:r>
+            <w:proofErr w:type="spellEnd"/>
+            <w:r>
+              <w:rPr>
+                <w:color w:val="85200C"/>
+                <w:sz w:val="24"/>
+                <w:szCs w:val="24"/>
+              </w:rPr>
+              <w:t xml:space="preserve"> = </w:t>
+            </w:r>
+            <w:proofErr w:type="spellStart"/>
+            <w:r>
+              <w:rPr>
+                <w:color w:val="85200C"/>
+                <w:sz w:val="24"/>
+                <w:szCs w:val="24"/>
+              </w:rPr>
+              <w:t>dynamicFrameCustomers.toDF</w:t>
+            </w:r>
+            <w:proofErr w:type="spellEnd"/>
+            <w:r>
+              <w:rPr>
+                <w:color w:val="85200C"/>
+                <w:sz w:val="24"/>
+                <w:szCs w:val="24"/>
+              </w:rPr>
+              <w:t>()</w:t>
             </w:r>
           </w:p>
           <w:p>
@@ -2349,13 +3730,23 @@
                 <w:szCs w:val="24"/>
               </w:rPr>
             </w:pPr>
-            <w:r>
-              <w:rPr>
-                <w:color w:val="85200C"/>
-                <w:sz w:val="24"/>
-                <w:szCs w:val="24"/>
-              </w:rPr>
-              <w:t>sparkDf.show()</w:t>
+            <w:proofErr w:type="spellStart"/>
+            <w:r>
+              <w:rPr>
+                <w:color w:val="85200C"/>
+                <w:sz w:val="24"/>
+                <w:szCs w:val="24"/>
+              </w:rPr>
+              <w:t>sparkDf.show</w:t>
+            </w:r>
+            <w:proofErr w:type="spellEnd"/>
+            <w:r>
+              <w:rPr>
+                <w:color w:val="85200C"/>
+                <w:sz w:val="24"/>
+                <w:szCs w:val="24"/>
+              </w:rPr>
+              <w:t>()</w:t>
             </w:r>
           </w:p>
         </w:tc>
@@ -2400,8 +3791,39 @@
           <w:sz w:val="24"/>
           <w:szCs w:val="24"/>
         </w:rPr>
-        <w:t>Selecting Columns In a Spark DataFrame</w:t>
-      </w:r>
+        <w:t xml:space="preserve">Selecting Columns </w:t>
+      </w:r>
+      <w:proofErr w:type="gramStart"/>
+      <w:r>
+        <w:rPr>
+          <w:b/>
+          <w:color w:val="1F2328"/>
+          <w:sz w:val="24"/>
+          <w:szCs w:val="24"/>
+        </w:rPr>
+        <w:t>In</w:t>
+      </w:r>
+      <w:proofErr w:type="gramEnd"/>
+      <w:r>
+        <w:rPr>
+          <w:b/>
+          <w:color w:val="1F2328"/>
+          <w:sz w:val="24"/>
+          <w:szCs w:val="24"/>
+        </w:rPr>
+        <w:t xml:space="preserve"> a Spark </w:t>
+      </w:r>
+      <w:proofErr w:type="spellStart"/>
+      <w:r>
+        <w:rPr>
+          <w:b/>
+          <w:color w:val="1F2328"/>
+          <w:sz w:val="24"/>
+          <w:szCs w:val="24"/>
+        </w:rPr>
+        <w:t>DataFrame</w:t>
+      </w:r>
+      <w:proofErr w:type="spellEnd"/>
       <w:r>
         <w:rPr>
           <w:color w:val="1F2328"/>
@@ -2455,25 +3877,99 @@
                 <w:sz w:val="24"/>
                 <w:szCs w:val="24"/>
               </w:rPr>
-              <w:t># Select columns from spark dataframe</w:t>
-            </w:r>
-          </w:p>
-          <w:p>
-            <w:pPr>
-              <w:jc w:val="both"/>
-              <w:rPr>
-                <w:color w:val="85200C"/>
-                <w:sz w:val="24"/>
-                <w:szCs w:val="24"/>
-              </w:rPr>
-            </w:pPr>
-            <w:r>
-              <w:rPr>
-                <w:color w:val="85200C"/>
-                <w:sz w:val="24"/>
-                <w:szCs w:val="24"/>
-              </w:rPr>
-              <w:t>dfSelect = sparkDf.select("customerid","fullname")</w:t>
+              <w:t xml:space="preserve"># Select columns from spark </w:t>
+            </w:r>
+            <w:proofErr w:type="spellStart"/>
+            <w:r>
+              <w:rPr>
+                <w:color w:val="85200C"/>
+                <w:sz w:val="24"/>
+                <w:szCs w:val="24"/>
+              </w:rPr>
+              <w:t>dataframe</w:t>
+            </w:r>
+            <w:proofErr w:type="spellEnd"/>
+          </w:p>
+          <w:p>
+            <w:pPr>
+              <w:jc w:val="both"/>
+              <w:rPr>
+                <w:color w:val="85200C"/>
+                <w:sz w:val="24"/>
+                <w:szCs w:val="24"/>
+              </w:rPr>
+            </w:pPr>
+            <w:proofErr w:type="spellStart"/>
+            <w:r>
+              <w:rPr>
+                <w:color w:val="85200C"/>
+                <w:sz w:val="24"/>
+                <w:szCs w:val="24"/>
+              </w:rPr>
+              <w:t>dfSelect</w:t>
+            </w:r>
+            <w:proofErr w:type="spellEnd"/>
+            <w:r>
+              <w:rPr>
+                <w:color w:val="85200C"/>
+                <w:sz w:val="24"/>
+                <w:szCs w:val="24"/>
+              </w:rPr>
+              <w:t xml:space="preserve"> = </w:t>
+            </w:r>
+            <w:proofErr w:type="spellStart"/>
+            <w:r>
+              <w:rPr>
+                <w:color w:val="85200C"/>
+                <w:sz w:val="24"/>
+                <w:szCs w:val="24"/>
+              </w:rPr>
+              <w:t>sparkDf.select</w:t>
+            </w:r>
+            <w:proofErr w:type="spellEnd"/>
+            <w:r>
+              <w:rPr>
+                <w:color w:val="85200C"/>
+                <w:sz w:val="24"/>
+                <w:szCs w:val="24"/>
+              </w:rPr>
+              <w:t>("</w:t>
+            </w:r>
+            <w:proofErr w:type="spellStart"/>
+            <w:r>
+              <w:rPr>
+                <w:color w:val="85200C"/>
+                <w:sz w:val="24"/>
+                <w:szCs w:val="24"/>
+              </w:rPr>
+              <w:t>customerid</w:t>
+            </w:r>
+            <w:proofErr w:type="spellEnd"/>
+            <w:r>
+              <w:rPr>
+                <w:color w:val="85200C"/>
+                <w:sz w:val="24"/>
+                <w:szCs w:val="24"/>
+              </w:rPr>
+              <w:t>","</w:t>
+            </w:r>
+            <w:proofErr w:type="spellStart"/>
+            <w:r>
+              <w:rPr>
+                <w:color w:val="85200C"/>
+                <w:sz w:val="24"/>
+                <w:szCs w:val="24"/>
+              </w:rPr>
+              <w:t>fullname</w:t>
+            </w:r>
+            <w:proofErr w:type="spellEnd"/>
+            <w:r>
+              <w:rPr>
+                <w:color w:val="85200C"/>
+                <w:sz w:val="24"/>
+                <w:szCs w:val="24"/>
+              </w:rPr>
+              <w:t>")</w:t>
             </w:r>
           </w:p>
           <w:p>
@@ -2513,13 +4009,23 @@
                 <w:szCs w:val="24"/>
               </w:rPr>
             </w:pPr>
-            <w:r>
-              <w:rPr>
-                <w:color w:val="85200C"/>
-                <w:sz w:val="24"/>
-                <w:szCs w:val="24"/>
-              </w:rPr>
-              <w:t>dfSelect.show()</w:t>
+            <w:proofErr w:type="spellStart"/>
+            <w:r>
+              <w:rPr>
+                <w:color w:val="85200C"/>
+                <w:sz w:val="24"/>
+                <w:szCs w:val="24"/>
+              </w:rPr>
+              <w:t>dfSelect.show</w:t>
+            </w:r>
+            <w:proofErr w:type="spellEnd"/>
+            <w:r>
+              <w:rPr>
+                <w:color w:val="85200C"/>
+                <w:sz w:val="24"/>
+                <w:szCs w:val="24"/>
+              </w:rPr>
+              <w:t>()</w:t>
             </w:r>
           </w:p>
         </w:tc>
@@ -2554,8 +4060,59 @@
           <w:sz w:val="24"/>
           <w:szCs w:val="24"/>
         </w:rPr>
-        <w:t>Add Columns In A Spark Dataframe</w:t>
-      </w:r>
+        <w:t xml:space="preserve">Add Columns </w:t>
+      </w:r>
+      <w:proofErr w:type="gramStart"/>
+      <w:r>
+        <w:rPr>
+          <w:b/>
+          <w:color w:val="1F2328"/>
+          <w:sz w:val="24"/>
+          <w:szCs w:val="24"/>
+        </w:rPr>
+        <w:t>In</w:t>
+      </w:r>
+      <w:proofErr w:type="gramEnd"/>
+      <w:r>
+        <w:rPr>
+          <w:b/>
+          <w:color w:val="1F2328"/>
+          <w:sz w:val="24"/>
+          <w:szCs w:val="24"/>
+        </w:rPr>
+        <w:t xml:space="preserve"> </w:t>
+      </w:r>
+      <w:proofErr w:type="gramStart"/>
+      <w:r>
+        <w:rPr>
+          <w:b/>
+          <w:color w:val="1F2328"/>
+          <w:sz w:val="24"/>
+          <w:szCs w:val="24"/>
+        </w:rPr>
+        <w:t>A</w:t>
+      </w:r>
+      <w:proofErr w:type="gramEnd"/>
+      <w:r>
+        <w:rPr>
+          <w:b/>
+          <w:color w:val="1F2328"/>
+          <w:sz w:val="24"/>
+          <w:szCs w:val="24"/>
+        </w:rPr>
+        <w:t xml:space="preserve"> Spark </w:t>
+      </w:r>
+      <w:proofErr w:type="spellStart"/>
+      <w:r>
+        <w:rPr>
+          <w:b/>
+          <w:color w:val="1F2328"/>
+          <w:sz w:val="24"/>
+          <w:szCs w:val="24"/>
+        </w:rPr>
+        <w:t>Dataframe</w:t>
+      </w:r>
+      <w:proofErr w:type="spellEnd"/>
     </w:p>
     <w:p>
       <w:pPr>
@@ -2627,110 +4184,231 @@
                 <w:sz w:val="24"/>
                 <w:szCs w:val="24"/>
               </w:rPr>
-              <w:t xml:space="preserve">#import lit from sql functions </w:t>
-            </w:r>
-          </w:p>
-          <w:p>
-            <w:pPr>
-              <w:jc w:val="both"/>
-              <w:rPr>
-                <w:color w:val="85200C"/>
-                <w:sz w:val="24"/>
-                <w:szCs w:val="24"/>
-              </w:rPr>
-            </w:pPr>
-            <w:r>
-              <w:rPr>
-                <w:color w:val="85200C"/>
-                <w:sz w:val="24"/>
-                <w:szCs w:val="24"/>
-              </w:rPr>
-              <w:t>from  pyspark.sql.functions import lit</w:t>
-            </w:r>
-          </w:p>
-          <w:p>
-            <w:pPr>
-              <w:jc w:val="both"/>
-              <w:rPr>
-                <w:color w:val="85200C"/>
-                <w:sz w:val="24"/>
-                <w:szCs w:val="24"/>
-              </w:rPr>
-            </w:pPr>
-          </w:p>
-          <w:p>
-            <w:pPr>
-              <w:jc w:val="both"/>
-              <w:rPr>
-                <w:color w:val="85200C"/>
-                <w:sz w:val="24"/>
-                <w:szCs w:val="24"/>
-              </w:rPr>
-            </w:pPr>
-            <w:r>
-              <w:rPr>
-                <w:color w:val="85200C"/>
-                <w:sz w:val="24"/>
-                <w:szCs w:val="24"/>
-              </w:rPr>
-              <w:t># Add new column to spark dataframe</w:t>
-            </w:r>
-          </w:p>
-          <w:p>
-            <w:pPr>
-              <w:jc w:val="both"/>
-              <w:rPr>
-                <w:color w:val="85200C"/>
-                <w:sz w:val="24"/>
-                <w:szCs w:val="24"/>
-              </w:rPr>
-            </w:pPr>
-            <w:r>
-              <w:rPr>
-                <w:color w:val="85200C"/>
-                <w:sz w:val="24"/>
-                <w:szCs w:val="24"/>
-              </w:rPr>
-              <w:t>dfNewColumn = sparkDf.withColumn("date", lit("2022-07-24"))</w:t>
-            </w:r>
-          </w:p>
-          <w:p>
-            <w:pPr>
-              <w:jc w:val="both"/>
-              <w:rPr>
-                <w:color w:val="85200C"/>
-                <w:sz w:val="24"/>
-                <w:szCs w:val="24"/>
-              </w:rPr>
-            </w:pPr>
-          </w:p>
-          <w:p>
-            <w:pPr>
-              <w:jc w:val="both"/>
-              <w:rPr>
-                <w:color w:val="85200C"/>
-                <w:sz w:val="24"/>
-                <w:szCs w:val="24"/>
-              </w:rPr>
-            </w:pPr>
-            <w:r>
-              <w:rPr>
-                <w:color w:val="85200C"/>
-                <w:sz w:val="24"/>
-                <w:szCs w:val="24"/>
-              </w:rPr>
-              <w:t># show df with new column</w:t>
-            </w:r>
-          </w:p>
-          <w:p>
-            <w:pPr>
-              <w:jc w:val="both"/>
-              <w:rPr>
-                <w:color w:val="85200C"/>
-                <w:sz w:val="24"/>
-                <w:szCs w:val="24"/>
-              </w:rPr>
-            </w:pPr>
+              <w:t xml:space="preserve">#import lit from </w:t>
+            </w:r>
+            <w:proofErr w:type="spellStart"/>
+            <w:r>
+              <w:rPr>
+                <w:color w:val="85200C"/>
+                <w:sz w:val="24"/>
+                <w:szCs w:val="24"/>
+              </w:rPr>
+              <w:t>sql</w:t>
+            </w:r>
+            <w:proofErr w:type="spellEnd"/>
+            <w:r>
+              <w:rPr>
+                <w:color w:val="85200C"/>
+                <w:sz w:val="24"/>
+                <w:szCs w:val="24"/>
+              </w:rPr>
+              <w:t xml:space="preserve"> functions </w:t>
+            </w:r>
+          </w:p>
+          <w:p>
+            <w:pPr>
+              <w:jc w:val="both"/>
+              <w:rPr>
+                <w:color w:val="85200C"/>
+                <w:sz w:val="24"/>
+                <w:szCs w:val="24"/>
+              </w:rPr>
+            </w:pPr>
+            <w:proofErr w:type="gramStart"/>
+            <w:r>
+              <w:rPr>
+                <w:color w:val="85200C"/>
+                <w:sz w:val="24"/>
+                <w:szCs w:val="24"/>
+              </w:rPr>
+              <w:t xml:space="preserve">from  </w:t>
+            </w:r>
+            <w:proofErr w:type="spellStart"/>
+            <w:r>
+              <w:rPr>
+                <w:color w:val="85200C"/>
+                <w:sz w:val="24"/>
+                <w:szCs w:val="24"/>
+              </w:rPr>
+              <w:t>pyspark.sql</w:t>
+            </w:r>
+            <w:proofErr w:type="gramEnd"/>
+            <w:r>
+              <w:rPr>
+                <w:color w:val="85200C"/>
+                <w:sz w:val="24"/>
+                <w:szCs w:val="24"/>
+              </w:rPr>
+              <w:t>.functions</w:t>
+            </w:r>
+            <w:proofErr w:type="spellEnd"/>
+            <w:r>
+              <w:rPr>
+                <w:color w:val="85200C"/>
+                <w:sz w:val="24"/>
+                <w:szCs w:val="24"/>
+              </w:rPr>
+              <w:t xml:space="preserve"> import lit</w:t>
+            </w:r>
+          </w:p>
+          <w:p>
+            <w:pPr>
+              <w:jc w:val="both"/>
+              <w:rPr>
+                <w:color w:val="85200C"/>
+                <w:sz w:val="24"/>
+                <w:szCs w:val="24"/>
+              </w:rPr>
+            </w:pPr>
+          </w:p>
+          <w:p>
+            <w:pPr>
+              <w:jc w:val="both"/>
+              <w:rPr>
+                <w:color w:val="85200C"/>
+                <w:sz w:val="24"/>
+                <w:szCs w:val="24"/>
+              </w:rPr>
+            </w:pPr>
+            <w:r>
+              <w:rPr>
+                <w:color w:val="85200C"/>
+                <w:sz w:val="24"/>
+                <w:szCs w:val="24"/>
+              </w:rPr>
+              <w:t xml:space="preserve"># Add new column to spark </w:t>
+            </w:r>
+            <w:proofErr w:type="spellStart"/>
+            <w:r>
+              <w:rPr>
+                <w:color w:val="85200C"/>
+                <w:sz w:val="24"/>
+                <w:szCs w:val="24"/>
+              </w:rPr>
+              <w:t>dataframe</w:t>
+            </w:r>
+            <w:proofErr w:type="spellEnd"/>
+          </w:p>
+          <w:p>
+            <w:pPr>
+              <w:jc w:val="both"/>
+              <w:rPr>
+                <w:color w:val="85200C"/>
+                <w:sz w:val="24"/>
+                <w:szCs w:val="24"/>
+              </w:rPr>
+            </w:pPr>
+            <w:proofErr w:type="spellStart"/>
+            <w:r>
+              <w:rPr>
+                <w:color w:val="85200C"/>
+                <w:sz w:val="24"/>
+                <w:szCs w:val="24"/>
+              </w:rPr>
+              <w:t>dfNewColumn</w:t>
+            </w:r>
+            <w:proofErr w:type="spellEnd"/>
+            <w:r>
+              <w:rPr>
+                <w:color w:val="85200C"/>
+                <w:sz w:val="24"/>
+                <w:szCs w:val="24"/>
+              </w:rPr>
+              <w:t xml:space="preserve"> = </w:t>
+            </w:r>
+            <w:proofErr w:type="spellStart"/>
+            <w:r>
+              <w:rPr>
+                <w:color w:val="85200C"/>
+                <w:sz w:val="24"/>
+                <w:szCs w:val="24"/>
+              </w:rPr>
+              <w:t>sparkDf.withColumn</w:t>
+            </w:r>
+            <w:proofErr w:type="spellEnd"/>
+            <w:r>
+              <w:rPr>
+                <w:color w:val="85200C"/>
+                <w:sz w:val="24"/>
+                <w:szCs w:val="24"/>
+              </w:rPr>
+              <w:t xml:space="preserve">("date", </w:t>
+            </w:r>
+            <w:proofErr w:type="gramStart"/>
+            <w:r>
+              <w:rPr>
+                <w:color w:val="85200C"/>
+                <w:sz w:val="24"/>
+                <w:szCs w:val="24"/>
+              </w:rPr>
+              <w:t>lit(</w:t>
+            </w:r>
+            <w:proofErr w:type="gramEnd"/>
+            <w:r>
+              <w:rPr>
+                <w:color w:val="85200C"/>
+                <w:sz w:val="24"/>
+                <w:szCs w:val="24"/>
+              </w:rPr>
+              <w:t>"2022-07-24"))</w:t>
+            </w:r>
+          </w:p>
+          <w:p>
+            <w:pPr>
+              <w:jc w:val="both"/>
+              <w:rPr>
+                <w:color w:val="85200C"/>
+                <w:sz w:val="24"/>
+                <w:szCs w:val="24"/>
+              </w:rPr>
+            </w:pPr>
+          </w:p>
+          <w:p>
+            <w:pPr>
+              <w:jc w:val="both"/>
+              <w:rPr>
+                <w:color w:val="85200C"/>
+                <w:sz w:val="24"/>
+                <w:szCs w:val="24"/>
+              </w:rPr>
+            </w:pPr>
+            <w:r>
+              <w:rPr>
+                <w:color w:val="85200C"/>
+                <w:sz w:val="24"/>
+                <w:szCs w:val="24"/>
+              </w:rPr>
+              <w:t xml:space="preserve"># show </w:t>
+            </w:r>
+            <w:proofErr w:type="spellStart"/>
+            <w:r>
+              <w:rPr>
+                <w:color w:val="85200C"/>
+                <w:sz w:val="24"/>
+                <w:szCs w:val="24"/>
+              </w:rPr>
+              <w:t>df</w:t>
+            </w:r>
+            <w:proofErr w:type="spellEnd"/>
+            <w:r>
+              <w:rPr>
+                <w:color w:val="85200C"/>
+                <w:sz w:val="24"/>
+                <w:szCs w:val="24"/>
+              </w:rPr>
+              <w:t xml:space="preserve"> with new column</w:t>
+            </w:r>
+          </w:p>
+          <w:p>
+            <w:pPr>
+              <w:jc w:val="both"/>
+              <w:rPr>
+                <w:color w:val="85200C"/>
+                <w:sz w:val="24"/>
+                <w:szCs w:val="24"/>
+              </w:rPr>
+            </w:pPr>
+            <w:proofErr w:type="spellStart"/>
             <w:r>
               <w:rPr>
                 <w:color w:val="85200C"/>
@@ -2738,7 +4416,16 @@
                 <w:szCs w:val="24"/>
               </w:rPr>
               <w:lastRenderedPageBreak/>
-              <w:t>dfNewColumn.show()</w:t>
+              <w:t>dfNewColumn.show</w:t>
+            </w:r>
+            <w:proofErr w:type="spellEnd"/>
+            <w:r>
+              <w:rPr>
+                <w:color w:val="85200C"/>
+                <w:sz w:val="24"/>
+                <w:szCs w:val="24"/>
+              </w:rPr>
+              <w:t>()</w:t>
             </w:r>
           </w:p>
         </w:tc>
@@ -2771,7 +4458,27 @@
           <w:sz w:val="24"/>
           <w:szCs w:val="24"/>
         </w:rPr>
-        <w:t>Using concat to concatenate two columns together</w:t>
+        <w:t xml:space="preserve">Using </w:t>
+      </w:r>
+      <w:proofErr w:type="spellStart"/>
+      <w:r>
+        <w:rPr>
+          <w:b/>
+          <w:color w:val="1F2328"/>
+          <w:sz w:val="24"/>
+          <w:szCs w:val="24"/>
+        </w:rPr>
+        <w:t>concat</w:t>
+      </w:r>
+      <w:proofErr w:type="spellEnd"/>
+      <w:r>
+        <w:rPr>
+          <w:b/>
+          <w:color w:val="1F2328"/>
+          <w:sz w:val="24"/>
+          <w:szCs w:val="24"/>
+        </w:rPr>
+        <w:t xml:space="preserve"> to concatenate two columns together</w:t>
       </w:r>
       <w:r>
         <w:rPr>
@@ -2825,117 +4532,301 @@
                 <w:sz w:val="24"/>
                 <w:szCs w:val="24"/>
               </w:rPr>
-              <w:t xml:space="preserve">#import concat from functions </w:t>
-            </w:r>
-          </w:p>
-          <w:p>
-            <w:pPr>
-              <w:jc w:val="both"/>
-              <w:rPr>
-                <w:color w:val="85200C"/>
-                <w:sz w:val="24"/>
-                <w:szCs w:val="24"/>
-              </w:rPr>
-            </w:pPr>
-            <w:r>
-              <w:rPr>
-                <w:color w:val="85200C"/>
-                <w:sz w:val="24"/>
-                <w:szCs w:val="24"/>
-              </w:rPr>
-              <w:t>from  pyspark.sql.functions import concat</w:t>
-            </w:r>
-          </w:p>
-          <w:p>
-            <w:pPr>
-              <w:jc w:val="both"/>
-              <w:rPr>
-                <w:color w:val="85200C"/>
-                <w:sz w:val="24"/>
-                <w:szCs w:val="24"/>
-              </w:rPr>
-            </w:pPr>
-          </w:p>
-          <w:p>
-            <w:pPr>
-              <w:jc w:val="both"/>
-              <w:rPr>
-                <w:color w:val="85200C"/>
-                <w:sz w:val="24"/>
-                <w:szCs w:val="24"/>
-              </w:rPr>
-            </w:pPr>
-            <w:r>
-              <w:rPr>
-                <w:color w:val="85200C"/>
-                <w:sz w:val="24"/>
-                <w:szCs w:val="24"/>
-              </w:rPr>
-              <w:t># create another full name column</w:t>
-            </w:r>
-          </w:p>
-          <w:p>
-            <w:pPr>
-              <w:jc w:val="both"/>
-              <w:rPr>
-                <w:color w:val="85200C"/>
-                <w:sz w:val="24"/>
-                <w:szCs w:val="24"/>
-              </w:rPr>
-            </w:pPr>
-            <w:r>
-              <w:rPr>
-                <w:color w:val="85200C"/>
-                <w:sz w:val="24"/>
-                <w:szCs w:val="24"/>
-              </w:rPr>
-              <w:t>dfNewFullName = sparkDf.withColumn("new_full_name",concat("firstname",concat(lit(' '),"lastname")))</w:t>
-            </w:r>
-          </w:p>
-          <w:p>
-            <w:pPr>
-              <w:jc w:val="both"/>
-              <w:rPr>
-                <w:color w:val="85200C"/>
-                <w:sz w:val="24"/>
-                <w:szCs w:val="24"/>
-              </w:rPr>
-            </w:pPr>
-          </w:p>
-          <w:p>
-            <w:pPr>
-              <w:jc w:val="both"/>
-              <w:rPr>
-                <w:color w:val="85200C"/>
-                <w:sz w:val="24"/>
-                <w:szCs w:val="24"/>
-              </w:rPr>
-            </w:pPr>
-            <w:r>
-              <w:rPr>
-                <w:color w:val="85200C"/>
-                <w:sz w:val="24"/>
-                <w:szCs w:val="24"/>
-              </w:rPr>
-              <w:t xml:space="preserve">#show full name column </w:t>
-            </w:r>
-          </w:p>
-          <w:p>
-            <w:pPr>
-              <w:jc w:val="both"/>
-              <w:rPr>
-                <w:color w:val="85200C"/>
-                <w:sz w:val="24"/>
-                <w:szCs w:val="24"/>
-              </w:rPr>
-            </w:pPr>
-            <w:r>
-              <w:rPr>
-                <w:color w:val="85200C"/>
-                <w:sz w:val="24"/>
-                <w:szCs w:val="24"/>
-              </w:rPr>
-              <w:t>dfNewFullName.show()</w:t>
+              <w:t xml:space="preserve">#import </w:t>
+            </w:r>
+            <w:proofErr w:type="spellStart"/>
+            <w:r>
+              <w:rPr>
+                <w:color w:val="85200C"/>
+                <w:sz w:val="24"/>
+                <w:szCs w:val="24"/>
+              </w:rPr>
+              <w:t>concat</w:t>
+            </w:r>
+            <w:proofErr w:type="spellEnd"/>
+            <w:r>
+              <w:rPr>
+                <w:color w:val="85200C"/>
+                <w:sz w:val="24"/>
+                <w:szCs w:val="24"/>
+              </w:rPr>
+              <w:t xml:space="preserve"> from functions </w:t>
+            </w:r>
+          </w:p>
+          <w:p>
+            <w:pPr>
+              <w:jc w:val="both"/>
+              <w:rPr>
+                <w:color w:val="85200C"/>
+                <w:sz w:val="24"/>
+                <w:szCs w:val="24"/>
+              </w:rPr>
+            </w:pPr>
+            <w:proofErr w:type="gramStart"/>
+            <w:r>
+              <w:rPr>
+                <w:color w:val="85200C"/>
+                <w:sz w:val="24"/>
+                <w:szCs w:val="24"/>
+              </w:rPr>
+              <w:t xml:space="preserve">from  </w:t>
+            </w:r>
+            <w:proofErr w:type="spellStart"/>
+            <w:r>
+              <w:rPr>
+                <w:color w:val="85200C"/>
+                <w:sz w:val="24"/>
+                <w:szCs w:val="24"/>
+              </w:rPr>
+              <w:t>pyspark.sql</w:t>
+            </w:r>
+            <w:proofErr w:type="gramEnd"/>
+            <w:r>
+              <w:rPr>
+                <w:color w:val="85200C"/>
+                <w:sz w:val="24"/>
+                <w:szCs w:val="24"/>
+              </w:rPr>
+              <w:t>.functions</w:t>
+            </w:r>
+            <w:proofErr w:type="spellEnd"/>
+            <w:r>
+              <w:rPr>
+                <w:color w:val="85200C"/>
+                <w:sz w:val="24"/>
+                <w:szCs w:val="24"/>
+              </w:rPr>
+              <w:t xml:space="preserve"> import </w:t>
+            </w:r>
+            <w:proofErr w:type="spellStart"/>
+            <w:r>
+              <w:rPr>
+                <w:color w:val="85200C"/>
+                <w:sz w:val="24"/>
+                <w:szCs w:val="24"/>
+              </w:rPr>
+              <w:t>concat</w:t>
+            </w:r>
+            <w:proofErr w:type="spellEnd"/>
+          </w:p>
+          <w:p>
+            <w:pPr>
+              <w:jc w:val="both"/>
+              <w:rPr>
+                <w:color w:val="85200C"/>
+                <w:sz w:val="24"/>
+                <w:szCs w:val="24"/>
+              </w:rPr>
+            </w:pPr>
+          </w:p>
+          <w:p>
+            <w:pPr>
+              <w:jc w:val="both"/>
+              <w:rPr>
+                <w:color w:val="85200C"/>
+                <w:sz w:val="24"/>
+                <w:szCs w:val="24"/>
+              </w:rPr>
+            </w:pPr>
+            <w:r>
+              <w:rPr>
+                <w:color w:val="85200C"/>
+                <w:sz w:val="24"/>
+                <w:szCs w:val="24"/>
+              </w:rPr>
+              <w:t xml:space="preserve"># </w:t>
+            </w:r>
+            <w:proofErr w:type="gramStart"/>
+            <w:r>
+              <w:rPr>
+                <w:color w:val="85200C"/>
+                <w:sz w:val="24"/>
+                <w:szCs w:val="24"/>
+              </w:rPr>
+              <w:t>create</w:t>
+            </w:r>
+            <w:proofErr w:type="gramEnd"/>
+            <w:r>
+              <w:rPr>
+                <w:color w:val="85200C"/>
+                <w:sz w:val="24"/>
+                <w:szCs w:val="24"/>
+              </w:rPr>
+              <w:t xml:space="preserve"> another full name column</w:t>
+            </w:r>
+          </w:p>
+          <w:p>
+            <w:pPr>
+              <w:jc w:val="both"/>
+              <w:rPr>
+                <w:color w:val="85200C"/>
+                <w:sz w:val="24"/>
+                <w:szCs w:val="24"/>
+              </w:rPr>
+            </w:pPr>
+            <w:proofErr w:type="spellStart"/>
+            <w:r>
+              <w:rPr>
+                <w:color w:val="85200C"/>
+                <w:sz w:val="24"/>
+                <w:szCs w:val="24"/>
+              </w:rPr>
+              <w:t>dfNewFullName</w:t>
+            </w:r>
+            <w:proofErr w:type="spellEnd"/>
+            <w:r>
+              <w:rPr>
+                <w:color w:val="85200C"/>
+                <w:sz w:val="24"/>
+                <w:szCs w:val="24"/>
+              </w:rPr>
+              <w:t xml:space="preserve"> = sparkDf.withColumn("new_full_name</w:t>
+            </w:r>
+            <w:proofErr w:type="gramStart"/>
+            <w:r>
+              <w:rPr>
+                <w:color w:val="85200C"/>
+                <w:sz w:val="24"/>
+                <w:szCs w:val="24"/>
+              </w:rPr>
+              <w:t>",concat</w:t>
+            </w:r>
+            <w:proofErr w:type="gramEnd"/>
+            <w:r>
+              <w:rPr>
+                <w:color w:val="85200C"/>
+                <w:sz w:val="24"/>
+                <w:szCs w:val="24"/>
+              </w:rPr>
+              <w:t>("firstname</w:t>
+            </w:r>
+            <w:proofErr w:type="gramStart"/>
+            <w:r>
+              <w:rPr>
+                <w:color w:val="85200C"/>
+                <w:sz w:val="24"/>
+                <w:szCs w:val="24"/>
+              </w:rPr>
+              <w:t>",concat</w:t>
+            </w:r>
+            <w:proofErr w:type="gramEnd"/>
+            <w:r>
+              <w:rPr>
+                <w:color w:val="85200C"/>
+                <w:sz w:val="24"/>
+                <w:szCs w:val="24"/>
+              </w:rPr>
+              <w:t>(</w:t>
+            </w:r>
+            <w:proofErr w:type="gramStart"/>
+            <w:r>
+              <w:rPr>
+                <w:color w:val="85200C"/>
+                <w:sz w:val="24"/>
+                <w:szCs w:val="24"/>
+              </w:rPr>
+              <w:t>lit(</w:t>
+            </w:r>
+            <w:proofErr w:type="gramEnd"/>
+            <w:r>
+              <w:rPr>
+                <w:color w:val="85200C"/>
+                <w:sz w:val="24"/>
+                <w:szCs w:val="24"/>
+              </w:rPr>
+              <w:t>' '),"</w:t>
+            </w:r>
+            <w:proofErr w:type="spellStart"/>
+            <w:r>
+              <w:rPr>
+                <w:color w:val="85200C"/>
+                <w:sz w:val="24"/>
+                <w:szCs w:val="24"/>
+              </w:rPr>
+              <w:t>lastname</w:t>
+            </w:r>
+            <w:proofErr w:type="spellEnd"/>
+            <w:r>
+              <w:rPr>
+                <w:color w:val="85200C"/>
+                <w:sz w:val="24"/>
+                <w:szCs w:val="24"/>
+              </w:rPr>
+              <w:t>")))</w:t>
+            </w:r>
+          </w:p>
+          <w:p>
+            <w:pPr>
+              <w:jc w:val="both"/>
+              <w:rPr>
+                <w:color w:val="85200C"/>
+                <w:sz w:val="24"/>
+                <w:szCs w:val="24"/>
+              </w:rPr>
+            </w:pPr>
+          </w:p>
+          <w:p>
+            <w:pPr>
+              <w:jc w:val="both"/>
+              <w:rPr>
+                <w:color w:val="85200C"/>
+                <w:sz w:val="24"/>
+                <w:szCs w:val="24"/>
+              </w:rPr>
+            </w:pPr>
+            <w:r>
+              <w:rPr>
+                <w:color w:val="85200C"/>
+                <w:sz w:val="24"/>
+                <w:szCs w:val="24"/>
+              </w:rPr>
+              <w:t>#</w:t>
+            </w:r>
+            <w:proofErr w:type="gramStart"/>
+            <w:r>
+              <w:rPr>
+                <w:color w:val="85200C"/>
+                <w:sz w:val="24"/>
+                <w:szCs w:val="24"/>
+              </w:rPr>
+              <w:t>show</w:t>
+            </w:r>
+            <w:proofErr w:type="gramEnd"/>
+            <w:r>
+              <w:rPr>
+                <w:color w:val="85200C"/>
+                <w:sz w:val="24"/>
+                <w:szCs w:val="24"/>
+              </w:rPr>
+              <w:t xml:space="preserve"> full name column </w:t>
+            </w:r>
+          </w:p>
+          <w:p>
+            <w:pPr>
+              <w:jc w:val="both"/>
+              <w:rPr>
+                <w:color w:val="85200C"/>
+                <w:sz w:val="24"/>
+                <w:szCs w:val="24"/>
+              </w:rPr>
+            </w:pPr>
+            <w:proofErr w:type="spellStart"/>
+            <w:r>
+              <w:rPr>
+                <w:color w:val="85200C"/>
+                <w:sz w:val="24"/>
+                <w:szCs w:val="24"/>
+              </w:rPr>
+              <w:t>dfNewFullName.show</w:t>
+            </w:r>
+            <w:proofErr w:type="spellEnd"/>
+            <w:r>
+              <w:rPr>
+                <w:color w:val="85200C"/>
+                <w:sz w:val="24"/>
+                <w:szCs w:val="24"/>
+              </w:rPr>
+              <w:t>()</w:t>
             </w:r>
           </w:p>
         </w:tc>
@@ -3021,71 +4912,165 @@
                 <w:sz w:val="24"/>
                 <w:szCs w:val="24"/>
               </w:rPr>
-              <w:t># Drop column from spark dataframe</w:t>
-            </w:r>
-          </w:p>
-          <w:p>
-            <w:pPr>
-              <w:jc w:val="both"/>
-              <w:rPr>
-                <w:color w:val="85200C"/>
-                <w:sz w:val="24"/>
-                <w:szCs w:val="24"/>
-              </w:rPr>
-            </w:pPr>
-            <w:r>
-              <w:rPr>
-                <w:color w:val="85200C"/>
-                <w:sz w:val="24"/>
-                <w:szCs w:val="24"/>
-              </w:rPr>
-              <w:t>dfDropCol = sparkDf.drop("firstname","lastname")</w:t>
-            </w:r>
-          </w:p>
-          <w:p>
-            <w:pPr>
-              <w:jc w:val="both"/>
-              <w:rPr>
-                <w:color w:val="85200C"/>
-                <w:sz w:val="24"/>
-                <w:szCs w:val="24"/>
-              </w:rPr>
-            </w:pPr>
-          </w:p>
-          <w:p>
-            <w:pPr>
-              <w:jc w:val="both"/>
-              <w:rPr>
-                <w:color w:val="85200C"/>
-                <w:sz w:val="24"/>
-                <w:szCs w:val="24"/>
-              </w:rPr>
-            </w:pPr>
-            <w:r>
-              <w:rPr>
-                <w:color w:val="85200C"/>
-                <w:sz w:val="24"/>
-                <w:szCs w:val="24"/>
-              </w:rPr>
-              <w:t>#show dropped column df</w:t>
-            </w:r>
-          </w:p>
-          <w:p>
-            <w:pPr>
-              <w:jc w:val="both"/>
-              <w:rPr>
-                <w:color w:val="85200C"/>
-                <w:sz w:val="24"/>
-                <w:szCs w:val="24"/>
-              </w:rPr>
-            </w:pPr>
-            <w:r>
-              <w:rPr>
-                <w:color w:val="85200C"/>
-                <w:sz w:val="24"/>
-                <w:szCs w:val="24"/>
-              </w:rPr>
-              <w:t>dfDropCol.show()</w:t>
+              <w:t xml:space="preserve"># Drop column from spark </w:t>
+            </w:r>
+            <w:proofErr w:type="spellStart"/>
+            <w:r>
+              <w:rPr>
+                <w:color w:val="85200C"/>
+                <w:sz w:val="24"/>
+                <w:szCs w:val="24"/>
+              </w:rPr>
+              <w:t>dataframe</w:t>
+            </w:r>
+            <w:proofErr w:type="spellEnd"/>
+          </w:p>
+          <w:p>
+            <w:pPr>
+              <w:jc w:val="both"/>
+              <w:rPr>
+                <w:color w:val="85200C"/>
+                <w:sz w:val="24"/>
+                <w:szCs w:val="24"/>
+              </w:rPr>
+            </w:pPr>
+            <w:proofErr w:type="spellStart"/>
+            <w:r>
+              <w:rPr>
+                <w:color w:val="85200C"/>
+                <w:sz w:val="24"/>
+                <w:szCs w:val="24"/>
+              </w:rPr>
+              <w:t>dfDropCol</w:t>
+            </w:r>
+            <w:proofErr w:type="spellEnd"/>
+            <w:r>
+              <w:rPr>
+                <w:color w:val="85200C"/>
+                <w:sz w:val="24"/>
+                <w:szCs w:val="24"/>
+              </w:rPr>
+              <w:t xml:space="preserve"> = </w:t>
+            </w:r>
+            <w:proofErr w:type="spellStart"/>
+            <w:r>
+              <w:rPr>
+                <w:color w:val="85200C"/>
+                <w:sz w:val="24"/>
+                <w:szCs w:val="24"/>
+              </w:rPr>
+              <w:t>sparkDf.drop</w:t>
+            </w:r>
+            <w:proofErr w:type="spellEnd"/>
+            <w:r>
+              <w:rPr>
+                <w:color w:val="85200C"/>
+                <w:sz w:val="24"/>
+                <w:szCs w:val="24"/>
+              </w:rPr>
+              <w:t>("</w:t>
+            </w:r>
+            <w:proofErr w:type="spellStart"/>
+            <w:r>
+              <w:rPr>
+                <w:color w:val="85200C"/>
+                <w:sz w:val="24"/>
+                <w:szCs w:val="24"/>
+              </w:rPr>
+              <w:t>firstname</w:t>
+            </w:r>
+            <w:proofErr w:type="spellEnd"/>
+            <w:r>
+              <w:rPr>
+                <w:color w:val="85200C"/>
+                <w:sz w:val="24"/>
+                <w:szCs w:val="24"/>
+              </w:rPr>
+              <w:t>","</w:t>
+            </w:r>
+            <w:proofErr w:type="spellStart"/>
+            <w:r>
+              <w:rPr>
+                <w:color w:val="85200C"/>
+                <w:sz w:val="24"/>
+                <w:szCs w:val="24"/>
+              </w:rPr>
+              <w:t>lastname</w:t>
+            </w:r>
+            <w:proofErr w:type="spellEnd"/>
+            <w:r>
+              <w:rPr>
+                <w:color w:val="85200C"/>
+                <w:sz w:val="24"/>
+                <w:szCs w:val="24"/>
+              </w:rPr>
+              <w:t>")</w:t>
+            </w:r>
+          </w:p>
+          <w:p>
+            <w:pPr>
+              <w:jc w:val="both"/>
+              <w:rPr>
+                <w:color w:val="85200C"/>
+                <w:sz w:val="24"/>
+                <w:szCs w:val="24"/>
+              </w:rPr>
+            </w:pPr>
+          </w:p>
+          <w:p>
+            <w:pPr>
+              <w:jc w:val="both"/>
+              <w:rPr>
+                <w:color w:val="85200C"/>
+                <w:sz w:val="24"/>
+                <w:szCs w:val="24"/>
+              </w:rPr>
+            </w:pPr>
+            <w:r>
+              <w:rPr>
+                <w:color w:val="85200C"/>
+                <w:sz w:val="24"/>
+                <w:szCs w:val="24"/>
+              </w:rPr>
+              <w:t xml:space="preserve">#show dropped column </w:t>
+            </w:r>
+            <w:proofErr w:type="spellStart"/>
+            <w:r>
+              <w:rPr>
+                <w:color w:val="85200C"/>
+                <w:sz w:val="24"/>
+                <w:szCs w:val="24"/>
+              </w:rPr>
+              <w:t>df</w:t>
+            </w:r>
+            <w:proofErr w:type="spellEnd"/>
+          </w:p>
+          <w:p>
+            <w:pPr>
+              <w:jc w:val="both"/>
+              <w:rPr>
+                <w:color w:val="85200C"/>
+                <w:sz w:val="24"/>
+                <w:szCs w:val="24"/>
+              </w:rPr>
+            </w:pPr>
+            <w:proofErr w:type="spellStart"/>
+            <w:r>
+              <w:rPr>
+                <w:color w:val="85200C"/>
+                <w:sz w:val="24"/>
+                <w:szCs w:val="24"/>
+              </w:rPr>
+              <w:t>dfDropCol.show</w:t>
+            </w:r>
+            <w:proofErr w:type="spellEnd"/>
+            <w:r>
+              <w:rPr>
+                <w:color w:val="85200C"/>
+                <w:sz w:val="24"/>
+                <w:szCs w:val="24"/>
+              </w:rPr>
+              <w:t>()</w:t>
             </w:r>
           </w:p>
         </w:tc>
@@ -3144,7 +5129,31 @@
           <w:sz w:val="24"/>
           <w:szCs w:val="24"/>
         </w:rPr>
-        <w:t>How Glue concept work together with S3</w:t>
+        <w:t>What is</w:t>
+      </w:r>
+      <w:r>
+        <w:rPr>
+          <w:color w:val="1F2328"/>
+          <w:sz w:val="24"/>
+          <w:szCs w:val="24"/>
+        </w:rPr>
+        <w:t xml:space="preserve"> Glue concept</w:t>
+      </w:r>
+      <w:r>
+        <w:rPr>
+          <w:color w:val="1F2328"/>
+          <w:sz w:val="24"/>
+          <w:szCs w:val="24"/>
+        </w:rPr>
+        <w:t xml:space="preserve">? </w:t>
+      </w:r>
+      <w:r>
+        <w:rPr>
+          <w:color w:val="1F2328"/>
+          <w:sz w:val="24"/>
+          <w:szCs w:val="24"/>
+        </w:rPr>
+        <w:t xml:space="preserve"> </w:t>
       </w:r>
     </w:p>
     <w:p>
@@ -3162,7 +5171,187 @@
           <w:sz w:val="24"/>
           <w:szCs w:val="24"/>
         </w:rPr>
-        <w:t>This documentation introduces AWS Glue, the Glue Data Catalog, Crawlers, DynamicFrames, and Spark DataFrames for building ETL (Extract, Transform, Load) pipelines. AWS Glue is a serverless data integration service that helps discover, prepare, transform, and move data. In this project, orders, employee, and customer files are uploaded to Amazon S3, and Glue Crawlers scan the data to identify its schema and create table metadata in the Glue Data Catalog. A DynamicFrame then allows us to read and transform cataloged data, including selecting or dropping fields, renaming columns, filtering records, joining datasets, and writing results to S3 or catalog tables. DynamicFrames are particularly useful in Glue because they can handle inconsistencies in data types, while Spark DataFrames provide a familiar tabular structure for more advanced PySpark transformations.</w:t>
+        <w:t xml:space="preserve">This documentation introduces AWS Glue, the Glue Data </w:t>
+      </w:r>
+      <w:proofErr w:type="spellStart"/>
+      <w:r>
+        <w:rPr>
+          <w:color w:val="1F2328"/>
+          <w:sz w:val="24"/>
+          <w:szCs w:val="24"/>
+        </w:rPr>
+        <w:t>Catalog</w:t>
+      </w:r>
+      <w:proofErr w:type="spellEnd"/>
+      <w:r>
+        <w:rPr>
+          <w:color w:val="1F2328"/>
+          <w:sz w:val="24"/>
+          <w:szCs w:val="24"/>
+        </w:rPr>
+        <w:t xml:space="preserve">, Crawlers, </w:t>
+      </w:r>
+      <w:proofErr w:type="spellStart"/>
+      <w:r>
+        <w:rPr>
+          <w:color w:val="1F2328"/>
+          <w:sz w:val="24"/>
+          <w:szCs w:val="24"/>
+        </w:rPr>
+        <w:t>DynamicFrames</w:t>
+      </w:r>
+      <w:proofErr w:type="spellEnd"/>
+      <w:r>
+        <w:rPr>
+          <w:color w:val="1F2328"/>
+          <w:sz w:val="24"/>
+          <w:szCs w:val="24"/>
+        </w:rPr>
+        <w:t xml:space="preserve">, and Spark </w:t>
+      </w:r>
+      <w:proofErr w:type="spellStart"/>
+      <w:r>
+        <w:rPr>
+          <w:color w:val="1F2328"/>
+          <w:sz w:val="24"/>
+          <w:szCs w:val="24"/>
+        </w:rPr>
+        <w:t>DataFrames</w:t>
+      </w:r>
+      <w:proofErr w:type="spellEnd"/>
+      <w:r>
+        <w:rPr>
+          <w:color w:val="1F2328"/>
+          <w:sz w:val="24"/>
+          <w:szCs w:val="24"/>
+        </w:rPr>
+        <w:t xml:space="preserve"> for building ETL (Extract, Transform, Load) pipelines. AWS Glue is a serverless data integration service that helps discover, prepare, transform, and move data. In this project, orders, employee, and customer files are uploaded to Amazon S3, and Glue Crawlers scan the data to identify its schema and create table metadata in the Glue Data </w:t>
+      </w:r>
+      <w:proofErr w:type="spellStart"/>
+      <w:r>
+        <w:rPr>
+          <w:color w:val="1F2328"/>
+          <w:sz w:val="24"/>
+          <w:szCs w:val="24"/>
+        </w:rPr>
+        <w:t>Catalog</w:t>
+      </w:r>
+      <w:proofErr w:type="spellEnd"/>
+      <w:r>
+        <w:rPr>
+          <w:color w:val="1F2328"/>
+          <w:sz w:val="24"/>
+          <w:szCs w:val="24"/>
+        </w:rPr>
+        <w:t xml:space="preserve">. A </w:t>
+      </w:r>
+      <w:proofErr w:type="spellStart"/>
+      <w:r>
+        <w:rPr>
+          <w:color w:val="1F2328"/>
+          <w:sz w:val="24"/>
+          <w:szCs w:val="24"/>
+        </w:rPr>
+        <w:t>DynamicFrame</w:t>
+      </w:r>
+      <w:proofErr w:type="spellEnd"/>
+      <w:r>
+        <w:rPr>
+          <w:color w:val="1F2328"/>
+          <w:sz w:val="24"/>
+          <w:szCs w:val="24"/>
+        </w:rPr>
+        <w:t xml:space="preserve"> then allows us to read and transform </w:t>
+      </w:r>
+      <w:proofErr w:type="spellStart"/>
+      <w:r>
+        <w:rPr>
+          <w:color w:val="1F2328"/>
+          <w:sz w:val="24"/>
+          <w:szCs w:val="24"/>
+        </w:rPr>
+        <w:t>cataloged</w:t>
+      </w:r>
+      <w:proofErr w:type="spellEnd"/>
+      <w:r>
+        <w:rPr>
+          <w:color w:val="1F2328"/>
+          <w:sz w:val="24"/>
+          <w:szCs w:val="24"/>
+        </w:rPr>
+        <w:t xml:space="preserve"> data, including selecting or dropping fields, renaming columns, filtering records, joining datasets, and writing results to S3 or </w:t>
+      </w:r>
+      <w:proofErr w:type="spellStart"/>
+      <w:r>
+        <w:rPr>
+          <w:color w:val="1F2328"/>
+          <w:sz w:val="24"/>
+          <w:szCs w:val="24"/>
+        </w:rPr>
+        <w:t>catalog</w:t>
+      </w:r>
+      <w:proofErr w:type="spellEnd"/>
+      <w:r>
+        <w:rPr>
+          <w:color w:val="1F2328"/>
+          <w:sz w:val="24"/>
+          <w:szCs w:val="24"/>
+        </w:rPr>
+        <w:t xml:space="preserve"> tables. </w:t>
+      </w:r>
+      <w:proofErr w:type="spellStart"/>
+      <w:r>
+        <w:rPr>
+          <w:color w:val="1F2328"/>
+          <w:sz w:val="24"/>
+          <w:szCs w:val="24"/>
+        </w:rPr>
+        <w:t>DynamicFrames</w:t>
+      </w:r>
+      <w:proofErr w:type="spellEnd"/>
+      <w:r>
+        <w:rPr>
+          <w:color w:val="1F2328"/>
+          <w:sz w:val="24"/>
+          <w:szCs w:val="24"/>
+        </w:rPr>
+        <w:t xml:space="preserve"> are particularly useful in Glue because they can handle inconsistencies in data types, while Spark </w:t>
+      </w:r>
+      <w:proofErr w:type="spellStart"/>
+      <w:r>
+        <w:rPr>
+          <w:color w:val="1F2328"/>
+          <w:sz w:val="24"/>
+          <w:szCs w:val="24"/>
+        </w:rPr>
+        <w:t>DataFrames</w:t>
+      </w:r>
+      <w:proofErr w:type="spellEnd"/>
+      <w:r>
+        <w:rPr>
+          <w:color w:val="1F2328"/>
+          <w:sz w:val="24"/>
+          <w:szCs w:val="24"/>
+        </w:rPr>
+        <w:t xml:space="preserve"> provide a familiar tabular structure for more advanced </w:t>
+      </w:r>
+      <w:proofErr w:type="spellStart"/>
+      <w:r>
+        <w:rPr>
+          <w:color w:val="1F2328"/>
+          <w:sz w:val="24"/>
+          <w:szCs w:val="24"/>
+        </w:rPr>
+        <w:t>PySpark</w:t>
+      </w:r>
+      <w:proofErr w:type="spellEnd"/>
+      <w:r>
+        <w:rPr>
+          <w:color w:val="1F2328"/>
+          <w:sz w:val="24"/>
+          <w:szCs w:val="24"/>
+        </w:rPr>
+        <w:t xml:space="preserve"> transformations.</w:t>
       </w:r>
     </w:p>
     <w:p>
@@ -3176,6 +5365,345 @@
           <w:szCs w:val="24"/>
         </w:rPr>
       </w:pPr>
+    </w:p>
+    <w:p>
+      <w:pPr>
+        <w:shd w:val="clear" w:color="auto" w:fill="FFFFFF"/>
+        <w:spacing w:after="240"/>
+        <w:jc w:val="both"/>
+        <w:rPr>
+          <w:color w:val="1F2328"/>
+          <w:sz w:val="24"/>
+          <w:szCs w:val="24"/>
+        </w:rPr>
+      </w:pPr>
+      <w:r>
+        <w:rPr>
+          <w:color w:val="1F2328"/>
+          <w:sz w:val="24"/>
+          <w:szCs w:val="24"/>
+        </w:rPr>
+        <w:t>2. How D</w:t>
+      </w:r>
+      <w:r>
+        <w:rPr>
+          <w:color w:val="1F2328"/>
+          <w:sz w:val="24"/>
+          <w:szCs w:val="24"/>
+        </w:rPr>
+        <w:t xml:space="preserve">oes Glue </w:t>
+      </w:r>
+      <w:proofErr w:type="gramStart"/>
+      <w:r>
+        <w:rPr>
+          <w:color w:val="1F2328"/>
+          <w:sz w:val="24"/>
+          <w:szCs w:val="24"/>
+        </w:rPr>
+        <w:t>works</w:t>
+      </w:r>
+      <w:proofErr w:type="gramEnd"/>
+      <w:r>
+        <w:rPr>
+          <w:color w:val="1F2328"/>
+          <w:sz w:val="24"/>
+          <w:szCs w:val="24"/>
+        </w:rPr>
+        <w:t xml:space="preserve"> together with S</w:t>
+      </w:r>
+      <w:proofErr w:type="gramStart"/>
+      <w:r>
+        <w:rPr>
+          <w:color w:val="1F2328"/>
+          <w:sz w:val="24"/>
+          <w:szCs w:val="24"/>
+        </w:rPr>
+        <w:t xml:space="preserve">3 </w:t>
+      </w:r>
+      <w:r>
+        <w:rPr>
+          <w:color w:val="1F2328"/>
+          <w:sz w:val="24"/>
+          <w:szCs w:val="24"/>
+        </w:rPr>
+        <w:t>?</w:t>
+      </w:r>
+      <w:proofErr w:type="gramEnd"/>
+    </w:p>
+    <w:p>
+      <w:pPr>
+        <w:shd w:val="clear" w:color="auto" w:fill="FFFFFF"/>
+        <w:spacing w:after="240"/>
+        <w:jc w:val="both"/>
+        <w:rPr>
+          <w:color w:val="1F2328"/>
+          <w:sz w:val="24"/>
+          <w:szCs w:val="24"/>
+        </w:rPr>
+      </w:pPr>
+      <w:r>
+        <w:rPr>
+          <w:color w:val="1F2328"/>
+          <w:sz w:val="24"/>
+          <w:szCs w:val="24"/>
+        </w:rPr>
+        <w:lastRenderedPageBreak/>
+        <w:t xml:space="preserve">The process begins by uploading the orders, employee, and customer datasets to Amazon S3, which acts as the data lake storage layer. AWS Glue Crawlers scan the files and populate the Glue Data </w:t>
+      </w:r>
+      <w:proofErr w:type="spellStart"/>
+      <w:r>
+        <w:rPr>
+          <w:color w:val="1F2328"/>
+          <w:sz w:val="24"/>
+          <w:szCs w:val="24"/>
+        </w:rPr>
+        <w:t>Catalog</w:t>
+      </w:r>
+      <w:proofErr w:type="spellEnd"/>
+      <w:r>
+        <w:rPr>
+          <w:color w:val="1F2328"/>
+          <w:sz w:val="24"/>
+          <w:szCs w:val="24"/>
+        </w:rPr>
+        <w:t xml:space="preserve"> with metadata, such as table names, column names, and data types. Using </w:t>
+      </w:r>
+      <w:proofErr w:type="spellStart"/>
+      <w:r>
+        <w:rPr>
+          <w:color w:val="1F2328"/>
+          <w:sz w:val="24"/>
+          <w:szCs w:val="24"/>
+        </w:rPr>
+        <w:t>glueContext.create_dynamic_</w:t>
+      </w:r>
+      <w:proofErr w:type="gramStart"/>
+      <w:r>
+        <w:rPr>
+          <w:color w:val="1F2328"/>
+          <w:sz w:val="24"/>
+          <w:szCs w:val="24"/>
+        </w:rPr>
+        <w:t>frame.from</w:t>
+      </w:r>
+      <w:proofErr w:type="gramEnd"/>
+      <w:r>
+        <w:rPr>
+          <w:color w:val="1F2328"/>
+          <w:sz w:val="24"/>
+          <w:szCs w:val="24"/>
+        </w:rPr>
+        <w:t>_</w:t>
+      </w:r>
+      <w:proofErr w:type="gramStart"/>
+      <w:r>
+        <w:rPr>
+          <w:color w:val="1F2328"/>
+          <w:sz w:val="24"/>
+          <w:szCs w:val="24"/>
+        </w:rPr>
+        <w:t>catalog</w:t>
+      </w:r>
+      <w:proofErr w:type="spellEnd"/>
+      <w:r>
+        <w:rPr>
+          <w:color w:val="1F2328"/>
+          <w:sz w:val="24"/>
+          <w:szCs w:val="24"/>
+        </w:rPr>
+        <w:t>(</w:t>
+      </w:r>
+      <w:proofErr w:type="gramEnd"/>
+      <w:r>
+        <w:rPr>
+          <w:color w:val="1F2328"/>
+          <w:sz w:val="24"/>
+          <w:szCs w:val="24"/>
+        </w:rPr>
+        <w:t xml:space="preserve">), the Glue job or notebook reads the customer and orders data into </w:t>
+      </w:r>
+      <w:proofErr w:type="spellStart"/>
+      <w:r>
+        <w:rPr>
+          <w:color w:val="1F2328"/>
+          <w:sz w:val="24"/>
+          <w:szCs w:val="24"/>
+        </w:rPr>
+        <w:t>DynamicFrames</w:t>
+      </w:r>
+      <w:proofErr w:type="spellEnd"/>
+      <w:r>
+        <w:rPr>
+          <w:color w:val="1F2328"/>
+          <w:sz w:val="24"/>
+          <w:szCs w:val="24"/>
+        </w:rPr>
+        <w:t xml:space="preserve">. Transformations are then applied to select fields, drop or rename columns, filter customers, and join customers with orders using </w:t>
+      </w:r>
+      <w:proofErr w:type="spellStart"/>
+      <w:r>
+        <w:rPr>
+          <w:color w:val="1F2328"/>
+          <w:sz w:val="24"/>
+          <w:szCs w:val="24"/>
+        </w:rPr>
+        <w:t>customerid</w:t>
+      </w:r>
+      <w:proofErr w:type="spellEnd"/>
+      <w:r>
+        <w:rPr>
+          <w:color w:val="1F2328"/>
+          <w:sz w:val="24"/>
+          <w:szCs w:val="24"/>
+        </w:rPr>
+        <w:t xml:space="preserve">. The </w:t>
+      </w:r>
+      <w:proofErr w:type="spellStart"/>
+      <w:r>
+        <w:rPr>
+          <w:color w:val="1F2328"/>
+          <w:sz w:val="24"/>
+          <w:szCs w:val="24"/>
+        </w:rPr>
+        <w:t>DynamicFrame</w:t>
+      </w:r>
+      <w:proofErr w:type="spellEnd"/>
+      <w:r>
+        <w:rPr>
+          <w:color w:val="1F2328"/>
+          <w:sz w:val="24"/>
+          <w:szCs w:val="24"/>
+        </w:rPr>
+        <w:t xml:space="preserve"> can be converted into a Spark </w:t>
+      </w:r>
+      <w:proofErr w:type="spellStart"/>
+      <w:r>
+        <w:rPr>
+          <w:color w:val="1F2328"/>
+          <w:sz w:val="24"/>
+          <w:szCs w:val="24"/>
+        </w:rPr>
+        <w:t>DataFrame</w:t>
+      </w:r>
+      <w:proofErr w:type="spellEnd"/>
+      <w:r>
+        <w:rPr>
+          <w:color w:val="1F2328"/>
+          <w:sz w:val="24"/>
+          <w:szCs w:val="24"/>
+        </w:rPr>
+        <w:t xml:space="preserve"> </w:t>
+      </w:r>
+      <w:proofErr w:type="gramStart"/>
+      <w:r>
+        <w:rPr>
+          <w:color w:val="1F2328"/>
+          <w:sz w:val="24"/>
+          <w:szCs w:val="24"/>
+        </w:rPr>
+        <w:t>using .</w:t>
+      </w:r>
+      <w:proofErr w:type="spellStart"/>
+      <w:r>
+        <w:rPr>
+          <w:color w:val="1F2328"/>
+          <w:sz w:val="24"/>
+          <w:szCs w:val="24"/>
+        </w:rPr>
+        <w:t>toDF</w:t>
+      </w:r>
+      <w:proofErr w:type="spellEnd"/>
+      <w:proofErr w:type="gramEnd"/>
+      <w:r>
+        <w:rPr>
+          <w:color w:val="1F2328"/>
+          <w:sz w:val="24"/>
+          <w:szCs w:val="24"/>
+        </w:rPr>
+        <w:t xml:space="preserve">() for additional </w:t>
+      </w:r>
+      <w:proofErr w:type="spellStart"/>
+      <w:r>
+        <w:rPr>
+          <w:color w:val="1F2328"/>
+          <w:sz w:val="24"/>
+          <w:szCs w:val="24"/>
+        </w:rPr>
+        <w:t>PySpark</w:t>
+      </w:r>
+      <w:proofErr w:type="spellEnd"/>
+      <w:r>
+        <w:rPr>
+          <w:color w:val="1F2328"/>
+          <w:sz w:val="24"/>
+          <w:szCs w:val="24"/>
+        </w:rPr>
+        <w:t xml:space="preserve"> operations, such as adding columns with </w:t>
+      </w:r>
+      <w:proofErr w:type="spellStart"/>
+      <w:proofErr w:type="gramStart"/>
+      <w:r>
+        <w:rPr>
+          <w:color w:val="1F2328"/>
+          <w:sz w:val="24"/>
+          <w:szCs w:val="24"/>
+        </w:rPr>
+        <w:t>withColumn</w:t>
+      </w:r>
+      <w:proofErr w:type="spellEnd"/>
+      <w:r>
+        <w:rPr>
+          <w:color w:val="1F2328"/>
+          <w:sz w:val="24"/>
+          <w:szCs w:val="24"/>
+        </w:rPr>
+        <w:t>(</w:t>
+      </w:r>
+      <w:proofErr w:type="gramEnd"/>
+      <w:r>
+        <w:rPr>
+          <w:color w:val="1F2328"/>
+          <w:sz w:val="24"/>
+          <w:szCs w:val="24"/>
+        </w:rPr>
+        <w:t xml:space="preserve">), concatenating strings, and dropping columns. Finally, the processed data can be written back to S3 in formats such as CSV or written through the Glue Data </w:t>
+      </w:r>
+      <w:proofErr w:type="spellStart"/>
+      <w:r>
+        <w:rPr>
+          <w:color w:val="1F2328"/>
+          <w:sz w:val="24"/>
+          <w:szCs w:val="24"/>
+        </w:rPr>
+        <w:t>Catalog</w:t>
+      </w:r>
+      <w:proofErr w:type="spellEnd"/>
+      <w:r>
+        <w:rPr>
+          <w:color w:val="1F2328"/>
+          <w:sz w:val="24"/>
+          <w:szCs w:val="24"/>
+        </w:rPr>
+        <w:t xml:space="preserve"> using the appropriate </w:t>
+      </w:r>
+      <w:proofErr w:type="spellStart"/>
+      <w:r>
+        <w:rPr>
+          <w:color w:val="1F2328"/>
+          <w:sz w:val="24"/>
+          <w:szCs w:val="24"/>
+        </w:rPr>
+        <w:t>catalog</w:t>
+      </w:r>
+      <w:proofErr w:type="spellEnd"/>
+      <w:r>
+        <w:rPr>
+          <w:color w:val="1F2328"/>
+          <w:sz w:val="24"/>
+          <w:szCs w:val="24"/>
+        </w:rPr>
+        <w:t xml:space="preserve"> configuration. Together, these components form an ETL workflow that moves data from raw storage to transformed, usable datasets.</w:t>
+      </w:r>
     </w:p>
     <w:sectPr>
       <w:pgSz w:w="11909" w:h="16834"/>

</xml_diff>